<commit_message>
chore(rapport): Rediger le planning initial et ajouter les us
[60][Done]
</commit_message>
<xml_diff>
--- a/doc/I320-RapportProjet.docx
+++ b/doc/I320-RapportProjet.docx
@@ -3439,13 +3439,8 @@
       <w:pPr>
         <w:ind w:left="1134"/>
       </w:pPr>
-      <w:proofErr w:type="spellStart"/>
-      <w:r>
-        <w:t>Shoot’em</w:t>
-      </w:r>
-      <w:proofErr w:type="spellEnd"/>
-      <w:r>
-        <w:t xml:space="preserve"> up</w:t>
+      <w:r>
+        <w:t>Shoot’em up</w:t>
       </w:r>
     </w:p>
     <w:p>
@@ -3477,37 +3472,13 @@
         <w:t>créer</w:t>
       </w:r>
       <w:r>
-        <w:t xml:space="preserve"> un jeu dans le genre shoot ‘</w:t>
-      </w:r>
-      <w:proofErr w:type="spellStart"/>
-      <w:r>
-        <w:t>em</w:t>
-      </w:r>
-      <w:proofErr w:type="spellEnd"/>
-      <w:r>
-        <w:t xml:space="preserve"> up. J’ai </w:t>
+        <w:t xml:space="preserve"> un jeu dans le genre shoot ‘em up. J’ai </w:t>
       </w:r>
       <w:r>
         <w:t>choisi</w:t>
       </w:r>
       <w:r>
-        <w:t xml:space="preserve"> le thème de l’anime </w:t>
-      </w:r>
-      <w:proofErr w:type="spellStart"/>
-      <w:r>
-        <w:t>tensura</w:t>
-      </w:r>
-      <w:proofErr w:type="spellEnd"/>
-      <w:r>
-        <w:t xml:space="preserve">. Le jeu se déroulera avec le joueur en tant que </w:t>
-      </w:r>
-      <w:proofErr w:type="spellStart"/>
-      <w:r>
-        <w:t>slime</w:t>
-      </w:r>
-      <w:proofErr w:type="spellEnd"/>
-      <w:r>
-        <w:t xml:space="preserve"> tirant des</w:t>
+        <w:t xml:space="preserve"> le thème de l’anime tensura. Le jeu se déroulera avec le joueur en tant que slime tirant des</w:t>
       </w:r>
       <w:r>
         <w:t xml:space="preserve"> projectiles sur des loups pour les tués. Il pourra se protéger à l’aide de barricade présente sur le terrain. Il mourra après un certain nombre de fois qu’il aura été touché par les loups. Le joueur gagnera après avoir battu 3 vagues de loup avec une puissance exponentiel.</w:t>
@@ -3559,56 +3530,288 @@
       </w:r>
       <w:bookmarkEnd w:id="3"/>
     </w:p>
-    <w:p>
-      <w:pPr>
-        <w:pStyle w:val="Informations"/>
-        <w:numPr>
-          <w:ilvl w:val="5"/>
-          <w:numId w:val="26"/>
-        </w:numPr>
-      </w:pPr>
-      <w:r>
-        <w:t>Ce paragraphe présente le p</w:t>
-      </w:r>
-      <w:r>
-        <w:t>lanning d'origine (</w:t>
-      </w:r>
-      <w:r>
-        <w:t xml:space="preserve">date de début, date de fin, vacances et congés, </w:t>
-      </w:r>
-      <w:r>
-        <w:t xml:space="preserve">liste hiérarchique des tâches ou </w:t>
-      </w:r>
-      <w:r>
-        <w:t>GANTT</w:t>
-      </w:r>
-      <w:r>
-        <w:t>, jalons, durée totale</w:t>
-      </w:r>
-      <w:r>
-        <w:t>)</w:t>
-      </w:r>
-    </w:p>
-    <w:p>
-      <w:pPr>
-        <w:pStyle w:val="Informations"/>
-        <w:numPr>
-          <w:ilvl w:val="5"/>
-          <w:numId w:val="26"/>
-        </w:numPr>
-      </w:pPr>
-      <w:r>
-        <w:t xml:space="preserve">Toutes les mises à jour subies par le planning </w:t>
-      </w:r>
-      <w:r>
-        <w:t xml:space="preserve">sont à reporter </w:t>
-      </w:r>
-      <w:r>
-        <w:t>(avec date de mise à jour)</w:t>
-      </w:r>
-      <w:r>
-        <w:t xml:space="preserve"> et peuvent déboucher sur plusieurs versions de plannings.</w:t>
-      </w:r>
+    <w:tbl>
+      <w:tblPr>
+        <w:tblStyle w:val="Grilledutableau"/>
+        <w:tblW w:w="0" w:type="auto"/>
+        <w:tblInd w:w="567" w:type="dxa"/>
+        <w:tblLook w:val="04A0" w:firstRow="1" w:lastRow="0" w:firstColumn="1" w:lastColumn="0" w:noHBand="0" w:noVBand="1"/>
+      </w:tblPr>
+      <w:tblGrid>
+        <w:gridCol w:w="4233"/>
+        <w:gridCol w:w="4260"/>
+      </w:tblGrid>
+      <w:tr>
+        <w:tc>
+          <w:tcPr>
+            <w:tcW w:w="4233" w:type="dxa"/>
+          </w:tcPr>
+          <w:p>
+            <w:r>
+              <w:t>Activité</w:t>
+            </w:r>
+          </w:p>
+        </w:tc>
+        <w:tc>
+          <w:tcPr>
+            <w:tcW w:w="4260" w:type="dxa"/>
+          </w:tcPr>
+          <w:p>
+            <w:r>
+              <w:t>Date</w:t>
+            </w:r>
+          </w:p>
+        </w:tc>
+      </w:tr>
+      <w:tr>
+        <w:tc>
+          <w:tcPr>
+            <w:tcW w:w="4233" w:type="dxa"/>
+          </w:tcPr>
+          <w:p>
+            <w:r>
+              <w:t>Commencer l’us 1 et 2</w:t>
+            </w:r>
+            <w:r>
+              <w:t xml:space="preserve"> et se familiariser avec l’outil</w:t>
+            </w:r>
+            <w:r>
+              <w:t>.</w:t>
+            </w:r>
+            <w:r>
+              <w:t xml:space="preserve"> </w:t>
+            </w:r>
+            <w:r>
+              <w:t>Et le rapport.</w:t>
+            </w:r>
+          </w:p>
+        </w:tc>
+        <w:tc>
+          <w:tcPr>
+            <w:tcW w:w="4260" w:type="dxa"/>
+          </w:tcPr>
+          <w:p>
+            <w:r>
+              <w:t>11/09/2026</w:t>
+            </w:r>
+          </w:p>
+        </w:tc>
+      </w:tr>
+      <w:tr>
+        <w:trPr>
+          <w:trHeight w:val="70"/>
+        </w:trPr>
+        <w:tc>
+          <w:tcPr>
+            <w:tcW w:w="4233" w:type="dxa"/>
+          </w:tcPr>
+          <w:p>
+            <w:r>
+              <w:t>Finir</w:t>
+            </w:r>
+            <w:r>
+              <w:t xml:space="preserve"> l’us 1 et 2</w:t>
+            </w:r>
+            <w:r>
+              <w:t xml:space="preserve"> et commencer l’us 3 et 4.</w:t>
+            </w:r>
+            <w:r>
+              <w:t xml:space="preserve"> </w:t>
+            </w:r>
+            <w:r>
+              <w:t>Et le rapport.</w:t>
+            </w:r>
+          </w:p>
+        </w:tc>
+        <w:tc>
+          <w:tcPr>
+            <w:tcW w:w="4260" w:type="dxa"/>
+          </w:tcPr>
+          <w:p>
+            <w:r>
+              <w:t>18</w:t>
+            </w:r>
+            <w:r>
+              <w:t>/09/2026</w:t>
+            </w:r>
+          </w:p>
+        </w:tc>
+      </w:tr>
+      <w:tr>
+        <w:tc>
+          <w:tcPr>
+            <w:tcW w:w="4233" w:type="dxa"/>
+          </w:tcPr>
+          <w:p>
+            <w:r>
+              <w:t xml:space="preserve">Finir l’us </w:t>
+            </w:r>
+            <w:r>
+              <w:t>3</w:t>
+            </w:r>
+            <w:r>
+              <w:t xml:space="preserve"> et</w:t>
+            </w:r>
+            <w:r>
+              <w:t xml:space="preserve"> 4.</w:t>
+            </w:r>
+            <w:r>
+              <w:t xml:space="preserve"> </w:t>
+            </w:r>
+            <w:r>
+              <w:t>Et le rapport.</w:t>
+            </w:r>
+          </w:p>
+        </w:tc>
+        <w:tc>
+          <w:tcPr>
+            <w:tcW w:w="4260" w:type="dxa"/>
+          </w:tcPr>
+          <w:p>
+            <w:r>
+              <w:t>25</w:t>
+            </w:r>
+            <w:r>
+              <w:t>/09/2026</w:t>
+            </w:r>
+          </w:p>
+        </w:tc>
+      </w:tr>
+      <w:tr>
+        <w:tc>
+          <w:tcPr>
+            <w:tcW w:w="4233" w:type="dxa"/>
+          </w:tcPr>
+          <w:p>
+            <w:r>
+              <w:t xml:space="preserve">Commencer l’us </w:t>
+            </w:r>
+            <w:r>
+              <w:t>5</w:t>
+            </w:r>
+            <w:r>
+              <w:t xml:space="preserve"> et </w:t>
+            </w:r>
+            <w:r>
+              <w:t>6</w:t>
+            </w:r>
+            <w:r>
+              <w:t>.</w:t>
+            </w:r>
+            <w:r>
+              <w:t xml:space="preserve"> </w:t>
+            </w:r>
+            <w:r>
+              <w:t>Et le rapport.</w:t>
+            </w:r>
+          </w:p>
+        </w:tc>
+        <w:tc>
+          <w:tcPr>
+            <w:tcW w:w="4260" w:type="dxa"/>
+          </w:tcPr>
+          <w:p>
+            <w:r>
+              <w:t>02</w:t>
+            </w:r>
+            <w:r>
+              <w:t>/</w:t>
+            </w:r>
+            <w:r>
+              <w:t>10</w:t>
+            </w:r>
+            <w:r>
+              <w:t>/2026</w:t>
+            </w:r>
+          </w:p>
+        </w:tc>
+      </w:tr>
+      <w:tr>
+        <w:tc>
+          <w:tcPr>
+            <w:tcW w:w="4233" w:type="dxa"/>
+          </w:tcPr>
+          <w:p>
+            <w:r>
+              <w:t xml:space="preserve">Finir l’us </w:t>
+            </w:r>
+            <w:r>
+              <w:t>5</w:t>
+            </w:r>
+            <w:r>
+              <w:t xml:space="preserve"> et </w:t>
+            </w:r>
+            <w:r>
+              <w:t>6</w:t>
+            </w:r>
+            <w:r>
+              <w:t>.</w:t>
+            </w:r>
+            <w:r>
+              <w:t xml:space="preserve"> Et le rapport.</w:t>
+            </w:r>
+          </w:p>
+        </w:tc>
+        <w:tc>
+          <w:tcPr>
+            <w:tcW w:w="4260" w:type="dxa"/>
+          </w:tcPr>
+          <w:p>
+            <w:r>
+              <w:t>09</w:t>
+            </w:r>
+            <w:r>
+              <w:t>/</w:t>
+            </w:r>
+            <w:r>
+              <w:t>10</w:t>
+            </w:r>
+            <w:r>
+              <w:t>/2026</w:t>
+            </w:r>
+          </w:p>
+        </w:tc>
+      </w:tr>
+      <w:tr>
+        <w:tc>
+          <w:tcPr>
+            <w:tcW w:w="4233" w:type="dxa"/>
+          </w:tcPr>
+          <w:p>
+            <w:r>
+              <w:t>Rendu final</w:t>
+            </w:r>
+            <w:r>
+              <w:t>e</w:t>
+            </w:r>
+          </w:p>
+        </w:tc>
+        <w:tc>
+          <w:tcPr>
+            <w:tcW w:w="4260" w:type="dxa"/>
+          </w:tcPr>
+          <w:p>
+            <w:r>
+              <w:t>30/10/2026</w:t>
+            </w:r>
+          </w:p>
+        </w:tc>
+      </w:tr>
+    </w:tbl>
+    <w:p>
+      <w:pPr>
+        <w:ind w:left="567"/>
+      </w:pPr>
+    </w:p>
+    <w:p>
+      <w:r>
+        <w:br w:type="page"/>
+      </w:r>
+    </w:p>
+    <w:p>
+      <w:pPr>
+        <w:ind w:left="567"/>
+      </w:pPr>
     </w:p>
     <w:p>
       <w:pPr>
@@ -3628,428 +3831,609 @@
       <w:pPr>
         <w:pStyle w:val="Titre2"/>
       </w:pPr>
-      <w:bookmarkStart w:id="7" w:name="_Toc308526333"/>
-      <w:r>
-        <w:t>Opportunités</w:t>
-      </w:r>
+      <w:r>
+        <w:t>User story</w:t>
+      </w:r>
+    </w:p>
+    <w:p>
+      <w:bookmarkStart w:id="7" w:name="_Toc308526336"/>
+      <w:bookmarkStart w:id="8" w:name="_Toc532179961"/>
+    </w:p>
+    <w:p>
+      <w:pPr>
+        <w:pStyle w:val="Titre1"/>
+        <w:numPr>
+          <w:ilvl w:val="0"/>
+          <w:numId w:val="0"/>
+        </w:numPr>
+        <w:ind w:left="567"/>
+      </w:pPr>
+      <w:r>
+        <w:t>#1 — US 1: Déplacement</w:t>
+      </w:r>
+    </w:p>
+    <w:p>
+      <w:r>
+        <w:t>En tant que joueur je souhaite pouvoir me déplacer de gauche à droite afin d'esquiver.</w:t>
+      </w:r>
+    </w:p>
+    <w:p/>
+    <w:p>
+      <w:r>
+        <w:t>•   En appuyant sur la flèche directionnel de gauche le joueur se déplacer à gauche.</w:t>
+      </w:r>
+    </w:p>
+    <w:p>
+      <w:r>
+        <w:t>•   Tant que le joueur restera appuie sur la flèche directionnel de gauche son personnage se déplacera à gauche.</w:t>
+      </w:r>
+    </w:p>
+    <w:p>
+      <w:r>
+        <w:t>•   si le joueur atteint le bord du terrain il sera renvoyer de l'autre côté.</w:t>
+      </w:r>
+    </w:p>
+    <w:p>
+      <w:r>
+        <w:t>•   En appuyant sur la flèche directionnel de droite le joueur se déplacer à droite.</w:t>
+      </w:r>
+    </w:p>
+    <w:p>
+      <w:r>
+        <w:t>•   Tant que le joueur restera appuie sur la flèche directionnel de droite son personnage se déplacera à droite.</w:t>
+      </w:r>
+    </w:p>
+    <w:p/>
+    <w:p/>
+    <w:p>
+      <w:r>
+        <w:rPr>
+          <w:noProof/>
+        </w:rPr>
+        <w:drawing>
+          <wp:inline distT="0" distB="0" distL="0" distR="0" wp14:anchorId="1F33715A" wp14:editId="38D8969D">
+            <wp:extent cx="4762500" cy="3190875"/>
+            <wp:effectExtent l="0" t="0" r="0" b="0"/>
+            <wp:docPr id="1" name="Image 1"/>
+            <wp:cNvGraphicFramePr>
+              <a:graphicFrameLocks xmlns:a="http://schemas.openxmlformats.org/drawingml/2006/main" noChangeAspect="1"/>
+            </wp:cNvGraphicFramePr>
+            <a:graphic xmlns:a="http://schemas.openxmlformats.org/drawingml/2006/main">
+              <a:graphicData uri="http://schemas.openxmlformats.org/drawingml/2006/picture">
+                <pic:pic xmlns:pic="http://schemas.openxmlformats.org/drawingml/2006/picture">
+                  <pic:nvPicPr>
+                    <pic:cNvPr id="0" name=""/>
+                    <pic:cNvPicPr>
+                      <a:picLocks noChangeAspect="1" noChangeArrowheads="1"/>
+                    </pic:cNvPicPr>
+                  </pic:nvPicPr>
+                  <pic:blipFill>
+                    <a:blip r:embed="rId12"/>
+                    <a:srcRect/>
+                    <a:stretch>
+                      <a:fillRect/>
+                    </a:stretch>
+                  </pic:blipFill>
+                  <pic:spPr bwMode="auto">
+                    <a:xfrm>
+                      <a:off x="0" y="0"/>
+                      <a:ext cx="4762500" cy="3190875"/>
+                    </a:xfrm>
+                    <a:prstGeom prst="rect">
+                      <a:avLst/>
+                    </a:prstGeom>
+                  </pic:spPr>
+                </pic:pic>
+              </a:graphicData>
+            </a:graphic>
+          </wp:inline>
+        </w:drawing>
+      </w:r>
+    </w:p>
+    <w:p>
+      <w:r>
+        <w:br w:type="page"/>
+      </w:r>
+    </w:p>
+    <w:p/>
+    <w:p/>
+    <w:p>
+      <w:pPr>
+        <w:pStyle w:val="Titre1"/>
+        <w:numPr>
+          <w:ilvl w:val="0"/>
+          <w:numId w:val="0"/>
+        </w:numPr>
+        <w:ind w:left="567"/>
+      </w:pPr>
+      <w:r>
+        <w:t>#2 — US 2: Tir</w:t>
+      </w:r>
+    </w:p>
+    <w:p>
+      <w:r>
+        <w:t>En tant que joueur je souhaite pouvoir tirer des projectiles afin de tué les ennemies.</w:t>
+      </w:r>
+    </w:p>
+    <w:p/>
+    <w:p>
+      <w:r>
+        <w:t>•   Le joueur tirera un tire toute les 1 sec.</w:t>
+      </w:r>
+    </w:p>
+    <w:p>
+      <w:r>
+        <w:t>•   Les ennemies en tireront un toutes les 2 sec.</w:t>
+      </w:r>
+    </w:p>
+    <w:p>
+      <w:r>
+        <w:t>•   Les tirs du joueur se tireront seulement après 0.5 sec d'arrêt de mouvement.</w:t>
+      </w:r>
+    </w:p>
+    <w:p>
+      <w:r>
+        <w:t>•   Lors de collisions entre deux missile les deux seront détruits.</w:t>
+      </w:r>
+    </w:p>
+    <w:p/>
+    <w:p>
+      <w:r>
+        <w:rPr>
+          <w:noProof/>
+        </w:rPr>
+        <w:drawing>
+          <wp:inline distT="0" distB="0" distL="0" distR="0" wp14:anchorId="05EEF1C2" wp14:editId="3ABD4FF5">
+            <wp:extent cx="4762500" cy="3190875"/>
+            <wp:effectExtent l="0" t="0" r="0" b="0"/>
+            <wp:docPr id="698495877" name="Image 698495877"/>
+            <wp:cNvGraphicFramePr>
+              <a:graphicFrameLocks xmlns:a="http://schemas.openxmlformats.org/drawingml/2006/main" noChangeAspect="1"/>
+            </wp:cNvGraphicFramePr>
+            <a:graphic xmlns:a="http://schemas.openxmlformats.org/drawingml/2006/main">
+              <a:graphicData uri="http://schemas.openxmlformats.org/drawingml/2006/picture">
+                <pic:pic xmlns:pic="http://schemas.openxmlformats.org/drawingml/2006/picture">
+                  <pic:nvPicPr>
+                    <pic:cNvPr id="0" name=""/>
+                    <pic:cNvPicPr>
+                      <a:picLocks noChangeAspect="1" noChangeArrowheads="1"/>
+                    </pic:cNvPicPr>
+                  </pic:nvPicPr>
+                  <pic:blipFill>
+                    <a:blip r:embed="rId12"/>
+                    <a:srcRect/>
+                    <a:stretch>
+                      <a:fillRect/>
+                    </a:stretch>
+                  </pic:blipFill>
+                  <pic:spPr bwMode="auto">
+                    <a:xfrm>
+                      <a:off x="0" y="0"/>
+                      <a:ext cx="4762500" cy="3190875"/>
+                    </a:xfrm>
+                    <a:prstGeom prst="rect">
+                      <a:avLst/>
+                    </a:prstGeom>
+                  </pic:spPr>
+                </pic:pic>
+              </a:graphicData>
+            </a:graphic>
+          </wp:inline>
+        </w:drawing>
+      </w:r>
+    </w:p>
+    <w:p>
+      <w:r>
+        <w:br w:type="page"/>
+      </w:r>
+    </w:p>
+    <w:p/>
+    <w:p>
+      <w:pPr>
+        <w:pStyle w:val="Titre1"/>
+        <w:numPr>
+          <w:ilvl w:val="0"/>
+          <w:numId w:val="0"/>
+        </w:numPr>
+        <w:ind w:left="567"/>
+      </w:pPr>
+      <w:r>
+        <w:t>#3 — US 3: Personnage Joueur</w:t>
+      </w:r>
+    </w:p>
+    <w:p>
+      <w:r>
+        <w:t>En tant que joueur je souhaite avoir un personnage afin de savoir où je suis.</w:t>
+      </w:r>
+    </w:p>
+    <w:p/>
+    <w:p>
+      <w:r>
+        <w:t>•   Le joueur aura 3 vies.</w:t>
+      </w:r>
+    </w:p>
+    <w:p>
+      <w:r>
+        <w:t>•   Il aura 2 sec d'invincibilité à chaque fois qu'il se fassent touché.</w:t>
+      </w:r>
+    </w:p>
+    <w:p>
+      <w:r>
+        <w:t>•   Il perdra un cœur par projectile qui le touche.</w:t>
+      </w:r>
+    </w:p>
+    <w:p>
+      <w:r>
+        <w:t>•    Il perdra un cœur par ennemie au corps à corps qui le touche.</w:t>
+      </w:r>
+    </w:p>
+    <w:p>
+      <w:r>
+        <w:t>•   Il apparaitra au centre de la zone de déplacement.</w:t>
+      </w:r>
+    </w:p>
+    <w:p/>
+    <w:p>
+      <w:r>
+        <w:rPr>
+          <w:noProof/>
+        </w:rPr>
+        <w:drawing>
+          <wp:inline distT="0" distB="0" distL="0" distR="0" wp14:anchorId="26750C48" wp14:editId="7364E10C">
+            <wp:extent cx="4762500" cy="3190875"/>
+            <wp:effectExtent l="0" t="0" r="0" b="0"/>
+            <wp:docPr id="1592970523" name="Image 1592970523"/>
+            <wp:cNvGraphicFramePr>
+              <a:graphicFrameLocks xmlns:a="http://schemas.openxmlformats.org/drawingml/2006/main" noChangeAspect="1"/>
+            </wp:cNvGraphicFramePr>
+            <a:graphic xmlns:a="http://schemas.openxmlformats.org/drawingml/2006/main">
+              <a:graphicData uri="http://schemas.openxmlformats.org/drawingml/2006/picture">
+                <pic:pic xmlns:pic="http://schemas.openxmlformats.org/drawingml/2006/picture">
+                  <pic:nvPicPr>
+                    <pic:cNvPr id="0" name=""/>
+                    <pic:cNvPicPr>
+                      <a:picLocks noChangeAspect="1" noChangeArrowheads="1"/>
+                    </pic:cNvPicPr>
+                  </pic:nvPicPr>
+                  <pic:blipFill>
+                    <a:blip r:embed="rId12"/>
+                    <a:srcRect/>
+                    <a:stretch>
+                      <a:fillRect/>
+                    </a:stretch>
+                  </pic:blipFill>
+                  <pic:spPr bwMode="auto">
+                    <a:xfrm>
+                      <a:off x="0" y="0"/>
+                      <a:ext cx="4762500" cy="3190875"/>
+                    </a:xfrm>
+                    <a:prstGeom prst="rect">
+                      <a:avLst/>
+                    </a:prstGeom>
+                  </pic:spPr>
+                </pic:pic>
+              </a:graphicData>
+            </a:graphic>
+          </wp:inline>
+        </w:drawing>
+      </w:r>
+    </w:p>
+    <w:p>
+      <w:r>
+        <w:br w:type="page"/>
+      </w:r>
+    </w:p>
+    <w:p/>
+    <w:p>
+      <w:pPr>
+        <w:pStyle w:val="Titre1"/>
+        <w:numPr>
+          <w:ilvl w:val="0"/>
+          <w:numId w:val="0"/>
+        </w:numPr>
+        <w:ind w:left="567"/>
+      </w:pPr>
+      <w:r>
+        <w:t>#4 — US 4: Personnage ennemie</w:t>
+      </w:r>
+    </w:p>
+    <w:p>
+      <w:r>
+        <w:t>En tant que joueur je souhaite avoir des ennemies afin de les tué.</w:t>
+      </w:r>
+    </w:p>
+    <w:p/>
+    <w:p>
+      <w:r>
+        <w:t>•   Les ennemies apparaitront à gauche de l'écran et se déplaceront de gauche à droite.</w:t>
+      </w:r>
+    </w:p>
+    <w:p>
+      <w:r>
+        <w:t>•   Si ils arrivent au bout de la zone de jeux ils réapparaitront une ligne en dessous de la ligne où ils étaient à gauche.</w:t>
+      </w:r>
+    </w:p>
+    <w:p>
+      <w:r>
+        <w:t>•   Il tireront si le joueur passe devant eux.</w:t>
+      </w:r>
+    </w:p>
+    <w:p>
+      <w:r>
+        <w:t>•   Il auront 2 vie.</w:t>
+      </w:r>
+    </w:p>
+    <w:p>
+      <w:r>
+        <w:t>•   Ils perdront 2 vies si il sont touchés au corps à corps.</w:t>
+      </w:r>
+    </w:p>
+    <w:p>
+      <w:r>
+        <w:t>•   Ils perdront une vie par tire qui les touchent.</w:t>
+      </w:r>
+    </w:p>
+    <w:p>
+      <w:r>
+        <w:t>•   Moins ils sont plus ils iront vite.</w:t>
+      </w:r>
+    </w:p>
+    <w:p/>
+    <w:p>
+      <w:r>
+        <w:rPr>
+          <w:noProof/>
+        </w:rPr>
+        <w:drawing>
+          <wp:inline distT="0" distB="0" distL="0" distR="0" wp14:anchorId="64A3B993" wp14:editId="78132F57">
+            <wp:extent cx="4762500" cy="3190875"/>
+            <wp:effectExtent l="0" t="0" r="0" b="0"/>
+            <wp:docPr id="845150927" name="Image 845150927"/>
+            <wp:cNvGraphicFramePr>
+              <a:graphicFrameLocks xmlns:a="http://schemas.openxmlformats.org/drawingml/2006/main" noChangeAspect="1"/>
+            </wp:cNvGraphicFramePr>
+            <a:graphic xmlns:a="http://schemas.openxmlformats.org/drawingml/2006/main">
+              <a:graphicData uri="http://schemas.openxmlformats.org/drawingml/2006/picture">
+                <pic:pic xmlns:pic="http://schemas.openxmlformats.org/drawingml/2006/picture">
+                  <pic:nvPicPr>
+                    <pic:cNvPr id="0" name=""/>
+                    <pic:cNvPicPr>
+                      <a:picLocks noChangeAspect="1" noChangeArrowheads="1"/>
+                    </pic:cNvPicPr>
+                  </pic:nvPicPr>
+                  <pic:blipFill>
+                    <a:blip r:embed="rId12"/>
+                    <a:srcRect/>
+                    <a:stretch>
+                      <a:fillRect/>
+                    </a:stretch>
+                  </pic:blipFill>
+                  <pic:spPr bwMode="auto">
+                    <a:xfrm>
+                      <a:off x="0" y="0"/>
+                      <a:ext cx="4762500" cy="3190875"/>
+                    </a:xfrm>
+                    <a:prstGeom prst="rect">
+                      <a:avLst/>
+                    </a:prstGeom>
+                  </pic:spPr>
+                </pic:pic>
+              </a:graphicData>
+            </a:graphic>
+          </wp:inline>
+        </w:drawing>
+      </w:r>
+    </w:p>
+    <w:p>
+      <w:r>
+        <w:br w:type="page"/>
+      </w:r>
+    </w:p>
+    <w:p>
+      <w:pPr>
+        <w:pStyle w:val="Titre1"/>
+        <w:numPr>
+          <w:ilvl w:val="0"/>
+          <w:numId w:val="0"/>
+        </w:numPr>
+        <w:ind w:left="567"/>
+      </w:pPr>
+      <w:r>
+        <w:lastRenderedPageBreak/>
+        <w:t>#5 — US 5: Barrière</w:t>
+      </w:r>
+    </w:p>
+    <w:p>
+      <w:r>
+        <w:t>En tant que joueur je souhaite avoir des barrières afin de me protéger des attaques.</w:t>
+      </w:r>
+    </w:p>
+    <w:p/>
+    <w:p>
+      <w:r>
+        <w:t>•   Les barrières se détruiront progressivement si elles sont toucher par des ennemies.</w:t>
+      </w:r>
+    </w:p>
+    <w:p>
+      <w:r>
+        <w:t>•   Elles pourront résister à un total de 5 attaque.</w:t>
+      </w:r>
+    </w:p>
+    <w:p>
+      <w:r>
+        <w:t>•   Le joueur ne pourra pas leur infliger de dégâts.</w:t>
+      </w:r>
+    </w:p>
+    <w:p/>
+    <w:p>
+      <w:r>
+        <w:rPr>
+          <w:noProof/>
+        </w:rPr>
+        <w:drawing>
+          <wp:inline distT="0" distB="0" distL="0" distR="0" wp14:anchorId="1CE26840" wp14:editId="34C62A54">
+            <wp:extent cx="4762500" cy="3190875"/>
+            <wp:effectExtent l="0" t="0" r="0" b="0"/>
+            <wp:docPr id="1856120522" name="Image 1856120522"/>
+            <wp:cNvGraphicFramePr>
+              <a:graphicFrameLocks xmlns:a="http://schemas.openxmlformats.org/drawingml/2006/main" noChangeAspect="1"/>
+            </wp:cNvGraphicFramePr>
+            <a:graphic xmlns:a="http://schemas.openxmlformats.org/drawingml/2006/main">
+              <a:graphicData uri="http://schemas.openxmlformats.org/drawingml/2006/picture">
+                <pic:pic xmlns:pic="http://schemas.openxmlformats.org/drawingml/2006/picture">
+                  <pic:nvPicPr>
+                    <pic:cNvPr id="0" name=""/>
+                    <pic:cNvPicPr>
+                      <a:picLocks noChangeAspect="1" noChangeArrowheads="1"/>
+                    </pic:cNvPicPr>
+                  </pic:nvPicPr>
+                  <pic:blipFill>
+                    <a:blip r:embed="rId12"/>
+                    <a:srcRect/>
+                    <a:stretch>
+                      <a:fillRect/>
+                    </a:stretch>
+                  </pic:blipFill>
+                  <pic:spPr bwMode="auto">
+                    <a:xfrm>
+                      <a:off x="0" y="0"/>
+                      <a:ext cx="4762500" cy="3190875"/>
+                    </a:xfrm>
+                    <a:prstGeom prst="rect">
+                      <a:avLst/>
+                    </a:prstGeom>
+                  </pic:spPr>
+                </pic:pic>
+              </a:graphicData>
+            </a:graphic>
+          </wp:inline>
+        </w:drawing>
+      </w:r>
+    </w:p>
+    <w:p>
+      <w:r>
+        <w:br w:type="page"/>
+      </w:r>
+    </w:p>
+    <w:p>
+      <w:pPr>
+        <w:pStyle w:val="Titre1"/>
+        <w:numPr>
+          <w:ilvl w:val="0"/>
+          <w:numId w:val="0"/>
+        </w:numPr>
+        <w:ind w:left="567" w:hanging="567"/>
+      </w:pPr>
+      <w:r>
+        <w:lastRenderedPageBreak/>
+        <w:t>#6 — US 6: Vague</w:t>
+      </w:r>
+    </w:p>
+    <w:p>
+      <w:r>
+        <w:t>En tant que joueur je souhaite avoir des vagues afin que la difficulté augmente progressivement.</w:t>
+      </w:r>
+    </w:p>
+    <w:p/>
+    <w:p/>
+    <w:p>
+      <w:r>
+        <w:rPr>
+          <w:noProof/>
+        </w:rPr>
+        <w:drawing>
+          <wp:inline distT="0" distB="0" distL="0" distR="0" wp14:anchorId="2B844367" wp14:editId="0C1AA14F">
+            <wp:extent cx="4762500" cy="3190875"/>
+            <wp:effectExtent l="0" t="0" r="0" b="0"/>
+            <wp:docPr id="1566258406" name="Image 1566258406"/>
+            <wp:cNvGraphicFramePr>
+              <a:graphicFrameLocks xmlns:a="http://schemas.openxmlformats.org/drawingml/2006/main" noChangeAspect="1"/>
+            </wp:cNvGraphicFramePr>
+            <a:graphic xmlns:a="http://schemas.openxmlformats.org/drawingml/2006/main">
+              <a:graphicData uri="http://schemas.openxmlformats.org/drawingml/2006/picture">
+                <pic:pic xmlns:pic="http://schemas.openxmlformats.org/drawingml/2006/picture">
+                  <pic:nvPicPr>
+                    <pic:cNvPr id="0" name=""/>
+                    <pic:cNvPicPr>
+                      <a:picLocks noChangeAspect="1" noChangeArrowheads="1"/>
+                    </pic:cNvPicPr>
+                  </pic:nvPicPr>
+                  <pic:blipFill>
+                    <a:blip r:embed="rId12"/>
+                    <a:srcRect/>
+                    <a:stretch>
+                      <a:fillRect/>
+                    </a:stretch>
+                  </pic:blipFill>
+                  <pic:spPr bwMode="auto">
+                    <a:xfrm>
+                      <a:off x="0" y="0"/>
+                      <a:ext cx="4762500" cy="3190875"/>
+                    </a:xfrm>
+                    <a:prstGeom prst="rect">
+                      <a:avLst/>
+                    </a:prstGeom>
+                  </pic:spPr>
+                </pic:pic>
+              </a:graphicData>
+            </a:graphic>
+          </wp:inline>
+        </w:drawing>
+      </w:r>
+    </w:p>
+    <w:p/>
+    <w:p/>
+    <w:p>
+      <w:r>
+        <w:t>•   Il y aura 3 vague.</w:t>
+      </w:r>
+    </w:p>
+    <w:p>
+      <w:r>
+        <w:t>•   Il y aura 15 ennemies à la première, puis 25 à la deuxième et puis 50 à la dernière.</w:t>
+      </w:r>
+    </w:p>
+    <w:p>
+      <w:r>
+        <w:t>•   Il y aura 5 sec de pause entre chacune.</w:t>
+      </w:r>
+    </w:p>
+    <w:p>
+      <w:r>
+        <w:t>•   le joueur gagne si il arrive à battre les 50 ennemies de la dernière vague avant que ces vies ne tombent à zéro.</w:t>
+      </w:r>
+    </w:p>
+    <w:p/>
+    <w:p/>
+    <w:p>
+      <w:pPr>
+        <w:pStyle w:val="Titre1"/>
+      </w:pPr>
+      <w:bookmarkStart w:id="9" w:name="_Toc532179964"/>
+      <w:bookmarkStart w:id="10" w:name="_Toc165969648"/>
+      <w:bookmarkStart w:id="11" w:name="_Toc308526337"/>
       <w:bookmarkEnd w:id="7"/>
-    </w:p>
-    <w:p>
-      <w:pPr>
-        <w:pStyle w:val="Informations"/>
-        <w:numPr>
-          <w:ilvl w:val="5"/>
-          <w:numId w:val="16"/>
-        </w:numPr>
-      </w:pPr>
-      <w:r>
-        <w:t>Ce paragraphe énumère la l</w:t>
-      </w:r>
-      <w:r>
-        <w:t xml:space="preserve">iste des difficultés potentielles de tout </w:t>
-      </w:r>
-      <w:r>
-        <w:t>ordre :</w:t>
-      </w:r>
-    </w:p>
-    <w:p>
-      <w:pPr>
-        <w:pStyle w:val="Informations"/>
-        <w:numPr>
-          <w:ilvl w:val="6"/>
-          <w:numId w:val="16"/>
-        </w:numPr>
-      </w:pPr>
-      <w:r>
-        <w:t xml:space="preserve">Liste des </w:t>
-      </w:r>
-      <w:r>
-        <w:t>compétences</w:t>
-      </w:r>
-      <w:r>
-        <w:t xml:space="preserve"> à acquérir</w:t>
-      </w:r>
-      <w:r>
-        <w:t xml:space="preserve"> ou approfondir</w:t>
-      </w:r>
-    </w:p>
-    <w:p>
-      <w:pPr>
-        <w:pStyle w:val="Informations"/>
-        <w:numPr>
-          <w:ilvl w:val="6"/>
-          <w:numId w:val="16"/>
-        </w:numPr>
-      </w:pPr>
-      <w:r>
-        <w:t xml:space="preserve">Liste du </w:t>
-      </w:r>
-      <w:r>
-        <w:t>matériel</w:t>
-      </w:r>
-      <w:r>
-        <w:t xml:space="preserve"> à exploiter</w:t>
-      </w:r>
-    </w:p>
-    <w:p>
-      <w:pPr>
-        <w:pStyle w:val="Informations"/>
-        <w:numPr>
-          <w:ilvl w:val="6"/>
-          <w:numId w:val="16"/>
-        </w:numPr>
-      </w:pPr>
-      <w:r>
-        <w:t>Recherche d’</w:t>
-      </w:r>
-      <w:r>
-        <w:t>information</w:t>
-      </w:r>
-      <w:r>
-        <w:t>s</w:t>
-      </w:r>
-      <w:r>
-        <w:t xml:space="preserve"> particulières</w:t>
-      </w:r>
-    </w:p>
-    <w:p>
-      <w:pPr>
-        <w:pStyle w:val="Informations"/>
-        <w:numPr>
-          <w:ilvl w:val="6"/>
-          <w:numId w:val="16"/>
-        </w:numPr>
-      </w:pPr>
-      <w:r>
-        <w:t>Gestion du travail en équipe &amp; collaboration</w:t>
-      </w:r>
-    </w:p>
-    <w:p>
-      <w:pPr>
-        <w:pStyle w:val="Informations"/>
-        <w:numPr>
-          <w:ilvl w:val="5"/>
-          <w:numId w:val="16"/>
-        </w:numPr>
-      </w:pPr>
-      <w:r>
-        <w:t>Ainsi que les s</w:t>
-      </w:r>
-      <w:r>
-        <w:t>olutions possibles</w:t>
-      </w:r>
-    </w:p>
-    <w:p>
-      <w:pPr>
-        <w:pStyle w:val="Informations"/>
-        <w:numPr>
-          <w:ilvl w:val="5"/>
-          <w:numId w:val="43"/>
-        </w:numPr>
-      </w:pPr>
-      <w:r>
-        <w:t>Si les spécifications de départ ne laissent pas de doutes sur la manière de réaliser un projet, ce chapitre ne fera que renvoyer le lecteur aux spécifications.</w:t>
-      </w:r>
+      <w:bookmarkEnd w:id="8"/>
+      <w:r>
+        <w:t>Réalisation</w:t>
+      </w:r>
+      <w:bookmarkEnd w:id="9"/>
+      <w:bookmarkEnd w:id="10"/>
+      <w:bookmarkEnd w:id="11"/>
     </w:p>
     <w:p>
       <w:pPr>
         <w:pStyle w:val="Titre2"/>
       </w:pPr>
-      <w:bookmarkStart w:id="8" w:name="_Toc532179959"/>
-      <w:bookmarkStart w:id="9" w:name="_Toc165969643"/>
-      <w:bookmarkStart w:id="10" w:name="_Toc308526334"/>
-      <w:r>
-        <w:t>Document d’analyse</w:t>
-      </w:r>
-      <w:bookmarkEnd w:id="8"/>
-      <w:bookmarkEnd w:id="9"/>
-      <w:r>
-        <w:t xml:space="preserve"> et conception</w:t>
-      </w:r>
-      <w:bookmarkEnd w:id="10"/>
-    </w:p>
-    <w:p>
-      <w:pPr>
-        <w:pStyle w:val="Informations"/>
-        <w:numPr>
-          <w:ilvl w:val="5"/>
-          <w:numId w:val="17"/>
-        </w:numPr>
-      </w:pPr>
-      <w:r>
-        <w:t xml:space="preserve">Ce paragraphe </w:t>
-      </w:r>
-      <w:r>
-        <w:t>décrit le fonctionnement de manière détaillée.</w:t>
-      </w:r>
-    </w:p>
-    <w:p>
-      <w:pPr>
-        <w:pStyle w:val="Informations"/>
-        <w:numPr>
-          <w:ilvl w:val="6"/>
-          <w:numId w:val="17"/>
-        </w:numPr>
-      </w:pPr>
-      <w:r>
-        <w:t>Autant que possible de manière graphique</w:t>
-      </w:r>
-      <w:r>
-        <w:t>, imagée, tableaux, etc.</w:t>
-      </w:r>
-    </w:p>
-    <w:p>
-      <w:pPr>
-        <w:pStyle w:val="Informations"/>
-        <w:numPr>
-          <w:ilvl w:val="6"/>
-          <w:numId w:val="17"/>
-        </w:numPr>
-      </w:pPr>
-      <w:r>
-        <w:t>Tous les cas particuliers devraient y être spécifiés</w:t>
-      </w:r>
-      <w:r>
-        <w:t>…</w:t>
-      </w:r>
-    </w:p>
-    <w:p>
-      <w:pPr>
-        <w:pStyle w:val="Informations"/>
-        <w:numPr>
-          <w:ilvl w:val="5"/>
-          <w:numId w:val="17"/>
-        </w:numPr>
-      </w:pPr>
-      <w:r>
-        <w:t>Il s’agit d’y présenter le</w:t>
-      </w:r>
-      <w:r>
-        <w:t>s fonctionnalités à développer :</w:t>
-      </w:r>
-    </w:p>
-    <w:p>
-      <w:pPr>
-        <w:pStyle w:val="Informations"/>
-        <w:numPr>
-          <w:ilvl w:val="6"/>
-          <w:numId w:val="17"/>
-        </w:numPr>
-      </w:pPr>
-      <w:r>
-        <w:t>Découpage en étapes, en modules, en fonctionnalités, etc.</w:t>
-      </w:r>
-    </w:p>
-    <w:p>
-      <w:pPr>
-        <w:pStyle w:val="Informations"/>
-        <w:numPr>
-          <w:ilvl w:val="6"/>
-          <w:numId w:val="17"/>
-        </w:numPr>
-      </w:pPr>
-      <w:r>
-        <w:t>Formulaires, interfaces graphiques, pages web, etc.</w:t>
-      </w:r>
-    </w:p>
-    <w:p>
-      <w:pPr>
-        <w:pStyle w:val="Informations"/>
-        <w:numPr>
-          <w:ilvl w:val="6"/>
-          <w:numId w:val="17"/>
-        </w:numPr>
-      </w:pPr>
-      <w:r>
-        <w:t xml:space="preserve">Schémas de navigation, schémas événementiels, structogramme, </w:t>
-      </w:r>
-      <w:r>
-        <w:t>pseudocode</w:t>
-      </w:r>
-      <w:r>
-        <w:t>, etc.</w:t>
-      </w:r>
-    </w:p>
-    <w:p>
-      <w:pPr>
-        <w:pStyle w:val="Informations"/>
-        <w:numPr>
-          <w:ilvl w:val="5"/>
-          <w:numId w:val="17"/>
-        </w:numPr>
-      </w:pPr>
-      <w:r>
-        <w:t>Si le pr</w:t>
-      </w:r>
-      <w:r>
-        <w:t xml:space="preserve">ojet inclut une base </w:t>
-      </w:r>
-      <w:r>
-        <w:t>de données :</w:t>
-      </w:r>
-    </w:p>
-    <w:p>
-      <w:pPr>
-        <w:pStyle w:val="Informations"/>
-        <w:numPr>
-          <w:ilvl w:val="6"/>
-          <w:numId w:val="17"/>
-        </w:numPr>
-      </w:pPr>
-      <w:r>
-        <w:t>Dictionnaire</w:t>
-      </w:r>
-      <w:r>
-        <w:t xml:space="preserve"> des données</w:t>
-      </w:r>
-    </w:p>
-    <w:p>
-      <w:pPr>
-        <w:pStyle w:val="Informations"/>
-        <w:numPr>
-          <w:ilvl w:val="6"/>
-          <w:numId w:val="17"/>
-        </w:numPr>
-      </w:pPr>
-      <w:r>
-        <w:t>Modèle conceptuel des données, modèles logique des données.</w:t>
-      </w:r>
-    </w:p>
-    <w:p>
-      <w:pPr>
-        <w:pStyle w:val="Titre2"/>
-      </w:pPr>
-      <w:bookmarkStart w:id="11" w:name="_Toc532179967"/>
-      <w:bookmarkStart w:id="12" w:name="_Toc165969651"/>
-      <w:bookmarkStart w:id="13" w:name="_Toc308526335"/>
-      <w:r>
-        <w:lastRenderedPageBreak/>
-        <w:t>Conception des tests</w:t>
-      </w:r>
-      <w:bookmarkEnd w:id="11"/>
+      <w:bookmarkStart w:id="12" w:name="_Toc532179965"/>
+      <w:bookmarkStart w:id="13" w:name="_Toc165969649"/>
+      <w:bookmarkStart w:id="14" w:name="_Toc308526338"/>
+      <w:r>
+        <w:t>Dossier de Réalisation</w:t>
+      </w:r>
       <w:bookmarkEnd w:id="12"/>
       <w:bookmarkEnd w:id="13"/>
-    </w:p>
-    <w:p>
-      <w:pPr>
-        <w:pStyle w:val="Informations"/>
-        <w:numPr>
-          <w:ilvl w:val="5"/>
-          <w:numId w:val="18"/>
-        </w:numPr>
-      </w:pPr>
-      <w:r>
-        <w:t xml:space="preserve">Ce paragraphe permet de spécifier la stratégie de </w:t>
-      </w:r>
-      <w:r>
-        <w:t>test </w:t>
-      </w:r>
-      <w:r>
-        <w:t xml:space="preserve">qui sera menée au point </w:t>
-      </w:r>
-      <w:r>
-        <w:fldChar w:fldCharType="begin"/>
-      </w:r>
-      <w:r>
-        <w:instrText xml:space="preserve"> REF _Ref308525868 \r \h </w:instrText>
-      </w:r>
-      <w:r>
-        <w:fldChar w:fldCharType="separate"/>
-      </w:r>
-      <w:r>
-        <w:t>5.1</w:t>
-      </w:r>
-      <w:r>
-        <w:fldChar w:fldCharType="end"/>
-      </w:r>
-    </w:p>
-    <w:p>
-      <w:pPr>
-        <w:pStyle w:val="Informations"/>
-        <w:numPr>
-          <w:ilvl w:val="5"/>
-          <w:numId w:val="18"/>
-        </w:numPr>
-      </w:pPr>
-      <w:r>
-        <w:t>Qui, quand, avec quelles données, dans quel ordre, etc.</w:t>
-      </w:r>
-    </w:p>
-    <w:p>
-      <w:pPr>
-        <w:pStyle w:val="Titre2"/>
-      </w:pPr>
-      <w:bookmarkStart w:id="14" w:name="_Toc308526336"/>
-      <w:bookmarkStart w:id="15" w:name="_Toc532179961"/>
-      <w:r>
-        <w:t>Planification</w:t>
-      </w:r>
-      <w:r>
-        <w:t xml:space="preserve"> détaillé</w:t>
-      </w:r>
-      <w:r>
-        <w:t>e</w:t>
-      </w:r>
       <w:bookmarkEnd w:id="14"/>
-    </w:p>
-    <w:p>
-      <w:pPr>
-        <w:pStyle w:val="Informations"/>
-        <w:numPr>
-          <w:ilvl w:val="5"/>
-          <w:numId w:val="19"/>
-        </w:numPr>
-      </w:pPr>
-      <w:r>
-        <w:t>A ce stade, après l’analyse complète du projet, un planning détaillé et complet (avec tâches, sous-tâches, dépendances, durée</w:t>
-      </w:r>
-      <w:r>
-        <w:t>, …) peut être finalisé.</w:t>
-      </w:r>
-    </w:p>
-    <w:p>
-      <w:pPr>
-        <w:pStyle w:val="Informations"/>
-        <w:numPr>
-          <w:ilvl w:val="5"/>
-          <w:numId w:val="19"/>
-        </w:numPr>
-      </w:pPr>
-      <w:r>
-        <w:t>Le planning détaillé doit s’inscrire dans le planning initial.</w:t>
-      </w:r>
-      <w:r>
-        <w:t xml:space="preserve"> Il faut que l’on puisse situer cette planification détaillée par rapport à la planification initiale.</w:t>
-      </w:r>
-    </w:p>
-    <w:p>
-      <w:pPr>
-        <w:pStyle w:val="Titre1"/>
-      </w:pPr>
-      <w:bookmarkStart w:id="16" w:name="_Toc532179964"/>
-      <w:bookmarkStart w:id="17" w:name="_Toc165969648"/>
-      <w:bookmarkStart w:id="18" w:name="_Toc308526337"/>
-      <w:bookmarkEnd w:id="15"/>
-      <w:r>
-        <w:t>Réalisation</w:t>
-      </w:r>
-      <w:bookmarkEnd w:id="16"/>
-      <w:bookmarkEnd w:id="17"/>
-      <w:bookmarkEnd w:id="18"/>
-    </w:p>
-    <w:p>
-      <w:pPr>
-        <w:pStyle w:val="Titre2"/>
-      </w:pPr>
-      <w:bookmarkStart w:id="19" w:name="_Toc532179965"/>
-      <w:bookmarkStart w:id="20" w:name="_Toc165969649"/>
-      <w:bookmarkStart w:id="21" w:name="_Toc308526338"/>
-      <w:r>
-        <w:t>Dossier de Réalisation</w:t>
-      </w:r>
-      <w:bookmarkEnd w:id="19"/>
-      <w:bookmarkEnd w:id="20"/>
-      <w:bookmarkEnd w:id="21"/>
     </w:p>
     <w:p>
       <w:pPr>
@@ -4208,15 +4592,15 @@
       <w:pPr>
         <w:pStyle w:val="Titre2"/>
       </w:pPr>
-      <w:bookmarkStart w:id="22" w:name="_Toc532179960"/>
-      <w:bookmarkStart w:id="23" w:name="_Toc165969644"/>
-      <w:bookmarkStart w:id="24" w:name="_Toc308526339"/>
+      <w:bookmarkStart w:id="15" w:name="_Toc532179960"/>
+      <w:bookmarkStart w:id="16" w:name="_Toc165969644"/>
+      <w:bookmarkStart w:id="17" w:name="_Toc308526339"/>
       <w:r>
         <w:t>Modifications</w:t>
       </w:r>
-      <w:bookmarkEnd w:id="22"/>
-      <w:bookmarkEnd w:id="23"/>
-      <w:bookmarkEnd w:id="24"/>
+      <w:bookmarkEnd w:id="15"/>
+      <w:bookmarkEnd w:id="16"/>
+      <w:bookmarkEnd w:id="17"/>
     </w:p>
     <w:p>
       <w:pPr>
@@ -4258,31 +4642,31 @@
       <w:pPr>
         <w:pStyle w:val="Titre1"/>
       </w:pPr>
-      <w:bookmarkStart w:id="25" w:name="_Toc532179966"/>
-      <w:bookmarkStart w:id="26" w:name="_Toc165969650"/>
-      <w:bookmarkStart w:id="27" w:name="_Toc308526340"/>
+      <w:bookmarkStart w:id="18" w:name="_Toc532179966"/>
+      <w:bookmarkStart w:id="19" w:name="_Toc165969650"/>
+      <w:bookmarkStart w:id="20" w:name="_Toc308526340"/>
       <w:r>
         <w:t>Tests</w:t>
       </w:r>
-      <w:bookmarkEnd w:id="25"/>
-      <w:bookmarkEnd w:id="26"/>
-      <w:bookmarkEnd w:id="27"/>
+      <w:bookmarkEnd w:id="18"/>
+      <w:bookmarkEnd w:id="19"/>
+      <w:bookmarkEnd w:id="20"/>
     </w:p>
     <w:p>
       <w:pPr>
         <w:pStyle w:val="Titre2"/>
       </w:pPr>
-      <w:bookmarkStart w:id="28" w:name="_Toc532179968"/>
-      <w:bookmarkStart w:id="29" w:name="_Toc165969652"/>
-      <w:bookmarkStart w:id="30" w:name="_Ref308525868"/>
-      <w:bookmarkStart w:id="31" w:name="_Toc308526341"/>
+      <w:bookmarkStart w:id="21" w:name="_Toc532179968"/>
+      <w:bookmarkStart w:id="22" w:name="_Toc165969652"/>
+      <w:bookmarkStart w:id="23" w:name="_Ref308525868"/>
+      <w:bookmarkStart w:id="24" w:name="_Toc308526341"/>
       <w:r>
         <w:t>Dossier des tests</w:t>
       </w:r>
-      <w:bookmarkEnd w:id="28"/>
-      <w:bookmarkEnd w:id="29"/>
-      <w:bookmarkEnd w:id="30"/>
-      <w:bookmarkEnd w:id="31"/>
+      <w:bookmarkEnd w:id="21"/>
+      <w:bookmarkEnd w:id="22"/>
+      <w:bookmarkEnd w:id="23"/>
+      <w:bookmarkEnd w:id="24"/>
     </w:p>
     <w:p>
       <w:pPr>
@@ -4299,7 +4683,11 @@
         <w:t>ests effectués (qui, quand, avec quelles données…)</w:t>
       </w:r>
       <w:r>
-        <w:t xml:space="preserve"> sous forme de procédure. Lorsque cela est possible, fournir un tableau des tests effectués avec les résultats obtenus et les actions à entreprendre en conséquence</w:t>
+        <w:t xml:space="preserve"> sous forme de procédure. Lorsque cela est possible, fournir un tableau des tests effectués avec les </w:t>
+      </w:r>
+      <w:r>
+        <w:lastRenderedPageBreak/>
+        <w:t>résultats obtenus et les actions à entreprendre en conséquence</w:t>
       </w:r>
       <w:r>
         <w:t xml:space="preserve"> (et une estimation de leur durée)</w:t>
@@ -4369,28 +4757,28 @@
       <w:pPr>
         <w:pStyle w:val="Titre1"/>
       </w:pPr>
-      <w:bookmarkStart w:id="32" w:name="_Toc165969653"/>
-      <w:bookmarkStart w:id="33" w:name="_Toc308526342"/>
+      <w:bookmarkStart w:id="25" w:name="_Toc165969653"/>
+      <w:bookmarkStart w:id="26" w:name="_Toc308526342"/>
       <w:r>
         <w:t>Conclusion</w:t>
       </w:r>
-      <w:bookmarkEnd w:id="32"/>
-      <w:bookmarkEnd w:id="33"/>
+      <w:bookmarkEnd w:id="25"/>
+      <w:bookmarkEnd w:id="26"/>
     </w:p>
     <w:p>
       <w:pPr>
         <w:pStyle w:val="Titre2"/>
       </w:pPr>
-      <w:bookmarkStart w:id="34" w:name="_Toc165969654"/>
-      <w:bookmarkStart w:id="35" w:name="_Toc308526343"/>
+      <w:bookmarkStart w:id="27" w:name="_Toc165969654"/>
+      <w:bookmarkStart w:id="28" w:name="_Toc308526343"/>
       <w:r>
         <w:t xml:space="preserve">Bilan des </w:t>
       </w:r>
-      <w:bookmarkEnd w:id="34"/>
+      <w:bookmarkEnd w:id="27"/>
       <w:r>
         <w:t>fonctionnalités demandées</w:t>
       </w:r>
-      <w:bookmarkEnd w:id="35"/>
+      <w:bookmarkEnd w:id="28"/>
     </w:p>
     <w:p>
       <w:pPr>
@@ -4429,13 +4817,13 @@
       <w:pPr>
         <w:pStyle w:val="Titre2"/>
       </w:pPr>
-      <w:bookmarkStart w:id="36" w:name="_Toc165969655"/>
-      <w:bookmarkStart w:id="37" w:name="_Toc308526344"/>
+      <w:bookmarkStart w:id="29" w:name="_Toc165969655"/>
+      <w:bookmarkStart w:id="30" w:name="_Toc308526344"/>
       <w:r>
         <w:t>Bilan de la planification</w:t>
       </w:r>
-      <w:bookmarkEnd w:id="36"/>
-      <w:bookmarkEnd w:id="37"/>
+      <w:bookmarkEnd w:id="29"/>
+      <w:bookmarkEnd w:id="30"/>
     </w:p>
     <w:p>
       <w:pPr>
@@ -4461,28 +4849,20 @@
         <w:t xml:space="preserve"> projet.</w:t>
       </w:r>
       <w:r>
-        <w:t xml:space="preserve"> Indiquer </w:t>
-      </w:r>
-      <w:proofErr w:type="gramStart"/>
-      <w:r>
-        <w:t>les différence</w:t>
-      </w:r>
-      <w:proofErr w:type="gramEnd"/>
-      <w:r>
-        <w:t xml:space="preserve"> entre les planifications initiales et détaillées avec le journal de travail.</w:t>
+        <w:t xml:space="preserve"> Indiquer les différence entre les planifications initiales et détaillées avec le journal de travail.</w:t>
       </w:r>
     </w:p>
     <w:p>
       <w:pPr>
         <w:pStyle w:val="Titre2"/>
       </w:pPr>
-      <w:bookmarkStart w:id="38" w:name="_Toc165969656"/>
-      <w:bookmarkStart w:id="39" w:name="_Toc308526345"/>
+      <w:bookmarkStart w:id="31" w:name="_Toc165969656"/>
+      <w:bookmarkStart w:id="32" w:name="_Toc308526345"/>
       <w:r>
         <w:t>Bilan personnel</w:t>
       </w:r>
-      <w:bookmarkEnd w:id="38"/>
-      <w:bookmarkEnd w:id="39"/>
+      <w:bookmarkEnd w:id="31"/>
+      <w:bookmarkEnd w:id="32"/>
     </w:p>
     <w:p>
       <w:pPr>
@@ -4584,30 +4964,29 @@
       <w:pPr>
         <w:pStyle w:val="Titre1"/>
       </w:pPr>
-      <w:bookmarkStart w:id="40" w:name="_Toc532179971"/>
-      <w:bookmarkStart w:id="41" w:name="_Toc165969657"/>
-      <w:bookmarkStart w:id="42" w:name="_Toc308526346"/>
-      <w:r>
-        <w:lastRenderedPageBreak/>
+      <w:bookmarkStart w:id="33" w:name="_Toc532179971"/>
+      <w:bookmarkStart w:id="34" w:name="_Toc165969657"/>
+      <w:bookmarkStart w:id="35" w:name="_Toc308526346"/>
+      <w:r>
         <w:t>Divers</w:t>
       </w:r>
-      <w:bookmarkEnd w:id="40"/>
-      <w:bookmarkEnd w:id="41"/>
-      <w:bookmarkEnd w:id="42"/>
+      <w:bookmarkEnd w:id="33"/>
+      <w:bookmarkEnd w:id="34"/>
+      <w:bookmarkEnd w:id="35"/>
     </w:p>
     <w:p>
       <w:pPr>
         <w:pStyle w:val="Titre2"/>
       </w:pPr>
-      <w:bookmarkStart w:id="43" w:name="_Toc532179972"/>
-      <w:bookmarkStart w:id="44" w:name="_Toc165969658"/>
-      <w:bookmarkStart w:id="45" w:name="_Toc308526347"/>
+      <w:bookmarkStart w:id="36" w:name="_Toc532179972"/>
+      <w:bookmarkStart w:id="37" w:name="_Toc165969658"/>
+      <w:bookmarkStart w:id="38" w:name="_Toc308526347"/>
       <w:r>
         <w:t>Journal de travail</w:t>
       </w:r>
-      <w:bookmarkEnd w:id="43"/>
-      <w:bookmarkEnd w:id="44"/>
-      <w:bookmarkEnd w:id="45"/>
+      <w:bookmarkEnd w:id="36"/>
+      <w:bookmarkEnd w:id="37"/>
+      <w:bookmarkEnd w:id="38"/>
     </w:p>
     <w:p>
       <w:pPr>
@@ -4643,11 +5022,11 @@
       <w:pPr>
         <w:pStyle w:val="Titre2"/>
       </w:pPr>
-      <w:bookmarkStart w:id="46" w:name="_Toc308526348"/>
+      <w:bookmarkStart w:id="39" w:name="_Toc308526348"/>
       <w:r>
         <w:t>Bibliographie</w:t>
       </w:r>
-      <w:bookmarkEnd w:id="46"/>
+      <w:bookmarkEnd w:id="39"/>
     </w:p>
     <w:p>
       <w:pPr>
@@ -4674,11 +5053,11 @@
       <w:pPr>
         <w:pStyle w:val="Titre2"/>
       </w:pPr>
-      <w:bookmarkStart w:id="47" w:name="_Toc308526349"/>
+      <w:bookmarkStart w:id="40" w:name="_Toc308526349"/>
       <w:r>
         <w:t>Webographie</w:t>
       </w:r>
-      <w:bookmarkEnd w:id="47"/>
+      <w:bookmarkEnd w:id="40"/>
     </w:p>
     <w:p>
       <w:pPr>
@@ -4696,11 +5075,11 @@
       <w:pPr>
         <w:pStyle w:val="Titre1"/>
       </w:pPr>
-      <w:bookmarkStart w:id="48" w:name="_Toc308526350"/>
+      <w:bookmarkStart w:id="41" w:name="_Toc308526350"/>
       <w:r>
         <w:t>Annexes</w:t>
       </w:r>
-      <w:bookmarkEnd w:id="48"/>
+      <w:bookmarkEnd w:id="41"/>
     </w:p>
     <w:p>
       <w:pPr>
@@ -4775,8 +5154,8 @@
       </w:r>
     </w:p>
     <w:sectPr>
-      <w:headerReference w:type="default" r:id="rId12"/>
-      <w:footerReference w:type="default" r:id="rId13"/>
+      <w:headerReference w:type="default" r:id="rId13"/>
+      <w:footerReference w:type="default" r:id="rId14"/>
       <w:pgSz w:w="11906" w:h="16838" w:code="9"/>
       <w:pgMar w:top="1418" w:right="1418" w:bottom="1418" w:left="1418" w:header="709" w:footer="709" w:gutter="0"/>
       <w:cols w:space="708"/>

</xml_diff>

<commit_message>
chore(image): Créé les images pour tous le jeu.
[105\Done]
</commit_message>
<xml_diff>
--- a/doc/I320-RapportProjet.docx
+++ b/doc/I320-RapportProjet.docx
@@ -166,8 +166,10 @@
           <w:bCs w:val="0"/>
           <w:caps w:val="0"/>
           <w:noProof/>
-          <w:sz w:val="22"/>
-          <w:szCs w:val="22"/>
+          <w:kern w:val="2"/>
+          <w:sz w:val="24"/>
+          <w:szCs w:val="24"/>
+          <w14:ligatures w14:val="standardContextual"/>
         </w:rPr>
       </w:pPr>
       <w:r>
@@ -203,7 +205,7 @@
         </w:rPr>
         <w:fldChar w:fldCharType="separate"/>
       </w:r>
-      <w:hyperlink w:anchor="_Toc308526316" w:history="1">
+      <w:hyperlink w:anchor="_Toc240025000" w:history="1">
         <w:r>
           <w:rPr>
             <w:rStyle w:val="Lienhypertexte"/>
@@ -218,8 +220,10 @@
             <w:bCs w:val="0"/>
             <w:caps w:val="0"/>
             <w:noProof/>
-            <w:sz w:val="22"/>
-            <w:szCs w:val="22"/>
+            <w:kern w:val="2"/>
+            <w:sz w:val="24"/>
+            <w:szCs w:val="24"/>
+            <w14:ligatures w14:val="standardContextual"/>
           </w:rPr>
           <w:tab/>
         </w:r>
@@ -228,7 +232,7 @@
             <w:rStyle w:val="Lienhypertexte"/>
             <w:noProof/>
           </w:rPr>
-          <w:t>Spécifications</w:t>
+          <w:t>Introduction</w:t>
         </w:r>
         <w:r>
           <w:rPr>
@@ -249,7 +253,7 @@
             <w:noProof/>
             <w:webHidden/>
           </w:rPr>
-          <w:instrText xml:space="preserve"> PAGEREF _Toc308526316 \h </w:instrText>
+          <w:instrText xml:space="preserve"> PAGEREF _Toc240025000 \h </w:instrText>
         </w:r>
         <w:r>
           <w:rPr>
@@ -291,11 +295,13 @@
           <w:rFonts w:eastAsiaTheme="minorEastAsia" w:cstheme="minorBidi"/>
           <w:smallCaps w:val="0"/>
           <w:noProof/>
-          <w:sz w:val="22"/>
-          <w:szCs w:val="22"/>
+          <w:kern w:val="2"/>
+          <w:sz w:val="24"/>
+          <w:szCs w:val="24"/>
+          <w14:ligatures w14:val="standardContextual"/>
         </w:rPr>
       </w:pPr>
-      <w:hyperlink w:anchor="_Toc308526317" w:history="1">
+      <w:hyperlink w:anchor="_Toc240025001" w:history="1">
         <w:r>
           <w:rPr>
             <w:rStyle w:val="Lienhypertexte"/>
@@ -308,8 +314,10 @@
             <w:rFonts w:eastAsiaTheme="minorEastAsia" w:cstheme="minorBidi"/>
             <w:smallCaps w:val="0"/>
             <w:noProof/>
-            <w:sz w:val="22"/>
-            <w:szCs w:val="22"/>
+            <w:kern w:val="2"/>
+            <w:sz w:val="24"/>
+            <w:szCs w:val="24"/>
+            <w14:ligatures w14:val="standardContextual"/>
           </w:rPr>
           <w:tab/>
         </w:r>
@@ -339,7 +347,7 @@
             <w:noProof/>
             <w:webHidden/>
           </w:rPr>
-          <w:instrText xml:space="preserve"> PAGEREF _Toc308526317 \h </w:instrText>
+          <w:instrText xml:space="preserve"> PAGEREF _Toc240025001 \h </w:instrText>
         </w:r>
         <w:r>
           <w:rPr>
@@ -381,11 +389,13 @@
           <w:rFonts w:eastAsiaTheme="minorEastAsia" w:cstheme="minorBidi"/>
           <w:smallCaps w:val="0"/>
           <w:noProof/>
-          <w:sz w:val="22"/>
-          <w:szCs w:val="22"/>
+          <w:kern w:val="2"/>
+          <w:sz w:val="24"/>
+          <w:szCs w:val="24"/>
+          <w14:ligatures w14:val="standardContextual"/>
         </w:rPr>
       </w:pPr>
-      <w:hyperlink w:anchor="_Toc308526318" w:history="1">
+      <w:hyperlink w:anchor="_Toc240025002" w:history="1">
         <w:r>
           <w:rPr>
             <w:rStyle w:val="Lienhypertexte"/>
@@ -398,8 +408,10 @@
             <w:rFonts w:eastAsiaTheme="minorEastAsia" w:cstheme="minorBidi"/>
             <w:smallCaps w:val="0"/>
             <w:noProof/>
-            <w:sz w:val="22"/>
-            <w:szCs w:val="22"/>
+            <w:kern w:val="2"/>
+            <w:sz w:val="24"/>
+            <w:szCs w:val="24"/>
+            <w14:ligatures w14:val="standardContextual"/>
           </w:rPr>
           <w:tab/>
         </w:r>
@@ -408,7 +420,7 @@
             <w:rStyle w:val="Lienhypertexte"/>
             <w:noProof/>
           </w:rPr>
-          <w:t>Description</w:t>
+          <w:t>Objectifs produit</w:t>
         </w:r>
         <w:r>
           <w:rPr>
@@ -429,7 +441,7 @@
             <w:noProof/>
             <w:webHidden/>
           </w:rPr>
-          <w:instrText xml:space="preserve"> PAGEREF _Toc308526318 \h </w:instrText>
+          <w:instrText xml:space="preserve"> PAGEREF _Toc240025002 \h </w:instrText>
         </w:r>
         <w:r>
           <w:rPr>
@@ -471,11 +483,13 @@
           <w:rFonts w:eastAsiaTheme="minorEastAsia" w:cstheme="minorBidi"/>
           <w:smallCaps w:val="0"/>
           <w:noProof/>
-          <w:sz w:val="22"/>
-          <w:szCs w:val="22"/>
+          <w:kern w:val="2"/>
+          <w:sz w:val="24"/>
+          <w:szCs w:val="24"/>
+          <w14:ligatures w14:val="standardContextual"/>
         </w:rPr>
       </w:pPr>
-      <w:hyperlink w:anchor="_Toc308526319" w:history="1">
+      <w:hyperlink w:anchor="_Toc240025003" w:history="1">
         <w:r>
           <w:rPr>
             <w:rStyle w:val="Lienhypertexte"/>
@@ -488,8 +502,10 @@
             <w:rFonts w:eastAsiaTheme="minorEastAsia" w:cstheme="minorBidi"/>
             <w:smallCaps w:val="0"/>
             <w:noProof/>
-            <w:sz w:val="22"/>
-            <w:szCs w:val="22"/>
+            <w:kern w:val="2"/>
+            <w:sz w:val="24"/>
+            <w:szCs w:val="24"/>
+            <w14:ligatures w14:val="standardContextual"/>
           </w:rPr>
           <w:tab/>
         </w:r>
@@ -498,7 +514,7 @@
             <w:rStyle w:val="Lienhypertexte"/>
             <w:noProof/>
           </w:rPr>
-          <w:t>Matériel et logiciels à disposition</w:t>
+          <w:t>Objectifs pédagogiques</w:t>
         </w:r>
         <w:r>
           <w:rPr>
@@ -519,7 +535,7 @@
             <w:noProof/>
             <w:webHidden/>
           </w:rPr>
-          <w:instrText xml:space="preserve"> PAGEREF _Toc308526319 \h </w:instrText>
+          <w:instrText xml:space="preserve"> PAGEREF _Toc240025003 \h </w:instrText>
         </w:r>
         <w:r>
           <w:rPr>
@@ -540,1010 +556,6 @@
             <w:webHidden/>
           </w:rPr>
           <w:t>3</w:t>
-        </w:r>
-        <w:r>
-          <w:rPr>
-            <w:noProof/>
-            <w:webHidden/>
-          </w:rPr>
-          <w:fldChar w:fldCharType="end"/>
-        </w:r>
-      </w:hyperlink>
-    </w:p>
-    <w:p>
-      <w:pPr>
-        <w:pStyle w:val="TM2"/>
-        <w:tabs>
-          <w:tab w:val="left" w:pos="800"/>
-          <w:tab w:val="right" w:leader="dot" w:pos="9060"/>
-        </w:tabs>
-        <w:rPr>
-          <w:rFonts w:eastAsiaTheme="minorEastAsia" w:cstheme="minorBidi"/>
-          <w:smallCaps w:val="0"/>
-          <w:noProof/>
-          <w:sz w:val="22"/>
-          <w:szCs w:val="22"/>
-        </w:rPr>
-      </w:pPr>
-      <w:hyperlink w:anchor="_Toc308526320" w:history="1">
-        <w:r>
-          <w:rPr>
-            <w:rStyle w:val="Lienhypertexte"/>
-            <w:noProof/>
-          </w:rPr>
-          <w:t>1.4</w:t>
-        </w:r>
-        <w:r>
-          <w:rPr>
-            <w:rFonts w:eastAsiaTheme="minorEastAsia" w:cstheme="minorBidi"/>
-            <w:smallCaps w:val="0"/>
-            <w:noProof/>
-            <w:sz w:val="22"/>
-            <w:szCs w:val="22"/>
-          </w:rPr>
-          <w:tab/>
-        </w:r>
-        <w:r>
-          <w:rPr>
-            <w:rStyle w:val="Lienhypertexte"/>
-            <w:noProof/>
-          </w:rPr>
-          <w:t>Prérequis</w:t>
-        </w:r>
-        <w:r>
-          <w:rPr>
-            <w:noProof/>
-            <w:webHidden/>
-          </w:rPr>
-          <w:tab/>
-        </w:r>
-        <w:r>
-          <w:rPr>
-            <w:noProof/>
-            <w:webHidden/>
-          </w:rPr>
-          <w:fldChar w:fldCharType="begin"/>
-        </w:r>
-        <w:r>
-          <w:rPr>
-            <w:noProof/>
-            <w:webHidden/>
-          </w:rPr>
-          <w:instrText xml:space="preserve"> PAGEREF _Toc308526320 \h </w:instrText>
-        </w:r>
-        <w:r>
-          <w:rPr>
-            <w:noProof/>
-            <w:webHidden/>
-          </w:rPr>
-        </w:r>
-        <w:r>
-          <w:rPr>
-            <w:noProof/>
-            <w:webHidden/>
-          </w:rPr>
-          <w:fldChar w:fldCharType="separate"/>
-        </w:r>
-        <w:r>
-          <w:rPr>
-            <w:noProof/>
-            <w:webHidden/>
-          </w:rPr>
-          <w:t>3</w:t>
-        </w:r>
-        <w:r>
-          <w:rPr>
-            <w:noProof/>
-            <w:webHidden/>
-          </w:rPr>
-          <w:fldChar w:fldCharType="end"/>
-        </w:r>
-      </w:hyperlink>
-    </w:p>
-    <w:p>
-      <w:pPr>
-        <w:pStyle w:val="TM2"/>
-        <w:tabs>
-          <w:tab w:val="left" w:pos="800"/>
-          <w:tab w:val="right" w:leader="dot" w:pos="9060"/>
-        </w:tabs>
-        <w:rPr>
-          <w:rFonts w:eastAsiaTheme="minorEastAsia" w:cstheme="minorBidi"/>
-          <w:smallCaps w:val="0"/>
-          <w:noProof/>
-          <w:sz w:val="22"/>
-          <w:szCs w:val="22"/>
-        </w:rPr>
-      </w:pPr>
-      <w:hyperlink w:anchor="_Toc308526321" w:history="1">
-        <w:r>
-          <w:rPr>
-            <w:rStyle w:val="Lienhypertexte"/>
-            <w:noProof/>
-          </w:rPr>
-          <w:t>1.5</w:t>
-        </w:r>
-        <w:r>
-          <w:rPr>
-            <w:rFonts w:eastAsiaTheme="minorEastAsia" w:cstheme="minorBidi"/>
-            <w:smallCaps w:val="0"/>
-            <w:noProof/>
-            <w:sz w:val="22"/>
-            <w:szCs w:val="22"/>
-          </w:rPr>
-          <w:tab/>
-        </w:r>
-        <w:r>
-          <w:rPr>
-            <w:rStyle w:val="Lienhypertexte"/>
-            <w:noProof/>
-          </w:rPr>
-          <w:t>Cahier des charges</w:t>
-        </w:r>
-        <w:r>
-          <w:rPr>
-            <w:noProof/>
-            <w:webHidden/>
-          </w:rPr>
-          <w:tab/>
-        </w:r>
-        <w:r>
-          <w:rPr>
-            <w:noProof/>
-            <w:webHidden/>
-          </w:rPr>
-          <w:fldChar w:fldCharType="begin"/>
-        </w:r>
-        <w:r>
-          <w:rPr>
-            <w:noProof/>
-            <w:webHidden/>
-          </w:rPr>
-          <w:instrText xml:space="preserve"> PAGEREF _Toc308526321 \h </w:instrText>
-        </w:r>
-        <w:r>
-          <w:rPr>
-            <w:noProof/>
-            <w:webHidden/>
-          </w:rPr>
-        </w:r>
-        <w:r>
-          <w:rPr>
-            <w:noProof/>
-            <w:webHidden/>
-          </w:rPr>
-          <w:fldChar w:fldCharType="separate"/>
-        </w:r>
-        <w:r>
-          <w:rPr>
-            <w:noProof/>
-            <w:webHidden/>
-          </w:rPr>
-          <w:t>3</w:t>
-        </w:r>
-        <w:r>
-          <w:rPr>
-            <w:noProof/>
-            <w:webHidden/>
-          </w:rPr>
-          <w:fldChar w:fldCharType="end"/>
-        </w:r>
-      </w:hyperlink>
-    </w:p>
-    <w:p>
-      <w:pPr>
-        <w:pStyle w:val="TM3"/>
-        <w:tabs>
-          <w:tab w:val="left" w:pos="1200"/>
-          <w:tab w:val="right" w:leader="dot" w:pos="9060"/>
-        </w:tabs>
-        <w:rPr>
-          <w:rFonts w:eastAsiaTheme="minorEastAsia" w:cstheme="minorBidi"/>
-          <w:i w:val="0"/>
-          <w:iCs w:val="0"/>
-          <w:noProof/>
-          <w:sz w:val="22"/>
-          <w:szCs w:val="22"/>
-        </w:rPr>
-      </w:pPr>
-      <w:hyperlink w:anchor="_Toc308526322" w:history="1">
-        <w:r>
-          <w:rPr>
-            <w:rStyle w:val="Lienhypertexte"/>
-            <w:noProof/>
-          </w:rPr>
-          <w:t>1.5.1</w:t>
-        </w:r>
-        <w:r>
-          <w:rPr>
-            <w:rFonts w:eastAsiaTheme="minorEastAsia" w:cstheme="minorBidi"/>
-            <w:i w:val="0"/>
-            <w:iCs w:val="0"/>
-            <w:noProof/>
-            <w:sz w:val="22"/>
-            <w:szCs w:val="22"/>
-          </w:rPr>
-          <w:tab/>
-        </w:r>
-        <w:r>
-          <w:rPr>
-            <w:rStyle w:val="Lienhypertexte"/>
-            <w:noProof/>
-          </w:rPr>
-          <w:t>Objectifs et portée du projet (objectifs SMART)</w:t>
-        </w:r>
-        <w:r>
-          <w:rPr>
-            <w:noProof/>
-            <w:webHidden/>
-          </w:rPr>
-          <w:tab/>
-        </w:r>
-        <w:r>
-          <w:rPr>
-            <w:noProof/>
-            <w:webHidden/>
-          </w:rPr>
-          <w:fldChar w:fldCharType="begin"/>
-        </w:r>
-        <w:r>
-          <w:rPr>
-            <w:noProof/>
-            <w:webHidden/>
-          </w:rPr>
-          <w:instrText xml:space="preserve"> PAGEREF _Toc308526322 \h </w:instrText>
-        </w:r>
-        <w:r>
-          <w:rPr>
-            <w:noProof/>
-            <w:webHidden/>
-          </w:rPr>
-        </w:r>
-        <w:r>
-          <w:rPr>
-            <w:noProof/>
-            <w:webHidden/>
-          </w:rPr>
-          <w:fldChar w:fldCharType="separate"/>
-        </w:r>
-        <w:r>
-          <w:rPr>
-            <w:noProof/>
-            <w:webHidden/>
-          </w:rPr>
-          <w:t>3</w:t>
-        </w:r>
-        <w:r>
-          <w:rPr>
-            <w:noProof/>
-            <w:webHidden/>
-          </w:rPr>
-          <w:fldChar w:fldCharType="end"/>
-        </w:r>
-      </w:hyperlink>
-    </w:p>
-    <w:p>
-      <w:pPr>
-        <w:pStyle w:val="TM3"/>
-        <w:tabs>
-          <w:tab w:val="left" w:pos="1200"/>
-          <w:tab w:val="right" w:leader="dot" w:pos="9060"/>
-        </w:tabs>
-        <w:rPr>
-          <w:rFonts w:eastAsiaTheme="minorEastAsia" w:cstheme="minorBidi"/>
-          <w:i w:val="0"/>
-          <w:iCs w:val="0"/>
-          <w:noProof/>
-          <w:sz w:val="22"/>
-          <w:szCs w:val="22"/>
-        </w:rPr>
-      </w:pPr>
-      <w:hyperlink w:anchor="_Toc308526323" w:history="1">
-        <w:r>
-          <w:rPr>
-            <w:rStyle w:val="Lienhypertexte"/>
-            <w:noProof/>
-          </w:rPr>
-          <w:t>1.5.2</w:t>
-        </w:r>
-        <w:r>
-          <w:rPr>
-            <w:rFonts w:eastAsiaTheme="minorEastAsia" w:cstheme="minorBidi"/>
-            <w:i w:val="0"/>
-            <w:iCs w:val="0"/>
-            <w:noProof/>
-            <w:sz w:val="22"/>
-            <w:szCs w:val="22"/>
-          </w:rPr>
-          <w:tab/>
-        </w:r>
-        <w:r>
-          <w:rPr>
-            <w:rStyle w:val="Lienhypertexte"/>
-            <w:noProof/>
-          </w:rPr>
-          <w:t>Caractéristiques des utilisateurs et impacts</w:t>
-        </w:r>
-        <w:r>
-          <w:rPr>
-            <w:noProof/>
-            <w:webHidden/>
-          </w:rPr>
-          <w:tab/>
-        </w:r>
-        <w:r>
-          <w:rPr>
-            <w:noProof/>
-            <w:webHidden/>
-          </w:rPr>
-          <w:fldChar w:fldCharType="begin"/>
-        </w:r>
-        <w:r>
-          <w:rPr>
-            <w:noProof/>
-            <w:webHidden/>
-          </w:rPr>
-          <w:instrText xml:space="preserve"> PAGEREF _Toc308526323 \h </w:instrText>
-        </w:r>
-        <w:r>
-          <w:rPr>
-            <w:noProof/>
-            <w:webHidden/>
-          </w:rPr>
-        </w:r>
-        <w:r>
-          <w:rPr>
-            <w:noProof/>
-            <w:webHidden/>
-          </w:rPr>
-          <w:fldChar w:fldCharType="separate"/>
-        </w:r>
-        <w:r>
-          <w:rPr>
-            <w:noProof/>
-            <w:webHidden/>
-          </w:rPr>
-          <w:t>3</w:t>
-        </w:r>
-        <w:r>
-          <w:rPr>
-            <w:noProof/>
-            <w:webHidden/>
-          </w:rPr>
-          <w:fldChar w:fldCharType="end"/>
-        </w:r>
-      </w:hyperlink>
-    </w:p>
-    <w:p>
-      <w:pPr>
-        <w:pStyle w:val="TM3"/>
-        <w:tabs>
-          <w:tab w:val="left" w:pos="1200"/>
-          <w:tab w:val="right" w:leader="dot" w:pos="9060"/>
-        </w:tabs>
-        <w:rPr>
-          <w:rFonts w:eastAsiaTheme="minorEastAsia" w:cstheme="minorBidi"/>
-          <w:i w:val="0"/>
-          <w:iCs w:val="0"/>
-          <w:noProof/>
-          <w:sz w:val="22"/>
-          <w:szCs w:val="22"/>
-        </w:rPr>
-      </w:pPr>
-      <w:hyperlink w:anchor="_Toc308526324" w:history="1">
-        <w:r>
-          <w:rPr>
-            <w:rStyle w:val="Lienhypertexte"/>
-            <w:noProof/>
-          </w:rPr>
-          <w:t>1.5.3</w:t>
-        </w:r>
-        <w:r>
-          <w:rPr>
-            <w:rFonts w:eastAsiaTheme="minorEastAsia" w:cstheme="minorBidi"/>
-            <w:i w:val="0"/>
-            <w:iCs w:val="0"/>
-            <w:noProof/>
-            <w:sz w:val="22"/>
-            <w:szCs w:val="22"/>
-          </w:rPr>
-          <w:tab/>
-        </w:r>
-        <w:r>
-          <w:rPr>
-            <w:rStyle w:val="Lienhypertexte"/>
-            <w:noProof/>
-          </w:rPr>
-          <w:t>Fonctionnalités requises (du point de vue de l’utilisateur)</w:t>
-        </w:r>
-        <w:r>
-          <w:rPr>
-            <w:noProof/>
-            <w:webHidden/>
-          </w:rPr>
-          <w:tab/>
-        </w:r>
-        <w:r>
-          <w:rPr>
-            <w:noProof/>
-            <w:webHidden/>
-          </w:rPr>
-          <w:fldChar w:fldCharType="begin"/>
-        </w:r>
-        <w:r>
-          <w:rPr>
-            <w:noProof/>
-            <w:webHidden/>
-          </w:rPr>
-          <w:instrText xml:space="preserve"> PAGEREF _Toc308526324 \h </w:instrText>
-        </w:r>
-        <w:r>
-          <w:rPr>
-            <w:noProof/>
-            <w:webHidden/>
-          </w:rPr>
-        </w:r>
-        <w:r>
-          <w:rPr>
-            <w:noProof/>
-            <w:webHidden/>
-          </w:rPr>
-          <w:fldChar w:fldCharType="separate"/>
-        </w:r>
-        <w:r>
-          <w:rPr>
-            <w:noProof/>
-            <w:webHidden/>
-          </w:rPr>
-          <w:t>3</w:t>
-        </w:r>
-        <w:r>
-          <w:rPr>
-            <w:noProof/>
-            <w:webHidden/>
-          </w:rPr>
-          <w:fldChar w:fldCharType="end"/>
-        </w:r>
-      </w:hyperlink>
-    </w:p>
-    <w:p>
-      <w:pPr>
-        <w:pStyle w:val="TM3"/>
-        <w:tabs>
-          <w:tab w:val="left" w:pos="1200"/>
-          <w:tab w:val="right" w:leader="dot" w:pos="9060"/>
-        </w:tabs>
-        <w:rPr>
-          <w:rFonts w:eastAsiaTheme="minorEastAsia" w:cstheme="minorBidi"/>
-          <w:i w:val="0"/>
-          <w:iCs w:val="0"/>
-          <w:noProof/>
-          <w:sz w:val="22"/>
-          <w:szCs w:val="22"/>
-        </w:rPr>
-      </w:pPr>
-      <w:hyperlink w:anchor="_Toc308526325" w:history="1">
-        <w:r>
-          <w:rPr>
-            <w:rStyle w:val="Lienhypertexte"/>
-            <w:noProof/>
-          </w:rPr>
-          <w:t>1.5.4</w:t>
-        </w:r>
-        <w:r>
-          <w:rPr>
-            <w:rFonts w:eastAsiaTheme="minorEastAsia" w:cstheme="minorBidi"/>
-            <w:i w:val="0"/>
-            <w:iCs w:val="0"/>
-            <w:noProof/>
-            <w:sz w:val="22"/>
-            <w:szCs w:val="22"/>
-          </w:rPr>
-          <w:tab/>
-        </w:r>
-        <w:r>
-          <w:rPr>
-            <w:rStyle w:val="Lienhypertexte"/>
-            <w:noProof/>
-          </w:rPr>
-          <w:t>Contraintes</w:t>
-        </w:r>
-        <w:r>
-          <w:rPr>
-            <w:noProof/>
-            <w:webHidden/>
-          </w:rPr>
-          <w:tab/>
-        </w:r>
-        <w:r>
-          <w:rPr>
-            <w:noProof/>
-            <w:webHidden/>
-          </w:rPr>
-          <w:fldChar w:fldCharType="begin"/>
-        </w:r>
-        <w:r>
-          <w:rPr>
-            <w:noProof/>
-            <w:webHidden/>
-          </w:rPr>
-          <w:instrText xml:space="preserve"> PAGEREF _Toc308526325 \h </w:instrText>
-        </w:r>
-        <w:r>
-          <w:rPr>
-            <w:noProof/>
-            <w:webHidden/>
-          </w:rPr>
-        </w:r>
-        <w:r>
-          <w:rPr>
-            <w:noProof/>
-            <w:webHidden/>
-          </w:rPr>
-          <w:fldChar w:fldCharType="separate"/>
-        </w:r>
-        <w:r>
-          <w:rPr>
-            <w:noProof/>
-            <w:webHidden/>
-          </w:rPr>
-          <w:t>3</w:t>
-        </w:r>
-        <w:r>
-          <w:rPr>
-            <w:noProof/>
-            <w:webHidden/>
-          </w:rPr>
-          <w:fldChar w:fldCharType="end"/>
-        </w:r>
-      </w:hyperlink>
-    </w:p>
-    <w:p>
-      <w:pPr>
-        <w:pStyle w:val="TM3"/>
-        <w:tabs>
-          <w:tab w:val="left" w:pos="1200"/>
-          <w:tab w:val="right" w:leader="dot" w:pos="9060"/>
-        </w:tabs>
-        <w:rPr>
-          <w:rFonts w:eastAsiaTheme="minorEastAsia" w:cstheme="minorBidi"/>
-          <w:i w:val="0"/>
-          <w:iCs w:val="0"/>
-          <w:noProof/>
-          <w:sz w:val="22"/>
-          <w:szCs w:val="22"/>
-        </w:rPr>
-      </w:pPr>
-      <w:hyperlink w:anchor="_Toc308526326" w:history="1">
-        <w:r>
-          <w:rPr>
-            <w:rStyle w:val="Lienhypertexte"/>
-            <w:noProof/>
-          </w:rPr>
-          <w:t>1.5.5</w:t>
-        </w:r>
-        <w:r>
-          <w:rPr>
-            <w:rFonts w:eastAsiaTheme="minorEastAsia" w:cstheme="minorBidi"/>
-            <w:i w:val="0"/>
-            <w:iCs w:val="0"/>
-            <w:noProof/>
-            <w:sz w:val="22"/>
-            <w:szCs w:val="22"/>
-          </w:rPr>
-          <w:tab/>
-        </w:r>
-        <w:r>
-          <w:rPr>
-            <w:rStyle w:val="Lienhypertexte"/>
-            <w:noProof/>
-          </w:rPr>
-          <w:t>Travail à réaliser par l'apprenti</w:t>
-        </w:r>
-        <w:r>
-          <w:rPr>
-            <w:noProof/>
-            <w:webHidden/>
-          </w:rPr>
-          <w:tab/>
-        </w:r>
-        <w:r>
-          <w:rPr>
-            <w:noProof/>
-            <w:webHidden/>
-          </w:rPr>
-          <w:fldChar w:fldCharType="begin"/>
-        </w:r>
-        <w:r>
-          <w:rPr>
-            <w:noProof/>
-            <w:webHidden/>
-          </w:rPr>
-          <w:instrText xml:space="preserve"> PAGEREF _Toc308526326 \h </w:instrText>
-        </w:r>
-        <w:r>
-          <w:rPr>
-            <w:noProof/>
-            <w:webHidden/>
-          </w:rPr>
-        </w:r>
-        <w:r>
-          <w:rPr>
-            <w:noProof/>
-            <w:webHidden/>
-          </w:rPr>
-          <w:fldChar w:fldCharType="separate"/>
-        </w:r>
-        <w:r>
-          <w:rPr>
-            <w:noProof/>
-            <w:webHidden/>
-          </w:rPr>
-          <w:t>4</w:t>
-        </w:r>
-        <w:r>
-          <w:rPr>
-            <w:noProof/>
-            <w:webHidden/>
-          </w:rPr>
-          <w:fldChar w:fldCharType="end"/>
-        </w:r>
-      </w:hyperlink>
-    </w:p>
-    <w:p>
-      <w:pPr>
-        <w:pStyle w:val="TM3"/>
-        <w:tabs>
-          <w:tab w:val="left" w:pos="1200"/>
-          <w:tab w:val="right" w:leader="dot" w:pos="9060"/>
-        </w:tabs>
-        <w:rPr>
-          <w:rFonts w:eastAsiaTheme="minorEastAsia" w:cstheme="minorBidi"/>
-          <w:i w:val="0"/>
-          <w:iCs w:val="0"/>
-          <w:noProof/>
-          <w:sz w:val="22"/>
-          <w:szCs w:val="22"/>
-        </w:rPr>
-      </w:pPr>
-      <w:hyperlink w:anchor="_Toc308526327" w:history="1">
-        <w:r>
-          <w:rPr>
-            <w:rStyle w:val="Lienhypertexte"/>
-            <w:noProof/>
-          </w:rPr>
-          <w:t>1.5.6</w:t>
-        </w:r>
-        <w:r>
-          <w:rPr>
-            <w:rFonts w:eastAsiaTheme="minorEastAsia" w:cstheme="minorBidi"/>
-            <w:i w:val="0"/>
-            <w:iCs w:val="0"/>
-            <w:noProof/>
-            <w:sz w:val="22"/>
-            <w:szCs w:val="22"/>
-          </w:rPr>
-          <w:tab/>
-        </w:r>
-        <w:r>
-          <w:rPr>
-            <w:rStyle w:val="Lienhypertexte"/>
-            <w:noProof/>
-          </w:rPr>
-          <w:t>Si le temps le permet …</w:t>
-        </w:r>
-        <w:r>
-          <w:rPr>
-            <w:noProof/>
-            <w:webHidden/>
-          </w:rPr>
-          <w:tab/>
-        </w:r>
-        <w:r>
-          <w:rPr>
-            <w:noProof/>
-            <w:webHidden/>
-          </w:rPr>
-          <w:fldChar w:fldCharType="begin"/>
-        </w:r>
-        <w:r>
-          <w:rPr>
-            <w:noProof/>
-            <w:webHidden/>
-          </w:rPr>
-          <w:instrText xml:space="preserve"> PAGEREF _Toc308526327 \h </w:instrText>
-        </w:r>
-        <w:r>
-          <w:rPr>
-            <w:noProof/>
-            <w:webHidden/>
-          </w:rPr>
-        </w:r>
-        <w:r>
-          <w:rPr>
-            <w:noProof/>
-            <w:webHidden/>
-          </w:rPr>
-          <w:fldChar w:fldCharType="separate"/>
-        </w:r>
-        <w:r>
-          <w:rPr>
-            <w:noProof/>
-            <w:webHidden/>
-          </w:rPr>
-          <w:t>4</w:t>
-        </w:r>
-        <w:r>
-          <w:rPr>
-            <w:noProof/>
-            <w:webHidden/>
-          </w:rPr>
-          <w:fldChar w:fldCharType="end"/>
-        </w:r>
-      </w:hyperlink>
-    </w:p>
-    <w:p>
-      <w:pPr>
-        <w:pStyle w:val="TM3"/>
-        <w:tabs>
-          <w:tab w:val="left" w:pos="1200"/>
-          <w:tab w:val="right" w:leader="dot" w:pos="9060"/>
-        </w:tabs>
-        <w:rPr>
-          <w:rFonts w:eastAsiaTheme="minorEastAsia" w:cstheme="minorBidi"/>
-          <w:i w:val="0"/>
-          <w:iCs w:val="0"/>
-          <w:noProof/>
-          <w:sz w:val="22"/>
-          <w:szCs w:val="22"/>
-        </w:rPr>
-      </w:pPr>
-      <w:hyperlink w:anchor="_Toc308526328" w:history="1">
-        <w:r>
-          <w:rPr>
-            <w:rStyle w:val="Lienhypertexte"/>
-            <w:noProof/>
-          </w:rPr>
-          <w:t>1.5.7</w:t>
-        </w:r>
-        <w:r>
-          <w:rPr>
-            <w:rFonts w:eastAsiaTheme="minorEastAsia" w:cstheme="minorBidi"/>
-            <w:i w:val="0"/>
-            <w:iCs w:val="0"/>
-            <w:noProof/>
-            <w:sz w:val="22"/>
-            <w:szCs w:val="22"/>
-          </w:rPr>
-          <w:tab/>
-        </w:r>
-        <w:r>
-          <w:rPr>
-            <w:rStyle w:val="Lienhypertexte"/>
-            <w:noProof/>
-          </w:rPr>
-          <w:t>Méthodes de validation des solutions</w:t>
-        </w:r>
-        <w:r>
-          <w:rPr>
-            <w:noProof/>
-            <w:webHidden/>
-          </w:rPr>
-          <w:tab/>
-        </w:r>
-        <w:r>
-          <w:rPr>
-            <w:noProof/>
-            <w:webHidden/>
-          </w:rPr>
-          <w:fldChar w:fldCharType="begin"/>
-        </w:r>
-        <w:r>
-          <w:rPr>
-            <w:noProof/>
-            <w:webHidden/>
-          </w:rPr>
-          <w:instrText xml:space="preserve"> PAGEREF _Toc308526328 \h </w:instrText>
-        </w:r>
-        <w:r>
-          <w:rPr>
-            <w:noProof/>
-            <w:webHidden/>
-          </w:rPr>
-        </w:r>
-        <w:r>
-          <w:rPr>
-            <w:noProof/>
-            <w:webHidden/>
-          </w:rPr>
-          <w:fldChar w:fldCharType="separate"/>
-        </w:r>
-        <w:r>
-          <w:rPr>
-            <w:noProof/>
-            <w:webHidden/>
-          </w:rPr>
-          <w:t>4</w:t>
-        </w:r>
-        <w:r>
-          <w:rPr>
-            <w:noProof/>
-            <w:webHidden/>
-          </w:rPr>
-          <w:fldChar w:fldCharType="end"/>
-        </w:r>
-      </w:hyperlink>
-    </w:p>
-    <w:p>
-      <w:pPr>
-        <w:pStyle w:val="TM2"/>
-        <w:tabs>
-          <w:tab w:val="left" w:pos="800"/>
-          <w:tab w:val="right" w:leader="dot" w:pos="9060"/>
-        </w:tabs>
-        <w:rPr>
-          <w:rFonts w:eastAsiaTheme="minorEastAsia" w:cstheme="minorBidi"/>
-          <w:smallCaps w:val="0"/>
-          <w:noProof/>
-          <w:sz w:val="22"/>
-          <w:szCs w:val="22"/>
-        </w:rPr>
-      </w:pPr>
-      <w:hyperlink w:anchor="_Toc308526329" w:history="1">
-        <w:r>
-          <w:rPr>
-            <w:rStyle w:val="Lienhypertexte"/>
-            <w:noProof/>
-          </w:rPr>
-          <w:t>1.6</w:t>
-        </w:r>
-        <w:r>
-          <w:rPr>
-            <w:rFonts w:eastAsiaTheme="minorEastAsia" w:cstheme="minorBidi"/>
-            <w:smallCaps w:val="0"/>
-            <w:noProof/>
-            <w:sz w:val="22"/>
-            <w:szCs w:val="22"/>
-          </w:rPr>
-          <w:tab/>
-        </w:r>
-        <w:r>
-          <w:rPr>
-            <w:rStyle w:val="Lienhypertexte"/>
-            <w:noProof/>
-          </w:rPr>
-          <w:t>Les points suivants seront évalués</w:t>
-        </w:r>
-        <w:r>
-          <w:rPr>
-            <w:noProof/>
-            <w:webHidden/>
-          </w:rPr>
-          <w:tab/>
-        </w:r>
-        <w:r>
-          <w:rPr>
-            <w:noProof/>
-            <w:webHidden/>
-          </w:rPr>
-          <w:fldChar w:fldCharType="begin"/>
-        </w:r>
-        <w:r>
-          <w:rPr>
-            <w:noProof/>
-            <w:webHidden/>
-          </w:rPr>
-          <w:instrText xml:space="preserve"> PAGEREF _Toc308526329 \h </w:instrText>
-        </w:r>
-        <w:r>
-          <w:rPr>
-            <w:noProof/>
-            <w:webHidden/>
-          </w:rPr>
-        </w:r>
-        <w:r>
-          <w:rPr>
-            <w:noProof/>
-            <w:webHidden/>
-          </w:rPr>
-          <w:fldChar w:fldCharType="separate"/>
-        </w:r>
-        <w:r>
-          <w:rPr>
-            <w:noProof/>
-            <w:webHidden/>
-          </w:rPr>
-          <w:t>4</w:t>
-        </w:r>
-        <w:r>
-          <w:rPr>
-            <w:noProof/>
-            <w:webHidden/>
-          </w:rPr>
-          <w:fldChar w:fldCharType="end"/>
-        </w:r>
-      </w:hyperlink>
-    </w:p>
-    <w:p>
-      <w:pPr>
-        <w:pStyle w:val="TM2"/>
-        <w:tabs>
-          <w:tab w:val="left" w:pos="800"/>
-          <w:tab w:val="right" w:leader="dot" w:pos="9060"/>
-        </w:tabs>
-        <w:rPr>
-          <w:rFonts w:eastAsiaTheme="minorEastAsia" w:cstheme="minorBidi"/>
-          <w:smallCaps w:val="0"/>
-          <w:noProof/>
-          <w:sz w:val="22"/>
-          <w:szCs w:val="22"/>
-        </w:rPr>
-      </w:pPr>
-      <w:hyperlink w:anchor="_Toc308526330" w:history="1">
-        <w:r>
-          <w:rPr>
-            <w:rStyle w:val="Lienhypertexte"/>
-            <w:noProof/>
-          </w:rPr>
-          <w:t>1.7</w:t>
-        </w:r>
-        <w:r>
-          <w:rPr>
-            <w:rFonts w:eastAsiaTheme="minorEastAsia" w:cstheme="minorBidi"/>
-            <w:smallCaps w:val="0"/>
-            <w:noProof/>
-            <w:sz w:val="22"/>
-            <w:szCs w:val="22"/>
-          </w:rPr>
-          <w:tab/>
-        </w:r>
-        <w:r>
-          <w:rPr>
-            <w:rStyle w:val="Lienhypertexte"/>
-            <w:noProof/>
-          </w:rPr>
-          <w:t>Validation et conditions de réussite</w:t>
-        </w:r>
-        <w:r>
-          <w:rPr>
-            <w:noProof/>
-            <w:webHidden/>
-          </w:rPr>
-          <w:tab/>
-        </w:r>
-        <w:r>
-          <w:rPr>
-            <w:noProof/>
-            <w:webHidden/>
-          </w:rPr>
-          <w:fldChar w:fldCharType="begin"/>
-        </w:r>
-        <w:r>
-          <w:rPr>
-            <w:noProof/>
-            <w:webHidden/>
-          </w:rPr>
-          <w:instrText xml:space="preserve"> PAGEREF _Toc308526330 \h </w:instrText>
-        </w:r>
-        <w:r>
-          <w:rPr>
-            <w:noProof/>
-            <w:webHidden/>
-          </w:rPr>
-        </w:r>
-        <w:r>
-          <w:rPr>
-            <w:noProof/>
-            <w:webHidden/>
-          </w:rPr>
-          <w:fldChar w:fldCharType="separate"/>
-        </w:r>
-        <w:r>
-          <w:rPr>
-            <w:noProof/>
-            <w:webHidden/>
-          </w:rPr>
-          <w:t>4</w:t>
         </w:r>
         <w:r>
           <w:rPr>
@@ -1567,11 +579,13 @@
           <w:bCs w:val="0"/>
           <w:caps w:val="0"/>
           <w:noProof/>
-          <w:sz w:val="22"/>
-          <w:szCs w:val="22"/>
+          <w:kern w:val="2"/>
+          <w:sz w:val="24"/>
+          <w:szCs w:val="24"/>
+          <w14:ligatures w14:val="standardContextual"/>
         </w:rPr>
       </w:pPr>
-      <w:hyperlink w:anchor="_Toc308526331" w:history="1">
+      <w:hyperlink w:anchor="_Toc240025004" w:history="1">
         <w:r>
           <w:rPr>
             <w:rStyle w:val="Lienhypertexte"/>
@@ -1586,8 +600,10 @@
             <w:bCs w:val="0"/>
             <w:caps w:val="0"/>
             <w:noProof/>
-            <w:sz w:val="22"/>
-            <w:szCs w:val="22"/>
+            <w:kern w:val="2"/>
+            <w:sz w:val="24"/>
+            <w:szCs w:val="24"/>
+            <w14:ligatures w14:val="standardContextual"/>
           </w:rPr>
           <w:tab/>
         </w:r>
@@ -1617,7 +633,7 @@
             <w:noProof/>
             <w:webHidden/>
           </w:rPr>
-          <w:instrText xml:space="preserve"> PAGEREF _Toc308526331 \h </w:instrText>
+          <w:instrText xml:space="preserve"> PAGEREF _Toc240025004 \h </w:instrText>
         </w:r>
         <w:r>
           <w:rPr>
@@ -1637,7 +653,7 @@
             <w:noProof/>
             <w:webHidden/>
           </w:rPr>
-          <w:t>4</w:t>
+          <w:t>3</w:t>
         </w:r>
         <w:r>
           <w:rPr>
@@ -1661,11 +677,13 @@
           <w:bCs w:val="0"/>
           <w:caps w:val="0"/>
           <w:noProof/>
-          <w:sz w:val="22"/>
-          <w:szCs w:val="22"/>
+          <w:kern w:val="2"/>
+          <w:sz w:val="24"/>
+          <w:szCs w:val="24"/>
+          <w14:ligatures w14:val="standardContextual"/>
         </w:rPr>
       </w:pPr>
-      <w:hyperlink w:anchor="_Toc308526332" w:history="1">
+      <w:hyperlink w:anchor="_Toc240025005" w:history="1">
         <w:r>
           <w:rPr>
             <w:rStyle w:val="Lienhypertexte"/>
@@ -1680,8 +698,10 @@
             <w:bCs w:val="0"/>
             <w:caps w:val="0"/>
             <w:noProof/>
-            <w:sz w:val="22"/>
-            <w:szCs w:val="22"/>
+            <w:kern w:val="2"/>
+            <w:sz w:val="24"/>
+            <w:szCs w:val="24"/>
+            <w14:ligatures w14:val="standardContextual"/>
           </w:rPr>
           <w:tab/>
         </w:r>
@@ -1711,7 +731,7 @@
             <w:noProof/>
             <w:webHidden/>
           </w:rPr>
-          <w:instrText xml:space="preserve"> PAGEREF _Toc308526332 \h </w:instrText>
+          <w:instrText xml:space="preserve"> PAGEREF _Toc240025005 \h </w:instrText>
         </w:r>
         <w:r>
           <w:rPr>
@@ -1753,11 +773,13 @@
           <w:rFonts w:eastAsiaTheme="minorEastAsia" w:cstheme="minorBidi"/>
           <w:smallCaps w:val="0"/>
           <w:noProof/>
-          <w:sz w:val="22"/>
-          <w:szCs w:val="22"/>
+          <w:kern w:val="2"/>
+          <w:sz w:val="24"/>
+          <w:szCs w:val="24"/>
+          <w14:ligatures w14:val="standardContextual"/>
         </w:rPr>
       </w:pPr>
-      <w:hyperlink w:anchor="_Toc308526333" w:history="1">
+      <w:hyperlink w:anchor="_Toc240025006" w:history="1">
         <w:r>
           <w:rPr>
             <w:rStyle w:val="Lienhypertexte"/>
@@ -1770,8 +792,10 @@
             <w:rFonts w:eastAsiaTheme="minorEastAsia" w:cstheme="minorBidi"/>
             <w:smallCaps w:val="0"/>
             <w:noProof/>
-            <w:sz w:val="22"/>
-            <w:szCs w:val="22"/>
+            <w:kern w:val="2"/>
+            <w:sz w:val="24"/>
+            <w:szCs w:val="24"/>
+            <w14:ligatures w14:val="standardContextual"/>
           </w:rPr>
           <w:tab/>
         </w:r>
@@ -1780,7 +804,7 @@
             <w:rStyle w:val="Lienhypertexte"/>
             <w:noProof/>
           </w:rPr>
-          <w:t>Opportunités</w:t>
+          <w:t>User story</w:t>
         </w:r>
         <w:r>
           <w:rPr>
@@ -1801,7 +825,7 @@
             <w:noProof/>
             <w:webHidden/>
           </w:rPr>
-          <w:instrText xml:space="preserve"> PAGEREF _Toc308526333 \h </w:instrText>
+          <w:instrText xml:space="preserve"> PAGEREF _Toc240025006 \h </w:instrText>
         </w:r>
         <w:r>
           <w:rPr>
@@ -1834,53 +858,39 @@
     </w:p>
     <w:p>
       <w:pPr>
-        <w:pStyle w:val="TM2"/>
+        <w:pStyle w:val="TM10"/>
         <w:tabs>
-          <w:tab w:val="left" w:pos="800"/>
           <w:tab w:val="right" w:leader="dot" w:pos="9060"/>
         </w:tabs>
         <w:rPr>
           <w:rFonts w:eastAsiaTheme="minorEastAsia" w:cstheme="minorBidi"/>
-          <w:smallCaps w:val="0"/>
+          <w:b w:val="0"/>
+          <w:bCs w:val="0"/>
+          <w:caps w:val="0"/>
           <w:noProof/>
-          <w:sz w:val="22"/>
-          <w:szCs w:val="22"/>
+          <w:kern w:val="2"/>
+          <w:sz w:val="24"/>
+          <w:szCs w:val="24"/>
+          <w14:ligatures w14:val="standardContextual"/>
         </w:rPr>
       </w:pPr>
-      <w:hyperlink w:anchor="_Toc308526334" w:history="1">
+      <w:hyperlink w:anchor="_Toc240025007" w:history="1">
         <w:r>
           <w:rPr>
             <w:rStyle w:val="Lienhypertexte"/>
             <w:noProof/>
           </w:rPr>
-          <w:t>3.2</w:t>
-        </w:r>
-        <w:r>
-          <w:rPr>
-            <w:rFonts w:eastAsiaTheme="minorEastAsia" w:cstheme="minorBidi"/>
-            <w:smallCaps w:val="0"/>
-            <w:noProof/>
-            <w:sz w:val="22"/>
-            <w:szCs w:val="22"/>
+          <w:t>#1 — US 1: Déplacement</w:t>
+        </w:r>
+        <w:r>
+          <w:rPr>
+            <w:noProof/>
+            <w:webHidden/>
           </w:rPr>
           <w:tab/>
         </w:r>
         <w:r>
           <w:rPr>
-            <w:rStyle w:val="Lienhypertexte"/>
-            <w:noProof/>
-          </w:rPr>
-          <w:t>Document d’analyse et conception</w:t>
-        </w:r>
-        <w:r>
-          <w:rPr>
-            <w:noProof/>
-            <w:webHidden/>
-          </w:rPr>
-          <w:tab/>
-        </w:r>
-        <w:r>
-          <w:rPr>
             <w:noProof/>
             <w:webHidden/>
           </w:rPr>
@@ -1891,7 +901,7 @@
             <w:noProof/>
             <w:webHidden/>
           </w:rPr>
-          <w:instrText xml:space="preserve"> PAGEREF _Toc308526334 \h </w:instrText>
+          <w:instrText xml:space="preserve"> PAGEREF _Toc240025007 \h </w:instrText>
         </w:r>
         <w:r>
           <w:rPr>
@@ -1924,53 +934,39 @@
     </w:p>
     <w:p>
       <w:pPr>
-        <w:pStyle w:val="TM2"/>
+        <w:pStyle w:val="TM10"/>
         <w:tabs>
-          <w:tab w:val="left" w:pos="800"/>
           <w:tab w:val="right" w:leader="dot" w:pos="9060"/>
         </w:tabs>
         <w:rPr>
           <w:rFonts w:eastAsiaTheme="minorEastAsia" w:cstheme="minorBidi"/>
-          <w:smallCaps w:val="0"/>
+          <w:b w:val="0"/>
+          <w:bCs w:val="0"/>
+          <w:caps w:val="0"/>
           <w:noProof/>
-          <w:sz w:val="22"/>
-          <w:szCs w:val="22"/>
+          <w:kern w:val="2"/>
+          <w:sz w:val="24"/>
+          <w:szCs w:val="24"/>
+          <w14:ligatures w14:val="standardContextual"/>
         </w:rPr>
       </w:pPr>
-      <w:hyperlink w:anchor="_Toc308526335" w:history="1">
+      <w:hyperlink w:anchor="_Toc240025008" w:history="1">
         <w:r>
           <w:rPr>
             <w:rStyle w:val="Lienhypertexte"/>
             <w:noProof/>
           </w:rPr>
-          <w:t>3.3</w:t>
-        </w:r>
-        <w:r>
-          <w:rPr>
-            <w:rFonts w:eastAsiaTheme="minorEastAsia" w:cstheme="minorBidi"/>
-            <w:smallCaps w:val="0"/>
-            <w:noProof/>
-            <w:sz w:val="22"/>
-            <w:szCs w:val="22"/>
+          <w:t>#2 — US 2: Tir</w:t>
+        </w:r>
+        <w:r>
+          <w:rPr>
+            <w:noProof/>
+            <w:webHidden/>
           </w:rPr>
           <w:tab/>
         </w:r>
         <w:r>
           <w:rPr>
-            <w:rStyle w:val="Lienhypertexte"/>
-            <w:noProof/>
-          </w:rPr>
-          <w:t>Conception des tests</w:t>
-        </w:r>
-        <w:r>
-          <w:rPr>
-            <w:noProof/>
-            <w:webHidden/>
-          </w:rPr>
-          <w:tab/>
-        </w:r>
-        <w:r>
-          <w:rPr>
             <w:noProof/>
             <w:webHidden/>
           </w:rPr>
@@ -1981,7 +977,7 @@
             <w:noProof/>
             <w:webHidden/>
           </w:rPr>
-          <w:instrText xml:space="preserve"> PAGEREF _Toc308526335 \h </w:instrText>
+          <w:instrText xml:space="preserve"> PAGEREF _Toc240025008 \h </w:instrText>
         </w:r>
         <w:r>
           <w:rPr>
@@ -2014,43 +1010,105 @@
     </w:p>
     <w:p>
       <w:pPr>
-        <w:pStyle w:val="TM2"/>
+        <w:pStyle w:val="TM10"/>
         <w:tabs>
-          <w:tab w:val="left" w:pos="800"/>
           <w:tab w:val="right" w:leader="dot" w:pos="9060"/>
         </w:tabs>
         <w:rPr>
           <w:rFonts w:eastAsiaTheme="minorEastAsia" w:cstheme="minorBidi"/>
-          <w:smallCaps w:val="0"/>
+          <w:b w:val="0"/>
+          <w:bCs w:val="0"/>
+          <w:caps w:val="0"/>
           <w:noProof/>
-          <w:sz w:val="22"/>
-          <w:szCs w:val="22"/>
+          <w:kern w:val="2"/>
+          <w:sz w:val="24"/>
+          <w:szCs w:val="24"/>
+          <w14:ligatures w14:val="standardContextual"/>
         </w:rPr>
       </w:pPr>
-      <w:hyperlink w:anchor="_Toc308526336" w:history="1">
+      <w:hyperlink w:anchor="_Toc240025009" w:history="1">
         <w:r>
           <w:rPr>
             <w:rStyle w:val="Lienhypertexte"/>
             <w:noProof/>
           </w:rPr>
-          <w:t>3.4</w:t>
-        </w:r>
-        <w:r>
-          <w:rPr>
-            <w:rFonts w:eastAsiaTheme="minorEastAsia" w:cstheme="minorBidi"/>
-            <w:smallCaps w:val="0"/>
-            <w:noProof/>
-            <w:sz w:val="22"/>
-            <w:szCs w:val="22"/>
+          <w:t>#3 — US 3: Personnage Joueur</w:t>
+        </w:r>
+        <w:r>
+          <w:rPr>
+            <w:noProof/>
+            <w:webHidden/>
           </w:rPr>
           <w:tab/>
         </w:r>
         <w:r>
           <w:rPr>
+            <w:noProof/>
+            <w:webHidden/>
+          </w:rPr>
+          <w:fldChar w:fldCharType="begin"/>
+        </w:r>
+        <w:r>
+          <w:rPr>
+            <w:noProof/>
+            <w:webHidden/>
+          </w:rPr>
+          <w:instrText xml:space="preserve"> PAGEREF _Toc240025009 \h </w:instrText>
+        </w:r>
+        <w:r>
+          <w:rPr>
+            <w:noProof/>
+            <w:webHidden/>
+          </w:rPr>
+        </w:r>
+        <w:r>
+          <w:rPr>
+            <w:noProof/>
+            <w:webHidden/>
+          </w:rPr>
+          <w:fldChar w:fldCharType="separate"/>
+        </w:r>
+        <w:r>
+          <w:rPr>
+            <w:noProof/>
+            <w:webHidden/>
+          </w:rPr>
+          <w:t>6</w:t>
+        </w:r>
+        <w:r>
+          <w:rPr>
+            <w:noProof/>
+            <w:webHidden/>
+          </w:rPr>
+          <w:fldChar w:fldCharType="end"/>
+        </w:r>
+      </w:hyperlink>
+    </w:p>
+    <w:p>
+      <w:pPr>
+        <w:pStyle w:val="TM10"/>
+        <w:tabs>
+          <w:tab w:val="right" w:leader="dot" w:pos="9060"/>
+        </w:tabs>
+        <w:rPr>
+          <w:rFonts w:eastAsiaTheme="minorEastAsia" w:cstheme="minorBidi"/>
+          <w:b w:val="0"/>
+          <w:bCs w:val="0"/>
+          <w:caps w:val="0"/>
+          <w:noProof/>
+          <w:kern w:val="2"/>
+          <w:sz w:val="24"/>
+          <w:szCs w:val="24"/>
+          <w14:ligatures w14:val="standardContextual"/>
+        </w:rPr>
+      </w:pPr>
+      <w:hyperlink w:anchor="_Toc240025010" w:history="1">
+        <w:r>
+          <w:rPr>
             <w:rStyle w:val="Lienhypertexte"/>
             <w:noProof/>
           </w:rPr>
-          <w:t>Planification détaillée</w:t>
+          <w:t>#4 — US 4: Personnage ennemie</w:t>
         </w:r>
         <w:r>
           <w:rPr>
@@ -2071,7 +1129,7 @@
             <w:noProof/>
             <w:webHidden/>
           </w:rPr>
-          <w:instrText xml:space="preserve"> PAGEREF _Toc308526336 \h </w:instrText>
+          <w:instrText xml:space="preserve"> PAGEREF _Toc240025010 \h </w:instrText>
         </w:r>
         <w:r>
           <w:rPr>
@@ -2091,7 +1149,159 @@
             <w:noProof/>
             <w:webHidden/>
           </w:rPr>
-          <w:t>5</w:t>
+          <w:t>7</w:t>
+        </w:r>
+        <w:r>
+          <w:rPr>
+            <w:noProof/>
+            <w:webHidden/>
+          </w:rPr>
+          <w:fldChar w:fldCharType="end"/>
+        </w:r>
+      </w:hyperlink>
+    </w:p>
+    <w:p>
+      <w:pPr>
+        <w:pStyle w:val="TM10"/>
+        <w:tabs>
+          <w:tab w:val="right" w:leader="dot" w:pos="9060"/>
+        </w:tabs>
+        <w:rPr>
+          <w:rFonts w:eastAsiaTheme="minorEastAsia" w:cstheme="minorBidi"/>
+          <w:b w:val="0"/>
+          <w:bCs w:val="0"/>
+          <w:caps w:val="0"/>
+          <w:noProof/>
+          <w:kern w:val="2"/>
+          <w:sz w:val="24"/>
+          <w:szCs w:val="24"/>
+          <w14:ligatures w14:val="standardContextual"/>
+        </w:rPr>
+      </w:pPr>
+      <w:hyperlink w:anchor="_Toc240025011" w:history="1">
+        <w:r>
+          <w:rPr>
+            <w:rStyle w:val="Lienhypertexte"/>
+            <w:noProof/>
+          </w:rPr>
+          <w:t>#5 — US 5: Barrière</w:t>
+        </w:r>
+        <w:r>
+          <w:rPr>
+            <w:noProof/>
+            <w:webHidden/>
+          </w:rPr>
+          <w:tab/>
+        </w:r>
+        <w:r>
+          <w:rPr>
+            <w:noProof/>
+            <w:webHidden/>
+          </w:rPr>
+          <w:fldChar w:fldCharType="begin"/>
+        </w:r>
+        <w:r>
+          <w:rPr>
+            <w:noProof/>
+            <w:webHidden/>
+          </w:rPr>
+          <w:instrText xml:space="preserve"> PAGEREF _Toc240025011 \h </w:instrText>
+        </w:r>
+        <w:r>
+          <w:rPr>
+            <w:noProof/>
+            <w:webHidden/>
+          </w:rPr>
+        </w:r>
+        <w:r>
+          <w:rPr>
+            <w:noProof/>
+            <w:webHidden/>
+          </w:rPr>
+          <w:fldChar w:fldCharType="separate"/>
+        </w:r>
+        <w:r>
+          <w:rPr>
+            <w:noProof/>
+            <w:webHidden/>
+          </w:rPr>
+          <w:t>8</w:t>
+        </w:r>
+        <w:r>
+          <w:rPr>
+            <w:noProof/>
+            <w:webHidden/>
+          </w:rPr>
+          <w:fldChar w:fldCharType="end"/>
+        </w:r>
+      </w:hyperlink>
+    </w:p>
+    <w:p>
+      <w:pPr>
+        <w:pStyle w:val="TM10"/>
+        <w:tabs>
+          <w:tab w:val="right" w:leader="dot" w:pos="9060"/>
+        </w:tabs>
+        <w:rPr>
+          <w:rFonts w:eastAsiaTheme="minorEastAsia" w:cstheme="minorBidi"/>
+          <w:b w:val="0"/>
+          <w:bCs w:val="0"/>
+          <w:caps w:val="0"/>
+          <w:noProof/>
+          <w:kern w:val="2"/>
+          <w:sz w:val="24"/>
+          <w:szCs w:val="24"/>
+          <w14:ligatures w14:val="standardContextual"/>
+        </w:rPr>
+      </w:pPr>
+      <w:hyperlink w:anchor="_Toc240025012" w:history="1">
+        <w:r>
+          <w:rPr>
+            <w:rStyle w:val="Lienhypertexte"/>
+            <w:noProof/>
+          </w:rPr>
+          <w:t>#6 — US 6: Vague</w:t>
+        </w:r>
+        <w:r>
+          <w:rPr>
+            <w:noProof/>
+            <w:webHidden/>
+          </w:rPr>
+          <w:tab/>
+        </w:r>
+        <w:r>
+          <w:rPr>
+            <w:noProof/>
+            <w:webHidden/>
+          </w:rPr>
+          <w:fldChar w:fldCharType="begin"/>
+        </w:r>
+        <w:r>
+          <w:rPr>
+            <w:noProof/>
+            <w:webHidden/>
+          </w:rPr>
+          <w:instrText xml:space="preserve"> PAGEREF _Toc240025012 \h </w:instrText>
+        </w:r>
+        <w:r>
+          <w:rPr>
+            <w:noProof/>
+            <w:webHidden/>
+          </w:rPr>
+        </w:r>
+        <w:r>
+          <w:rPr>
+            <w:noProof/>
+            <w:webHidden/>
+          </w:rPr>
+          <w:fldChar w:fldCharType="separate"/>
+        </w:r>
+        <w:r>
+          <w:rPr>
+            <w:noProof/>
+            <w:webHidden/>
+          </w:rPr>
+          <w:t>9</w:t>
         </w:r>
         <w:r>
           <w:rPr>
@@ -2115,11 +1325,13 @@
           <w:bCs w:val="0"/>
           <w:caps w:val="0"/>
           <w:noProof/>
-          <w:sz w:val="22"/>
-          <w:szCs w:val="22"/>
+          <w:kern w:val="2"/>
+          <w:sz w:val="24"/>
+          <w:szCs w:val="24"/>
+          <w14:ligatures w14:val="standardContextual"/>
         </w:rPr>
       </w:pPr>
-      <w:hyperlink w:anchor="_Toc308526337" w:history="1">
+      <w:hyperlink w:anchor="_Toc240025013" w:history="1">
         <w:r>
           <w:rPr>
             <w:rStyle w:val="Lienhypertexte"/>
@@ -2134,8 +1346,10 @@
             <w:bCs w:val="0"/>
             <w:caps w:val="0"/>
             <w:noProof/>
-            <w:sz w:val="22"/>
-            <w:szCs w:val="22"/>
+            <w:kern w:val="2"/>
+            <w:sz w:val="24"/>
+            <w:szCs w:val="24"/>
+            <w14:ligatures w14:val="standardContextual"/>
           </w:rPr>
           <w:tab/>
         </w:r>
@@ -2165,7 +1379,7 @@
             <w:noProof/>
             <w:webHidden/>
           </w:rPr>
-          <w:instrText xml:space="preserve"> PAGEREF _Toc308526337 \h </w:instrText>
+          <w:instrText xml:space="preserve"> PAGEREF _Toc240025013 \h </w:instrText>
         </w:r>
         <w:r>
           <w:rPr>
@@ -2185,7 +1399,7 @@
             <w:noProof/>
             <w:webHidden/>
           </w:rPr>
-          <w:t>5</w:t>
+          <w:t>9</w:t>
         </w:r>
         <w:r>
           <w:rPr>
@@ -2207,11 +1421,13 @@
           <w:rFonts w:eastAsiaTheme="minorEastAsia" w:cstheme="minorBidi"/>
           <w:smallCaps w:val="0"/>
           <w:noProof/>
-          <w:sz w:val="22"/>
-          <w:szCs w:val="22"/>
+          <w:kern w:val="2"/>
+          <w:sz w:val="24"/>
+          <w:szCs w:val="24"/>
+          <w14:ligatures w14:val="standardContextual"/>
         </w:rPr>
       </w:pPr>
-      <w:hyperlink w:anchor="_Toc308526338" w:history="1">
+      <w:hyperlink w:anchor="_Toc240025014" w:history="1">
         <w:r>
           <w:rPr>
             <w:rStyle w:val="Lienhypertexte"/>
@@ -2224,8 +1440,10 @@
             <w:rFonts w:eastAsiaTheme="minorEastAsia" w:cstheme="minorBidi"/>
             <w:smallCaps w:val="0"/>
             <w:noProof/>
-            <w:sz w:val="22"/>
-            <w:szCs w:val="22"/>
+            <w:kern w:val="2"/>
+            <w:sz w:val="24"/>
+            <w:szCs w:val="24"/>
+            <w14:ligatures w14:val="standardContextual"/>
           </w:rPr>
           <w:tab/>
         </w:r>
@@ -2255,7 +1473,7 @@
             <w:noProof/>
             <w:webHidden/>
           </w:rPr>
-          <w:instrText xml:space="preserve"> PAGEREF _Toc308526338 \h </w:instrText>
+          <w:instrText xml:space="preserve"> PAGEREF _Toc240025014 \h </w:instrText>
         </w:r>
         <w:r>
           <w:rPr>
@@ -2275,7 +1493,7 @@
             <w:noProof/>
             <w:webHidden/>
           </w:rPr>
-          <w:t>5</w:t>
+          <w:t>9</w:t>
         </w:r>
         <w:r>
           <w:rPr>
@@ -2297,11 +1515,13 @@
           <w:rFonts w:eastAsiaTheme="minorEastAsia" w:cstheme="minorBidi"/>
           <w:smallCaps w:val="0"/>
           <w:noProof/>
-          <w:sz w:val="22"/>
-          <w:szCs w:val="22"/>
+          <w:kern w:val="2"/>
+          <w:sz w:val="24"/>
+          <w:szCs w:val="24"/>
+          <w14:ligatures w14:val="standardContextual"/>
         </w:rPr>
       </w:pPr>
-      <w:hyperlink w:anchor="_Toc308526339" w:history="1">
+      <w:hyperlink w:anchor="_Toc240025015" w:history="1">
         <w:r>
           <w:rPr>
             <w:rStyle w:val="Lienhypertexte"/>
@@ -2314,8 +1534,10 @@
             <w:rFonts w:eastAsiaTheme="minorEastAsia" w:cstheme="minorBidi"/>
             <w:smallCaps w:val="0"/>
             <w:noProof/>
-            <w:sz w:val="22"/>
-            <w:szCs w:val="22"/>
+            <w:kern w:val="2"/>
+            <w:sz w:val="24"/>
+            <w:szCs w:val="24"/>
+            <w14:ligatures w14:val="standardContextual"/>
           </w:rPr>
           <w:tab/>
         </w:r>
@@ -2345,7 +1567,7 @@
             <w:noProof/>
             <w:webHidden/>
           </w:rPr>
-          <w:instrText xml:space="preserve"> PAGEREF _Toc308526339 \h </w:instrText>
+          <w:instrText xml:space="preserve"> PAGEREF _Toc240025015 \h </w:instrText>
         </w:r>
         <w:r>
           <w:rPr>
@@ -2365,7 +1587,7 @@
             <w:noProof/>
             <w:webHidden/>
           </w:rPr>
-          <w:t>5</w:t>
+          <w:t>9</w:t>
         </w:r>
         <w:r>
           <w:rPr>
@@ -2389,11 +1611,13 @@
           <w:bCs w:val="0"/>
           <w:caps w:val="0"/>
           <w:noProof/>
-          <w:sz w:val="22"/>
-          <w:szCs w:val="22"/>
+          <w:kern w:val="2"/>
+          <w:sz w:val="24"/>
+          <w:szCs w:val="24"/>
+          <w14:ligatures w14:val="standardContextual"/>
         </w:rPr>
       </w:pPr>
-      <w:hyperlink w:anchor="_Toc308526340" w:history="1">
+      <w:hyperlink w:anchor="_Toc240025016" w:history="1">
         <w:r>
           <w:rPr>
             <w:rStyle w:val="Lienhypertexte"/>
@@ -2408,8 +1632,10 @@
             <w:bCs w:val="0"/>
             <w:caps w:val="0"/>
             <w:noProof/>
-            <w:sz w:val="22"/>
-            <w:szCs w:val="22"/>
+            <w:kern w:val="2"/>
+            <w:sz w:val="24"/>
+            <w:szCs w:val="24"/>
+            <w14:ligatures w14:val="standardContextual"/>
           </w:rPr>
           <w:tab/>
         </w:r>
@@ -2439,7 +1665,7 @@
             <w:noProof/>
             <w:webHidden/>
           </w:rPr>
-          <w:instrText xml:space="preserve"> PAGEREF _Toc308526340 \h </w:instrText>
+          <w:instrText xml:space="preserve"> PAGEREF _Toc240025016 \h </w:instrText>
         </w:r>
         <w:r>
           <w:rPr>
@@ -2459,7 +1685,7 @@
             <w:noProof/>
             <w:webHidden/>
           </w:rPr>
-          <w:t>5</w:t>
+          <w:t>9</w:t>
         </w:r>
         <w:r>
           <w:rPr>
@@ -2481,11 +1707,13 @@
           <w:rFonts w:eastAsiaTheme="minorEastAsia" w:cstheme="minorBidi"/>
           <w:smallCaps w:val="0"/>
           <w:noProof/>
-          <w:sz w:val="22"/>
-          <w:szCs w:val="22"/>
+          <w:kern w:val="2"/>
+          <w:sz w:val="24"/>
+          <w:szCs w:val="24"/>
+          <w14:ligatures w14:val="standardContextual"/>
         </w:rPr>
       </w:pPr>
-      <w:hyperlink w:anchor="_Toc308526341" w:history="1">
+      <w:hyperlink w:anchor="_Toc240025017" w:history="1">
         <w:r>
           <w:rPr>
             <w:rStyle w:val="Lienhypertexte"/>
@@ -2498,8 +1726,10 @@
             <w:rFonts w:eastAsiaTheme="minorEastAsia" w:cstheme="minorBidi"/>
             <w:smallCaps w:val="0"/>
             <w:noProof/>
-            <w:sz w:val="22"/>
-            <w:szCs w:val="22"/>
+            <w:kern w:val="2"/>
+            <w:sz w:val="24"/>
+            <w:szCs w:val="24"/>
+            <w14:ligatures w14:val="standardContextual"/>
           </w:rPr>
           <w:tab/>
         </w:r>
@@ -2529,7 +1759,7 @@
             <w:noProof/>
             <w:webHidden/>
           </w:rPr>
-          <w:instrText xml:space="preserve"> PAGEREF _Toc308526341 \h </w:instrText>
+          <w:instrText xml:space="preserve"> PAGEREF _Toc240025017 \h </w:instrText>
         </w:r>
         <w:r>
           <w:rPr>
@@ -2549,7 +1779,7 @@
             <w:noProof/>
             <w:webHidden/>
           </w:rPr>
-          <w:t>5</w:t>
+          <w:t>9</w:t>
         </w:r>
         <w:r>
           <w:rPr>
@@ -2573,11 +1803,13 @@
           <w:bCs w:val="0"/>
           <w:caps w:val="0"/>
           <w:noProof/>
-          <w:sz w:val="22"/>
-          <w:szCs w:val="22"/>
+          <w:kern w:val="2"/>
+          <w:sz w:val="24"/>
+          <w:szCs w:val="24"/>
+          <w14:ligatures w14:val="standardContextual"/>
         </w:rPr>
       </w:pPr>
-      <w:hyperlink w:anchor="_Toc308526342" w:history="1">
+      <w:hyperlink w:anchor="_Toc240025018" w:history="1">
         <w:r>
           <w:rPr>
             <w:rStyle w:val="Lienhypertexte"/>
@@ -2592,8 +1824,10 @@
             <w:bCs w:val="0"/>
             <w:caps w:val="0"/>
             <w:noProof/>
-            <w:sz w:val="22"/>
-            <w:szCs w:val="22"/>
+            <w:kern w:val="2"/>
+            <w:sz w:val="24"/>
+            <w:szCs w:val="24"/>
+            <w14:ligatures w14:val="standardContextual"/>
           </w:rPr>
           <w:tab/>
         </w:r>
@@ -2623,7 +1857,7 @@
             <w:noProof/>
             <w:webHidden/>
           </w:rPr>
-          <w:instrText xml:space="preserve"> PAGEREF _Toc308526342 \h </w:instrText>
+          <w:instrText xml:space="preserve"> PAGEREF _Toc240025018 \h </w:instrText>
         </w:r>
         <w:r>
           <w:rPr>
@@ -2643,7 +1877,7 @@
             <w:noProof/>
             <w:webHidden/>
           </w:rPr>
-          <w:t>5</w:t>
+          <w:t>10</w:t>
         </w:r>
         <w:r>
           <w:rPr>
@@ -2665,11 +1899,13 @@
           <w:rFonts w:eastAsiaTheme="minorEastAsia" w:cstheme="minorBidi"/>
           <w:smallCaps w:val="0"/>
           <w:noProof/>
-          <w:sz w:val="22"/>
-          <w:szCs w:val="22"/>
+          <w:kern w:val="2"/>
+          <w:sz w:val="24"/>
+          <w:szCs w:val="24"/>
+          <w14:ligatures w14:val="standardContextual"/>
         </w:rPr>
       </w:pPr>
-      <w:hyperlink w:anchor="_Toc308526343" w:history="1">
+      <w:hyperlink w:anchor="_Toc240025019" w:history="1">
         <w:r>
           <w:rPr>
             <w:rStyle w:val="Lienhypertexte"/>
@@ -2682,8 +1918,10 @@
             <w:rFonts w:eastAsiaTheme="minorEastAsia" w:cstheme="minorBidi"/>
             <w:smallCaps w:val="0"/>
             <w:noProof/>
-            <w:sz w:val="22"/>
-            <w:szCs w:val="22"/>
+            <w:kern w:val="2"/>
+            <w:sz w:val="24"/>
+            <w:szCs w:val="24"/>
+            <w14:ligatures w14:val="standardContextual"/>
           </w:rPr>
           <w:tab/>
         </w:r>
@@ -2713,7 +1951,7 @@
             <w:noProof/>
             <w:webHidden/>
           </w:rPr>
-          <w:instrText xml:space="preserve"> PAGEREF _Toc308526343 \h </w:instrText>
+          <w:instrText xml:space="preserve"> PAGEREF _Toc240025019 \h </w:instrText>
         </w:r>
         <w:r>
           <w:rPr>
@@ -2733,7 +1971,7 @@
             <w:noProof/>
             <w:webHidden/>
           </w:rPr>
-          <w:t>5</w:t>
+          <w:t>10</w:t>
         </w:r>
         <w:r>
           <w:rPr>
@@ -2755,11 +1993,13 @@
           <w:rFonts w:eastAsiaTheme="minorEastAsia" w:cstheme="minorBidi"/>
           <w:smallCaps w:val="0"/>
           <w:noProof/>
-          <w:sz w:val="22"/>
-          <w:szCs w:val="22"/>
+          <w:kern w:val="2"/>
+          <w:sz w:val="24"/>
+          <w:szCs w:val="24"/>
+          <w14:ligatures w14:val="standardContextual"/>
         </w:rPr>
       </w:pPr>
-      <w:hyperlink w:anchor="_Toc308526344" w:history="1">
+      <w:hyperlink w:anchor="_Toc240025020" w:history="1">
         <w:r>
           <w:rPr>
             <w:rStyle w:val="Lienhypertexte"/>
@@ -2772,8 +2012,10 @@
             <w:rFonts w:eastAsiaTheme="minorEastAsia" w:cstheme="minorBidi"/>
             <w:smallCaps w:val="0"/>
             <w:noProof/>
-            <w:sz w:val="22"/>
-            <w:szCs w:val="22"/>
+            <w:kern w:val="2"/>
+            <w:sz w:val="24"/>
+            <w:szCs w:val="24"/>
+            <w14:ligatures w14:val="standardContextual"/>
           </w:rPr>
           <w:tab/>
         </w:r>
@@ -2803,7 +2045,7 @@
             <w:noProof/>
             <w:webHidden/>
           </w:rPr>
-          <w:instrText xml:space="preserve"> PAGEREF _Toc308526344 \h </w:instrText>
+          <w:instrText xml:space="preserve"> PAGEREF _Toc240025020 \h </w:instrText>
         </w:r>
         <w:r>
           <w:rPr>
@@ -2823,7 +2065,7 @@
             <w:noProof/>
             <w:webHidden/>
           </w:rPr>
-          <w:t>5</w:t>
+          <w:t>10</w:t>
         </w:r>
         <w:r>
           <w:rPr>
@@ -2845,11 +2087,13 @@
           <w:rFonts w:eastAsiaTheme="minorEastAsia" w:cstheme="minorBidi"/>
           <w:smallCaps w:val="0"/>
           <w:noProof/>
-          <w:sz w:val="22"/>
-          <w:szCs w:val="22"/>
+          <w:kern w:val="2"/>
+          <w:sz w:val="24"/>
+          <w:szCs w:val="24"/>
+          <w14:ligatures w14:val="standardContextual"/>
         </w:rPr>
       </w:pPr>
-      <w:hyperlink w:anchor="_Toc308526345" w:history="1">
+      <w:hyperlink w:anchor="_Toc240025021" w:history="1">
         <w:r>
           <w:rPr>
             <w:rStyle w:val="Lienhypertexte"/>
@@ -2862,8 +2106,10 @@
             <w:rFonts w:eastAsiaTheme="minorEastAsia" w:cstheme="minorBidi"/>
             <w:smallCaps w:val="0"/>
             <w:noProof/>
-            <w:sz w:val="22"/>
-            <w:szCs w:val="22"/>
+            <w:kern w:val="2"/>
+            <w:sz w:val="24"/>
+            <w:szCs w:val="24"/>
+            <w14:ligatures w14:val="standardContextual"/>
           </w:rPr>
           <w:tab/>
         </w:r>
@@ -2893,7 +2139,7 @@
             <w:noProof/>
             <w:webHidden/>
           </w:rPr>
-          <w:instrText xml:space="preserve"> PAGEREF _Toc308526345 \h </w:instrText>
+          <w:instrText xml:space="preserve"> PAGEREF _Toc240025021 \h </w:instrText>
         </w:r>
         <w:r>
           <w:rPr>
@@ -2913,7 +2159,7 @@
             <w:noProof/>
             <w:webHidden/>
           </w:rPr>
-          <w:t>5</w:t>
+          <w:t>10</w:t>
         </w:r>
         <w:r>
           <w:rPr>
@@ -2937,11 +2183,13 @@
           <w:bCs w:val="0"/>
           <w:caps w:val="0"/>
           <w:noProof/>
-          <w:sz w:val="22"/>
-          <w:szCs w:val="22"/>
+          <w:kern w:val="2"/>
+          <w:sz w:val="24"/>
+          <w:szCs w:val="24"/>
+          <w14:ligatures w14:val="standardContextual"/>
         </w:rPr>
       </w:pPr>
-      <w:hyperlink w:anchor="_Toc308526346" w:history="1">
+      <w:hyperlink w:anchor="_Toc240025022" w:history="1">
         <w:r>
           <w:rPr>
             <w:rStyle w:val="Lienhypertexte"/>
@@ -2956,8 +2204,10 @@
             <w:bCs w:val="0"/>
             <w:caps w:val="0"/>
             <w:noProof/>
-            <w:sz w:val="22"/>
-            <w:szCs w:val="22"/>
+            <w:kern w:val="2"/>
+            <w:sz w:val="24"/>
+            <w:szCs w:val="24"/>
+            <w14:ligatures w14:val="standardContextual"/>
           </w:rPr>
           <w:tab/>
         </w:r>
@@ -2987,7 +2237,7 @@
             <w:noProof/>
             <w:webHidden/>
           </w:rPr>
-          <w:instrText xml:space="preserve"> PAGEREF _Toc308526346 \h </w:instrText>
+          <w:instrText xml:space="preserve"> PAGEREF _Toc240025022 \h </w:instrText>
         </w:r>
         <w:r>
           <w:rPr>
@@ -3007,7 +2257,7 @@
             <w:noProof/>
             <w:webHidden/>
           </w:rPr>
-          <w:t>6</w:t>
+          <w:t>10</w:t>
         </w:r>
         <w:r>
           <w:rPr>
@@ -3029,11 +2279,13 @@
           <w:rFonts w:eastAsiaTheme="minorEastAsia" w:cstheme="minorBidi"/>
           <w:smallCaps w:val="0"/>
           <w:noProof/>
-          <w:sz w:val="22"/>
-          <w:szCs w:val="22"/>
+          <w:kern w:val="2"/>
+          <w:sz w:val="24"/>
+          <w:szCs w:val="24"/>
+          <w14:ligatures w14:val="standardContextual"/>
         </w:rPr>
       </w:pPr>
-      <w:hyperlink w:anchor="_Toc308526347" w:history="1">
+      <w:hyperlink w:anchor="_Toc240025023" w:history="1">
         <w:r>
           <w:rPr>
             <w:rStyle w:val="Lienhypertexte"/>
@@ -3046,8 +2298,10 @@
             <w:rFonts w:eastAsiaTheme="minorEastAsia" w:cstheme="minorBidi"/>
             <w:smallCaps w:val="0"/>
             <w:noProof/>
-            <w:sz w:val="22"/>
-            <w:szCs w:val="22"/>
+            <w:kern w:val="2"/>
+            <w:sz w:val="24"/>
+            <w:szCs w:val="24"/>
+            <w14:ligatures w14:val="standardContextual"/>
           </w:rPr>
           <w:tab/>
         </w:r>
@@ -3077,7 +2331,7 @@
             <w:noProof/>
             <w:webHidden/>
           </w:rPr>
-          <w:instrText xml:space="preserve"> PAGEREF _Toc308526347 \h </w:instrText>
+          <w:instrText xml:space="preserve"> PAGEREF _Toc240025023 \h </w:instrText>
         </w:r>
         <w:r>
           <w:rPr>
@@ -3097,7 +2351,7 @@
             <w:noProof/>
             <w:webHidden/>
           </w:rPr>
-          <w:t>6</w:t>
+          <w:t>10</w:t>
         </w:r>
         <w:r>
           <w:rPr>
@@ -3119,11 +2373,13 @@
           <w:rFonts w:eastAsiaTheme="minorEastAsia" w:cstheme="minorBidi"/>
           <w:smallCaps w:val="0"/>
           <w:noProof/>
-          <w:sz w:val="22"/>
-          <w:szCs w:val="22"/>
+          <w:kern w:val="2"/>
+          <w:sz w:val="24"/>
+          <w:szCs w:val="24"/>
+          <w14:ligatures w14:val="standardContextual"/>
         </w:rPr>
       </w:pPr>
-      <w:hyperlink w:anchor="_Toc308526348" w:history="1">
+      <w:hyperlink w:anchor="_Toc240025024" w:history="1">
         <w:r>
           <w:rPr>
             <w:rStyle w:val="Lienhypertexte"/>
@@ -3136,8 +2392,10 @@
             <w:rFonts w:eastAsiaTheme="minorEastAsia" w:cstheme="minorBidi"/>
             <w:smallCaps w:val="0"/>
             <w:noProof/>
-            <w:sz w:val="22"/>
-            <w:szCs w:val="22"/>
+            <w:kern w:val="2"/>
+            <w:sz w:val="24"/>
+            <w:szCs w:val="24"/>
+            <w14:ligatures w14:val="standardContextual"/>
           </w:rPr>
           <w:tab/>
         </w:r>
@@ -3167,7 +2425,7 @@
             <w:noProof/>
             <w:webHidden/>
           </w:rPr>
-          <w:instrText xml:space="preserve"> PAGEREF _Toc308526348 \h </w:instrText>
+          <w:instrText xml:space="preserve"> PAGEREF _Toc240025024 \h </w:instrText>
         </w:r>
         <w:r>
           <w:rPr>
@@ -3187,7 +2445,7 @@
             <w:noProof/>
             <w:webHidden/>
           </w:rPr>
-          <w:t>6</w:t>
+          <w:t>10</w:t>
         </w:r>
         <w:r>
           <w:rPr>
@@ -3209,11 +2467,13 @@
           <w:rFonts w:eastAsiaTheme="minorEastAsia" w:cstheme="minorBidi"/>
           <w:smallCaps w:val="0"/>
           <w:noProof/>
-          <w:sz w:val="22"/>
-          <w:szCs w:val="22"/>
+          <w:kern w:val="2"/>
+          <w:sz w:val="24"/>
+          <w:szCs w:val="24"/>
+          <w14:ligatures w14:val="standardContextual"/>
         </w:rPr>
       </w:pPr>
-      <w:hyperlink w:anchor="_Toc308526349" w:history="1">
+      <w:hyperlink w:anchor="_Toc240025025" w:history="1">
         <w:r>
           <w:rPr>
             <w:rStyle w:val="Lienhypertexte"/>
@@ -3226,8 +2486,10 @@
             <w:rFonts w:eastAsiaTheme="minorEastAsia" w:cstheme="minorBidi"/>
             <w:smallCaps w:val="0"/>
             <w:noProof/>
-            <w:sz w:val="22"/>
-            <w:szCs w:val="22"/>
+            <w:kern w:val="2"/>
+            <w:sz w:val="24"/>
+            <w:szCs w:val="24"/>
+            <w14:ligatures w14:val="standardContextual"/>
           </w:rPr>
           <w:tab/>
         </w:r>
@@ -3257,7 +2519,7 @@
             <w:noProof/>
             <w:webHidden/>
           </w:rPr>
-          <w:instrText xml:space="preserve"> PAGEREF _Toc308526349 \h </w:instrText>
+          <w:instrText xml:space="preserve"> PAGEREF _Toc240025025 \h </w:instrText>
         </w:r>
         <w:r>
           <w:rPr>
@@ -3277,7 +2539,7 @@
             <w:noProof/>
             <w:webHidden/>
           </w:rPr>
-          <w:t>6</w:t>
+          <w:t>10</w:t>
         </w:r>
         <w:r>
           <w:rPr>
@@ -3301,11 +2563,13 @@
           <w:bCs w:val="0"/>
           <w:caps w:val="0"/>
           <w:noProof/>
-          <w:sz w:val="22"/>
-          <w:szCs w:val="22"/>
+          <w:kern w:val="2"/>
+          <w:sz w:val="24"/>
+          <w:szCs w:val="24"/>
+          <w14:ligatures w14:val="standardContextual"/>
         </w:rPr>
       </w:pPr>
-      <w:hyperlink w:anchor="_Toc308526350" w:history="1">
+      <w:hyperlink w:anchor="_Toc240025026" w:history="1">
         <w:r>
           <w:rPr>
             <w:rStyle w:val="Lienhypertexte"/>
@@ -3320,8 +2584,10 @@
             <w:bCs w:val="0"/>
             <w:caps w:val="0"/>
             <w:noProof/>
-            <w:sz w:val="22"/>
-            <w:szCs w:val="22"/>
+            <w:kern w:val="2"/>
+            <w:sz w:val="24"/>
+            <w:szCs w:val="24"/>
+            <w14:ligatures w14:val="standardContextual"/>
           </w:rPr>
           <w:tab/>
         </w:r>
@@ -3351,7 +2617,7 @@
             <w:noProof/>
             <w:webHidden/>
           </w:rPr>
-          <w:instrText xml:space="preserve"> PAGEREF _Toc308526350 \h </w:instrText>
+          <w:instrText xml:space="preserve"> PAGEREF _Toc240025026 \h </w:instrText>
         </w:r>
         <w:r>
           <w:rPr>
@@ -3371,7 +2637,7 @@
             <w:noProof/>
             <w:webHidden/>
           </w:rPr>
-          <w:t>6</w:t>
+          <w:t>10</w:t>
         </w:r>
         <w:r>
           <w:rPr>
@@ -3402,10 +2668,12 @@
       <w:pPr>
         <w:pStyle w:val="Titre1"/>
       </w:pPr>
+      <w:bookmarkStart w:id="0" w:name="_Toc240025000"/>
       <w:r>
         <w:lastRenderedPageBreak/>
         <w:t>Introduction</w:t>
       </w:r>
+      <w:bookmarkEnd w:id="0"/>
     </w:p>
     <w:p>
       <w:pPr>
@@ -3416,9 +2684,9 @@
       <w:pPr>
         <w:pStyle w:val="Titre2"/>
       </w:pPr>
-      <w:bookmarkStart w:id="0" w:name="_Toc308526317"/>
       <w:bookmarkStart w:id="1" w:name="_Toc532179969"/>
       <w:bookmarkStart w:id="2" w:name="_Toc165969639"/>
+      <w:bookmarkStart w:id="3" w:name="_Toc240025001"/>
       <w:r>
         <w:t>T</w:t>
       </w:r>
@@ -3428,7 +2696,7 @@
       <w:r>
         <w:t>e</w:t>
       </w:r>
-      <w:bookmarkEnd w:id="0"/>
+      <w:bookmarkEnd w:id="3"/>
     </w:p>
     <w:p>
       <w:pPr>
@@ -3439,8 +2707,13 @@
       <w:pPr>
         <w:ind w:left="1134"/>
       </w:pPr>
-      <w:r>
-        <w:t>Shoot’em up</w:t>
+      <w:proofErr w:type="spellStart"/>
+      <w:r>
+        <w:t>Shoot’em</w:t>
+      </w:r>
+      <w:proofErr w:type="spellEnd"/>
+      <w:r>
+        <w:t xml:space="preserve"> up</w:t>
       </w:r>
     </w:p>
     <w:p>
@@ -3452,9 +2725,11 @@
       <w:pPr>
         <w:pStyle w:val="Titre2"/>
       </w:pPr>
+      <w:bookmarkStart w:id="4" w:name="_Toc240025002"/>
       <w:r>
         <w:t>Objectifs produit</w:t>
       </w:r>
+      <w:bookmarkEnd w:id="4"/>
     </w:p>
     <w:p>
       <w:pPr>
@@ -3472,13 +2747,37 @@
         <w:t>créer</w:t>
       </w:r>
       <w:r>
-        <w:t xml:space="preserve"> un jeu dans le genre shoot ‘em up. J’ai </w:t>
+        <w:t xml:space="preserve"> un jeu dans le genre shoot ‘</w:t>
+      </w:r>
+      <w:proofErr w:type="spellStart"/>
+      <w:r>
+        <w:t>em</w:t>
+      </w:r>
+      <w:proofErr w:type="spellEnd"/>
+      <w:r>
+        <w:t xml:space="preserve"> up. J’ai </w:t>
       </w:r>
       <w:r>
         <w:t>choisi</w:t>
       </w:r>
       <w:r>
-        <w:t xml:space="preserve"> le thème de l’anime tensura. Le jeu se déroulera avec le joueur en tant que slime tirant des</w:t>
+        <w:t xml:space="preserve"> le thème de l’anime </w:t>
+      </w:r>
+      <w:proofErr w:type="spellStart"/>
+      <w:r>
+        <w:t>tensura</w:t>
+      </w:r>
+      <w:proofErr w:type="spellEnd"/>
+      <w:r>
+        <w:t xml:space="preserve">. Le jeu se déroulera avec le joueur en tant que </w:t>
+      </w:r>
+      <w:proofErr w:type="spellStart"/>
+      <w:r>
+        <w:t>slime</w:t>
+      </w:r>
+      <w:proofErr w:type="spellEnd"/>
+      <w:r>
+        <w:t xml:space="preserve"> tirant des</w:t>
       </w:r>
       <w:r>
         <w:t xml:space="preserve"> projectiles sur des loups pour les tués. Il pourra se protéger à l’aide de barricade présente sur le terrain. Il mourra après un certain nombre de fois qu’il aura été touché par les loups. Le joueur gagnera après avoir battu 3 vagues de loup avec une puissance exponentiel.</w:t>
@@ -3493,9 +2792,11 @@
       <w:pPr>
         <w:pStyle w:val="Titre2"/>
       </w:pPr>
+      <w:bookmarkStart w:id="5" w:name="_Toc240025003"/>
       <w:r>
         <w:t>Objectifs pédagogiques</w:t>
       </w:r>
+      <w:bookmarkEnd w:id="5"/>
     </w:p>
     <w:p>
       <w:pPr>
@@ -3519,7 +2820,7 @@
       <w:pPr>
         <w:pStyle w:val="Titre1"/>
       </w:pPr>
-      <w:bookmarkStart w:id="3" w:name="_Toc308526331"/>
+      <w:bookmarkStart w:id="6" w:name="_Toc240025004"/>
       <w:r>
         <w:t>Planification</w:t>
       </w:r>
@@ -3528,7 +2829,7 @@
       <w:r>
         <w:t xml:space="preserve"> Initiale</w:t>
       </w:r>
-      <w:bookmarkEnd w:id="3"/>
+      <w:bookmarkEnd w:id="6"/>
     </w:p>
     <w:tbl>
       <w:tblPr>
@@ -3579,10 +2880,7 @@
               <w:t>.</w:t>
             </w:r>
             <w:r>
-              <w:t xml:space="preserve"> </w:t>
-            </w:r>
-            <w:r>
-              <w:t>Et le rapport.</w:t>
+              <w:t xml:space="preserve"> Et le rapport.</w:t>
             </w:r>
           </w:p>
         </w:tc>
@@ -3607,145 +2905,7 @@
           </w:tcPr>
           <w:p>
             <w:r>
-              <w:t>Finir</w:t>
-            </w:r>
-            <w:r>
-              <w:t xml:space="preserve"> l’us 1 et 2</w:t>
-            </w:r>
-            <w:r>
-              <w:t xml:space="preserve"> et commencer l’us 3 et 4.</w:t>
-            </w:r>
-            <w:r>
-              <w:t xml:space="preserve"> </w:t>
-            </w:r>
-            <w:r>
-              <w:t>Et le rapport.</w:t>
-            </w:r>
-          </w:p>
-        </w:tc>
-        <w:tc>
-          <w:tcPr>
-            <w:tcW w:w="4260" w:type="dxa"/>
-          </w:tcPr>
-          <w:p>
-            <w:r>
-              <w:t>18</w:t>
-            </w:r>
-            <w:r>
-              <w:t>/09/2026</w:t>
-            </w:r>
-          </w:p>
-        </w:tc>
-      </w:tr>
-      <w:tr>
-        <w:tc>
-          <w:tcPr>
-            <w:tcW w:w="4233" w:type="dxa"/>
-          </w:tcPr>
-          <w:p>
-            <w:r>
-              <w:t xml:space="preserve">Finir l’us </w:t>
-            </w:r>
-            <w:r>
-              <w:t>3</w:t>
-            </w:r>
-            <w:r>
-              <w:t xml:space="preserve"> et</w:t>
-            </w:r>
-            <w:r>
-              <w:t xml:space="preserve"> 4.</w:t>
-            </w:r>
-            <w:r>
-              <w:t xml:space="preserve"> </w:t>
-            </w:r>
-            <w:r>
-              <w:t>Et le rapport.</w:t>
-            </w:r>
-          </w:p>
-        </w:tc>
-        <w:tc>
-          <w:tcPr>
-            <w:tcW w:w="4260" w:type="dxa"/>
-          </w:tcPr>
-          <w:p>
-            <w:r>
-              <w:t>25</w:t>
-            </w:r>
-            <w:r>
-              <w:t>/09/2026</w:t>
-            </w:r>
-          </w:p>
-        </w:tc>
-      </w:tr>
-      <w:tr>
-        <w:tc>
-          <w:tcPr>
-            <w:tcW w:w="4233" w:type="dxa"/>
-          </w:tcPr>
-          <w:p>
-            <w:r>
-              <w:t xml:space="preserve">Commencer l’us </w:t>
-            </w:r>
-            <w:r>
-              <w:t>5</w:t>
-            </w:r>
-            <w:r>
-              <w:t xml:space="preserve"> et </w:t>
-            </w:r>
-            <w:r>
-              <w:t>6</w:t>
-            </w:r>
-            <w:r>
-              <w:t>.</w:t>
-            </w:r>
-            <w:r>
-              <w:t xml:space="preserve"> </w:t>
-            </w:r>
-            <w:r>
-              <w:t>Et le rapport.</w:t>
-            </w:r>
-          </w:p>
-        </w:tc>
-        <w:tc>
-          <w:tcPr>
-            <w:tcW w:w="4260" w:type="dxa"/>
-          </w:tcPr>
-          <w:p>
-            <w:r>
-              <w:t>02</w:t>
-            </w:r>
-            <w:r>
-              <w:t>/</w:t>
-            </w:r>
-            <w:r>
-              <w:t>10</w:t>
-            </w:r>
-            <w:r>
-              <w:t>/2026</w:t>
-            </w:r>
-          </w:p>
-        </w:tc>
-      </w:tr>
-      <w:tr>
-        <w:tc>
-          <w:tcPr>
-            <w:tcW w:w="4233" w:type="dxa"/>
-          </w:tcPr>
-          <w:p>
-            <w:r>
-              <w:t xml:space="preserve">Finir l’us </w:t>
-            </w:r>
-            <w:r>
-              <w:t>5</w:t>
-            </w:r>
-            <w:r>
-              <w:t xml:space="preserve"> et </w:t>
-            </w:r>
-            <w:r>
-              <w:t>6</w:t>
-            </w:r>
-            <w:r>
-              <w:t>.</w:t>
+              <w:t>Finir l’us 1 et 2 et commencer l’us 3 et 4.</w:t>
             </w:r>
             <w:r>
               <w:t xml:space="preserve"> Et le rapport.</w:t>
@@ -3758,16 +2918,82 @@
           </w:tcPr>
           <w:p>
             <w:r>
-              <w:t>09</w:t>
+              <w:t>18/09/2026</w:t>
+            </w:r>
+          </w:p>
+        </w:tc>
+      </w:tr>
+      <w:tr>
+        <w:tc>
+          <w:tcPr>
+            <w:tcW w:w="4233" w:type="dxa"/>
+          </w:tcPr>
+          <w:p>
+            <w:r>
+              <w:t>Finir l’us 3 et 4.</w:t>
             </w:r>
             <w:r>
-              <w:t>/</w:t>
+              <w:t xml:space="preserve"> Et le rapport.</w:t>
+            </w:r>
+          </w:p>
+        </w:tc>
+        <w:tc>
+          <w:tcPr>
+            <w:tcW w:w="4260" w:type="dxa"/>
+          </w:tcPr>
+          <w:p>
+            <w:r>
+              <w:t>25/09/2026</w:t>
+            </w:r>
+          </w:p>
+        </w:tc>
+      </w:tr>
+      <w:tr>
+        <w:tc>
+          <w:tcPr>
+            <w:tcW w:w="4233" w:type="dxa"/>
+          </w:tcPr>
+          <w:p>
+            <w:r>
+              <w:t>Commencer l’us 5 et 6.</w:t>
             </w:r>
             <w:r>
-              <w:t>10</w:t>
+              <w:t xml:space="preserve"> Et le rapport.</w:t>
+            </w:r>
+          </w:p>
+        </w:tc>
+        <w:tc>
+          <w:tcPr>
+            <w:tcW w:w="4260" w:type="dxa"/>
+          </w:tcPr>
+          <w:p>
+            <w:r>
+              <w:t>02/10/2026</w:t>
+            </w:r>
+          </w:p>
+        </w:tc>
+      </w:tr>
+      <w:tr>
+        <w:tc>
+          <w:tcPr>
+            <w:tcW w:w="4233" w:type="dxa"/>
+          </w:tcPr>
+          <w:p>
+            <w:r>
+              <w:t>Finir l’us 5 et 6.</w:t>
             </w:r>
             <w:r>
-              <w:t>/2026</w:t>
+              <w:t xml:space="preserve"> Et le rapport.</w:t>
+            </w:r>
+          </w:p>
+        </w:tc>
+        <w:tc>
+          <w:tcPr>
+            <w:tcW w:w="4260" w:type="dxa"/>
+          </w:tcPr>
+          <w:p>
+            <w:r>
+              <w:t>09/10/2026</w:t>
             </w:r>
           </w:p>
         </w:tc>
@@ -3817,27 +3043,28 @@
       <w:pPr>
         <w:pStyle w:val="Titre1"/>
       </w:pPr>
-      <w:bookmarkStart w:id="4" w:name="_Toc532179957"/>
-      <w:bookmarkStart w:id="5" w:name="_Toc165969641"/>
-      <w:bookmarkStart w:id="6" w:name="_Toc308526332"/>
+      <w:bookmarkStart w:id="7" w:name="_Toc532179957"/>
+      <w:bookmarkStart w:id="8" w:name="_Toc165969641"/>
+      <w:bookmarkStart w:id="9" w:name="_Toc240025005"/>
       <w:r>
         <w:t>Analyse</w:t>
       </w:r>
-      <w:bookmarkEnd w:id="4"/>
-      <w:bookmarkEnd w:id="5"/>
-      <w:bookmarkEnd w:id="6"/>
+      <w:bookmarkEnd w:id="7"/>
+      <w:bookmarkEnd w:id="8"/>
+      <w:bookmarkEnd w:id="9"/>
     </w:p>
     <w:p>
       <w:pPr>
         <w:pStyle w:val="Titre2"/>
       </w:pPr>
+      <w:bookmarkStart w:id="10" w:name="_Toc240025006"/>
       <w:r>
         <w:t>User story</w:t>
       </w:r>
-    </w:p>
-    <w:p>
-      <w:bookmarkStart w:id="7" w:name="_Toc308526336"/>
-      <w:bookmarkStart w:id="8" w:name="_Toc532179961"/>
+      <w:bookmarkEnd w:id="10"/>
+    </w:p>
+    <w:p>
+      <w:bookmarkStart w:id="11" w:name="_Toc532179961"/>
     </w:p>
     <w:p>
       <w:pPr>
@@ -3848,44 +3075,123 @@
         </w:numPr>
         <w:ind w:left="567"/>
       </w:pPr>
-      <w:r>
-        <w:t>#1 — US 1: Déplacement</w:t>
-      </w:r>
-    </w:p>
-    <w:p>
+      <w:bookmarkStart w:id="12" w:name="_Toc240025007"/>
+      <w:r>
+        <w:t xml:space="preserve">#1 — US </w:t>
+      </w:r>
+      <w:proofErr w:type="gramStart"/>
+      <w:r>
+        <w:t>1:</w:t>
+      </w:r>
+      <w:proofErr w:type="gramEnd"/>
+      <w:r>
+        <w:t xml:space="preserve"> Déplacement</w:t>
+      </w:r>
+      <w:bookmarkEnd w:id="12"/>
+    </w:p>
+    <w:p>
+      <w:pPr>
+        <w:ind w:left="1416"/>
+      </w:pPr>
       <w:r>
         <w:t>En tant que joueur je souhaite pouvoir me déplacer de gauche à droite afin d'esquiver.</w:t>
       </w:r>
     </w:p>
-    <w:p/>
-    <w:p>
-      <w:r>
-        <w:t>•   En appuyant sur la flèche directionnel de gauche le joueur se déplacer à gauche.</w:t>
-      </w:r>
-    </w:p>
-    <w:p>
-      <w:r>
-        <w:t>•   Tant que le joueur restera appuie sur la flèche directionnel de gauche son personnage se déplacera à gauche.</w:t>
-      </w:r>
-    </w:p>
-    <w:p>
+    <w:p>
+      <w:pPr>
+        <w:ind w:left="1416"/>
+      </w:pPr>
+    </w:p>
+    <w:p>
+      <w:pPr>
+        <w:ind w:left="1416"/>
+      </w:pPr>
+      <w:r>
+        <w:t xml:space="preserve">•   En appuyant sur </w:t>
+      </w:r>
+      <w:r>
+        <w:t>la flèche directionnelle</w:t>
+      </w:r>
+      <w:r>
+        <w:t xml:space="preserve"> de gauche le joueur se déplacer à gauche.</w:t>
+      </w:r>
+    </w:p>
+    <w:p>
+      <w:pPr>
+        <w:ind w:left="1416"/>
+      </w:pPr>
+      <w:r>
+        <w:t xml:space="preserve">•   Tant que le joueur restera </w:t>
+      </w:r>
+      <w:r>
+        <w:t>appuyé</w:t>
+      </w:r>
+      <w:r>
+        <w:t xml:space="preserve"> sur </w:t>
+      </w:r>
+      <w:r>
+        <w:t>la flèche directionnelle</w:t>
+      </w:r>
+      <w:r>
+        <w:t xml:space="preserve"> de gauche son personnage se déplacera à gauche.</w:t>
+      </w:r>
+    </w:p>
+    <w:p>
+      <w:pPr>
+        <w:ind w:left="1416"/>
+      </w:pPr>
       <w:r>
         <w:t>•   si le joueur atteint le bord du terrain il sera renvoyer de l'autre côté.</w:t>
       </w:r>
     </w:p>
     <w:p>
-      <w:r>
-        <w:t>•   En appuyant sur la flèche directionnel de droite le joueur se déplacer à droite.</w:t>
-      </w:r>
-    </w:p>
-    <w:p>
-      <w:r>
-        <w:t>•   Tant que le joueur restera appuie sur la flèche directionnel de droite son personnage se déplacera à droite.</w:t>
-      </w:r>
-    </w:p>
-    <w:p/>
-    <w:p/>
-    <w:p>
+      <w:pPr>
+        <w:ind w:left="1416"/>
+      </w:pPr>
+      <w:r>
+        <w:t xml:space="preserve">•   En appuyant sur </w:t>
+      </w:r>
+      <w:r>
+        <w:t>la flèche directionnelle</w:t>
+      </w:r>
+      <w:r>
+        <w:t xml:space="preserve"> de droite le joueur se déplacer à droite.</w:t>
+      </w:r>
+    </w:p>
+    <w:p>
+      <w:pPr>
+        <w:ind w:left="1416"/>
+      </w:pPr>
+      <w:r>
+        <w:t xml:space="preserve">•   Tant que le joueur restera </w:t>
+      </w:r>
+      <w:r>
+        <w:t>appuyé</w:t>
+      </w:r>
+      <w:r>
+        <w:t xml:space="preserve"> sur </w:t>
+      </w:r>
+      <w:r>
+        <w:t>la flèche directionnelle</w:t>
+      </w:r>
+      <w:r>
+        <w:t xml:space="preserve"> de droite son personnage se déplacera à droite.</w:t>
+      </w:r>
+    </w:p>
+    <w:p>
+      <w:pPr>
+        <w:ind w:left="1416"/>
+      </w:pPr>
+    </w:p>
+    <w:p>
+      <w:pPr>
+        <w:ind w:left="1416"/>
+      </w:pPr>
+    </w:p>
+    <w:p>
+      <w:pPr>
+        <w:ind w:left="1416"/>
+      </w:pPr>
       <w:r>
         <w:rPr>
           <w:noProof/>
@@ -3946,38 +3252,92 @@
         </w:numPr>
         <w:ind w:left="567"/>
       </w:pPr>
-      <w:r>
-        <w:t>#2 — US 2: Tir</w:t>
-      </w:r>
-    </w:p>
-    <w:p>
-      <w:r>
-        <w:t>En tant que joueur je souhaite pouvoir tirer des projectiles afin de tué les ennemies.</w:t>
-      </w:r>
-    </w:p>
-    <w:p/>
-    <w:p>
-      <w:r>
-        <w:t>•   Le joueur tirera un tire toute les 1 sec.</w:t>
-      </w:r>
-    </w:p>
-    <w:p>
+      <w:bookmarkStart w:id="13" w:name="_Toc240025008"/>
+      <w:r>
+        <w:t xml:space="preserve">#2 — US </w:t>
+      </w:r>
+      <w:proofErr w:type="gramStart"/>
+      <w:r>
+        <w:t>2:</w:t>
+      </w:r>
+      <w:proofErr w:type="gramEnd"/>
+      <w:r>
+        <w:t xml:space="preserve"> Tir</w:t>
+      </w:r>
+      <w:bookmarkEnd w:id="13"/>
+    </w:p>
+    <w:p>
+      <w:pPr>
+        <w:ind w:left="1416"/>
+      </w:pPr>
+      <w:r>
+        <w:t xml:space="preserve">En tant que joueur je souhaite pouvoir tirer des projectiles afin de </w:t>
+      </w:r>
+      <w:r>
+        <w:t>tuer</w:t>
+      </w:r>
+      <w:r>
+        <w:t xml:space="preserve"> les ennemies.</w:t>
+      </w:r>
+    </w:p>
+    <w:p>
+      <w:pPr>
+        <w:ind w:left="1416"/>
+      </w:pPr>
+    </w:p>
+    <w:p>
+      <w:pPr>
+        <w:ind w:left="1416"/>
+      </w:pPr>
+      <w:r>
+        <w:t xml:space="preserve">•   Le joueur tirera </w:t>
+      </w:r>
+      <w:r>
+        <w:t>un tir</w:t>
+      </w:r>
+      <w:r>
+        <w:t xml:space="preserve"> toute les 1 sec.</w:t>
+      </w:r>
+    </w:p>
+    <w:p>
+      <w:pPr>
+        <w:ind w:left="1416"/>
+      </w:pPr>
       <w:r>
         <w:t>•   Les ennemies en tireront un toutes les 2 sec.</w:t>
       </w:r>
     </w:p>
     <w:p>
+      <w:pPr>
+        <w:ind w:left="1416"/>
+      </w:pPr>
       <w:r>
         <w:t>•   Les tirs du joueur se tireront seulement après 0.5 sec d'arrêt de mouvement.</w:t>
       </w:r>
     </w:p>
     <w:p>
-      <w:r>
-        <w:t>•   Lors de collisions entre deux missile les deux seront détruits.</w:t>
-      </w:r>
-    </w:p>
-    <w:p/>
-    <w:p>
+      <w:pPr>
+        <w:ind w:left="1416"/>
+      </w:pPr>
+      <w:r>
+        <w:t xml:space="preserve">•   Lors de collisions entre </w:t>
+      </w:r>
+      <w:r>
+        <w:t>deux missiles</w:t>
+      </w:r>
+      <w:r>
+        <w:t xml:space="preserve"> les deux seront détruits.</w:t>
+      </w:r>
+    </w:p>
+    <w:p>
+      <w:pPr>
+        <w:ind w:left="1416"/>
+      </w:pPr>
+    </w:p>
+    <w:p>
+      <w:pPr>
+        <w:ind w:left="1416"/>
+      </w:pPr>
       <w:r>
         <w:rPr>
           <w:noProof/>
@@ -4037,43 +3397,88 @@
         </w:numPr>
         <w:ind w:left="567"/>
       </w:pPr>
-      <w:r>
-        <w:t>#3 — US 3: Personnage Joueur</w:t>
-      </w:r>
-    </w:p>
-    <w:p>
+      <w:bookmarkStart w:id="14" w:name="_Toc240025009"/>
+      <w:r>
+        <w:t xml:space="preserve">#3 — US </w:t>
+      </w:r>
+      <w:proofErr w:type="gramStart"/>
+      <w:r>
+        <w:t>3:</w:t>
+      </w:r>
+      <w:proofErr w:type="gramEnd"/>
+      <w:r>
+        <w:t xml:space="preserve"> Personnage Joueur</w:t>
+      </w:r>
+      <w:bookmarkEnd w:id="14"/>
+    </w:p>
+    <w:p>
+      <w:pPr>
+        <w:ind w:left="1416"/>
+      </w:pPr>
       <w:r>
         <w:t>En tant que joueur je souhaite avoir un personnage afin de savoir où je suis.</w:t>
       </w:r>
     </w:p>
-    <w:p/>
-    <w:p>
+    <w:p>
+      <w:pPr>
+        <w:ind w:left="1416"/>
+      </w:pPr>
+    </w:p>
+    <w:p>
+      <w:pPr>
+        <w:ind w:left="1416"/>
+      </w:pPr>
       <w:r>
         <w:t>•   Le joueur aura 3 vies.</w:t>
       </w:r>
     </w:p>
     <w:p>
-      <w:r>
-        <w:t>•   Il aura 2 sec d'invincibilité à chaque fois qu'il se fassent touché.</w:t>
-      </w:r>
-    </w:p>
-    <w:p>
+      <w:pPr>
+        <w:ind w:left="1416"/>
+      </w:pPr>
+      <w:r>
+        <w:t xml:space="preserve">•   Il aura 2 sec d'invincibilité à chaque fois qu'il se fassent </w:t>
+      </w:r>
+      <w:r>
+        <w:t>toucher</w:t>
+      </w:r>
+      <w:r>
+        <w:t>.</w:t>
+      </w:r>
+    </w:p>
+    <w:p>
+      <w:pPr>
+        <w:ind w:left="1416"/>
+      </w:pPr>
       <w:r>
         <w:t>•   Il perdra un cœur par projectile qui le touche.</w:t>
       </w:r>
     </w:p>
     <w:p>
+      <w:pPr>
+        <w:ind w:left="1416"/>
+      </w:pPr>
       <w:r>
         <w:t>•    Il perdra un cœur par ennemie au corps à corps qui le touche.</w:t>
       </w:r>
     </w:p>
     <w:p>
+      <w:pPr>
+        <w:ind w:left="1416"/>
+      </w:pPr>
       <w:r>
         <w:t>•   Il apparaitra au centre de la zone de déplacement.</w:t>
       </w:r>
     </w:p>
-    <w:p/>
-    <w:p>
+    <w:p>
+      <w:pPr>
+        <w:ind w:left="1416"/>
+      </w:pPr>
+    </w:p>
+    <w:p>
+      <w:pPr>
+        <w:ind w:left="1416"/>
+      </w:pPr>
       <w:r>
         <w:rPr>
           <w:noProof/>
@@ -4133,53 +3538,122 @@
         </w:numPr>
         <w:ind w:left="567"/>
       </w:pPr>
-      <w:r>
-        <w:t>#4 — US 4: Personnage ennemie</w:t>
-      </w:r>
-    </w:p>
-    <w:p>
-      <w:r>
-        <w:t>En tant que joueur je souhaite avoir des ennemies afin de les tué.</w:t>
-      </w:r>
-    </w:p>
-    <w:p/>
-    <w:p>
+      <w:bookmarkStart w:id="15" w:name="_Toc240025010"/>
+      <w:r>
+        <w:t xml:space="preserve">#4 — US </w:t>
+      </w:r>
+      <w:proofErr w:type="gramStart"/>
+      <w:r>
+        <w:t>4:</w:t>
+      </w:r>
+      <w:proofErr w:type="gramEnd"/>
+      <w:r>
+        <w:t xml:space="preserve"> Personnage ennemie</w:t>
+      </w:r>
+      <w:bookmarkEnd w:id="15"/>
+    </w:p>
+    <w:p>
+      <w:pPr>
+        <w:ind w:left="1416"/>
+      </w:pPr>
+      <w:r>
+        <w:t xml:space="preserve">En tant que joueur je souhaite avoir des ennemies afin de </w:t>
+      </w:r>
+      <w:r>
+        <w:t>les tués</w:t>
+      </w:r>
+      <w:r>
+        <w:t>.</w:t>
+      </w:r>
+    </w:p>
+    <w:p>
+      <w:pPr>
+        <w:ind w:left="1416"/>
+      </w:pPr>
+    </w:p>
+    <w:p>
+      <w:pPr>
+        <w:ind w:left="1416"/>
+      </w:pPr>
       <w:r>
         <w:t>•   Les ennemies apparaitront à gauche de l'écran et se déplaceront de gauche à droite.</w:t>
       </w:r>
     </w:p>
     <w:p>
-      <w:r>
-        <w:t>•   Si ils arrivent au bout de la zone de jeux ils réapparaitront une ligne en dessous de la ligne où ils étaient à gauche.</w:t>
-      </w:r>
-    </w:p>
-    <w:p>
+      <w:pPr>
+        <w:ind w:left="1416"/>
+      </w:pPr>
+      <w:r>
+        <w:t xml:space="preserve">•   </w:t>
+      </w:r>
+      <w:r>
+        <w:t>S’ils</w:t>
+      </w:r>
+      <w:r>
+        <w:t xml:space="preserve"> arrivent au bout de la zone de jeux ils réapparaitront une ligne en dessous de la ligne où ils étaient à gauche.</w:t>
+      </w:r>
+    </w:p>
+    <w:p>
+      <w:pPr>
+        <w:ind w:left="1416"/>
+      </w:pPr>
       <w:r>
         <w:t>•   Il tireront si le joueur passe devant eux.</w:t>
       </w:r>
     </w:p>
     <w:p>
-      <w:r>
-        <w:t>•   Il auront 2 vie.</w:t>
-      </w:r>
-    </w:p>
-    <w:p>
-      <w:r>
-        <w:t>•   Ils perdront 2 vies si il sont touchés au corps à corps.</w:t>
-      </w:r>
-    </w:p>
-    <w:p>
+      <w:pPr>
+        <w:ind w:left="1416"/>
+      </w:pPr>
+      <w:r>
+        <w:t xml:space="preserve">•   Il auront 2 </w:t>
+      </w:r>
+      <w:r>
+        <w:t>vies</w:t>
+      </w:r>
+      <w:r>
+        <w:t>.</w:t>
+      </w:r>
+    </w:p>
+    <w:p>
+      <w:pPr>
+        <w:ind w:left="1416"/>
+      </w:pPr>
+      <w:r>
+        <w:t xml:space="preserve">•   Ils perdront 2 vies </w:t>
+      </w:r>
+      <w:r>
+        <w:t>s’ils sont</w:t>
+      </w:r>
+      <w:r>
+        <w:t xml:space="preserve"> touchés au corps à corps.</w:t>
+      </w:r>
+    </w:p>
+    <w:p>
+      <w:pPr>
+        <w:ind w:left="1416"/>
+      </w:pPr>
       <w:r>
         <w:t>•   Ils perdront une vie par tire qui les touchent.</w:t>
       </w:r>
     </w:p>
     <w:p>
+      <w:pPr>
+        <w:ind w:left="1416"/>
+      </w:pPr>
       <w:r>
         <w:t>•   Moins ils sont plus ils iront vite.</w:t>
       </w:r>
     </w:p>
-    <w:p/>
-    <w:p>
+    <w:p>
+      <w:pPr>
+        <w:ind w:left="1416"/>
+      </w:pPr>
+    </w:p>
+    <w:p>
+      <w:pPr>
+        <w:ind w:left="1416"/>
+      </w:pPr>
       <w:r>
         <w:rPr>
           <w:noProof/>
@@ -4225,6 +3699,9 @@
       </w:r>
     </w:p>
     <w:p>
+      <w:pPr>
+        <w:ind w:left="1416"/>
+      </w:pPr>
       <w:r>
         <w:br w:type="page"/>
       </w:r>
@@ -4238,34 +3715,79 @@
         </w:numPr>
         <w:ind w:left="567"/>
       </w:pPr>
+      <w:bookmarkStart w:id="16" w:name="_Toc240025011"/>
       <w:r>
         <w:lastRenderedPageBreak/>
-        <w:t>#5 — US 5: Barrière</w:t>
-      </w:r>
-    </w:p>
-    <w:p>
+        <w:t xml:space="preserve">#5 — US </w:t>
+      </w:r>
+      <w:proofErr w:type="gramStart"/>
+      <w:r>
+        <w:t>5:</w:t>
+      </w:r>
+      <w:proofErr w:type="gramEnd"/>
+      <w:r>
+        <w:t xml:space="preserve"> Barrière</w:t>
+      </w:r>
+      <w:bookmarkEnd w:id="16"/>
+    </w:p>
+    <w:p>
+      <w:pPr>
+        <w:ind w:left="1416"/>
+      </w:pPr>
       <w:r>
         <w:t>En tant que joueur je souhaite avoir des barrières afin de me protéger des attaques.</w:t>
       </w:r>
     </w:p>
-    <w:p/>
-    <w:p>
-      <w:r>
-        <w:t>•   Les barrières se détruiront progressivement si elles sont toucher par des ennemies.</w:t>
-      </w:r>
-    </w:p>
-    <w:p>
-      <w:r>
-        <w:t>•   Elles pourront résister à un total de 5 attaque.</w:t>
-      </w:r>
-    </w:p>
-    <w:p>
+    <w:p>
+      <w:pPr>
+        <w:ind w:left="1416"/>
+      </w:pPr>
+    </w:p>
+    <w:p>
+      <w:pPr>
+        <w:ind w:left="1416"/>
+      </w:pPr>
+      <w:r>
+        <w:t xml:space="preserve">•   Les barrières se détruiront progressivement si elles sont </w:t>
+      </w:r>
+      <w:r>
+        <w:t>touchées</w:t>
+      </w:r>
+      <w:r>
+        <w:t xml:space="preserve"> par des ennemies.</w:t>
+      </w:r>
+    </w:p>
+    <w:p>
+      <w:pPr>
+        <w:ind w:left="1416"/>
+      </w:pPr>
+      <w:r>
+        <w:t xml:space="preserve">•   Elles pourront résister à un total de 5 </w:t>
+      </w:r>
+      <w:r>
+        <w:t>attaques</w:t>
+      </w:r>
+      <w:r>
+        <w:t>.</w:t>
+      </w:r>
+    </w:p>
+    <w:p>
+      <w:pPr>
+        <w:ind w:left="1416"/>
+      </w:pPr>
       <w:r>
         <w:t>•   Le joueur ne pourra pas leur infliger de dégâts.</w:t>
       </w:r>
     </w:p>
-    <w:p/>
-    <w:p>
+    <w:p>
+      <w:pPr>
+        <w:ind w:left="1416"/>
+      </w:pPr>
+    </w:p>
+    <w:p>
+      <w:pPr>
+        <w:ind w:left="1416"/>
+      </w:pPr>
       <w:r>
         <w:rPr>
           <w:noProof/>
@@ -4324,19 +3846,43 @@
         </w:numPr>
         <w:ind w:left="567" w:hanging="567"/>
       </w:pPr>
+      <w:bookmarkStart w:id="17" w:name="_Toc240025012"/>
       <w:r>
         <w:lastRenderedPageBreak/>
-        <w:t>#6 — US 6: Vague</w:t>
-      </w:r>
-    </w:p>
-    <w:p>
+        <w:t xml:space="preserve">#6 — US </w:t>
+      </w:r>
+      <w:proofErr w:type="gramStart"/>
+      <w:r>
+        <w:t>6:</w:t>
+      </w:r>
+      <w:proofErr w:type="gramEnd"/>
+      <w:r>
+        <w:t xml:space="preserve"> Vague</w:t>
+      </w:r>
+      <w:bookmarkEnd w:id="17"/>
+    </w:p>
+    <w:p>
+      <w:pPr>
+        <w:ind w:left="708"/>
+      </w:pPr>
       <w:r>
         <w:t>En tant que joueur je souhaite avoir des vagues afin que la difficulté augmente progressivement.</w:t>
       </w:r>
     </w:p>
-    <w:p/>
-    <w:p/>
-    <w:p>
+    <w:p>
+      <w:pPr>
+        <w:ind w:left="708"/>
+      </w:pPr>
+    </w:p>
+    <w:p>
+      <w:pPr>
+        <w:ind w:left="708"/>
+      </w:pPr>
+    </w:p>
+    <w:p>
+      <w:pPr>
+        <w:ind w:left="708"/>
+      </w:pPr>
       <w:r>
         <w:rPr>
           <w:noProof/>
@@ -4381,59 +3927,96 @@
         </w:drawing>
       </w:r>
     </w:p>
+    <w:p>
+      <w:pPr>
+        <w:ind w:left="708"/>
+      </w:pPr>
+    </w:p>
+    <w:p>
+      <w:pPr>
+        <w:ind w:left="708"/>
+      </w:pPr>
+    </w:p>
+    <w:p>
+      <w:pPr>
+        <w:ind w:left="708"/>
+      </w:pPr>
+      <w:r>
+        <w:t xml:space="preserve">•   Il y aura 3 </w:t>
+      </w:r>
+      <w:r>
+        <w:t>vagues</w:t>
+      </w:r>
+      <w:r>
+        <w:t>.</w:t>
+      </w:r>
+    </w:p>
+    <w:p>
+      <w:pPr>
+        <w:ind w:left="708"/>
+      </w:pPr>
+      <w:r>
+        <w:t>•   Il y aura 15 ennemies à la première, puis 25 à la deuxième et puis 50 à la dernière.</w:t>
+      </w:r>
+    </w:p>
+    <w:p>
+      <w:pPr>
+        <w:ind w:left="708"/>
+      </w:pPr>
+      <w:r>
+        <w:t>•   Il y aura 5 sec</w:t>
+      </w:r>
+      <w:r>
+        <w:t>ondes</w:t>
+      </w:r>
+      <w:r>
+        <w:t xml:space="preserve"> de pause entre chacune.</w:t>
+      </w:r>
+    </w:p>
+    <w:p>
+      <w:pPr>
+        <w:ind w:left="708"/>
+      </w:pPr>
+      <w:r>
+        <w:t xml:space="preserve">•   le joueur gagne </w:t>
+      </w:r>
+      <w:r>
+        <w:t>s’il</w:t>
+      </w:r>
+      <w:r>
+        <w:t xml:space="preserve"> arrive à battre les 50 ennemies de la dernière vague avant que ces vies ne tombent à zéro.</w:t>
+      </w:r>
+    </w:p>
     <w:p/>
     <w:p/>
     <w:p>
-      <w:r>
-        <w:t>•   Il y aura 3 vague.</w:t>
-      </w:r>
-    </w:p>
-    <w:p>
-      <w:r>
-        <w:t>•   Il y aura 15 ennemies à la première, puis 25 à la deuxième et puis 50 à la dernière.</w:t>
-      </w:r>
-    </w:p>
-    <w:p>
-      <w:r>
-        <w:t>•   Il y aura 5 sec de pause entre chacune.</w:t>
-      </w:r>
-    </w:p>
-    <w:p>
-      <w:r>
-        <w:t>•   le joueur gagne si il arrive à battre les 50 ennemies de la dernière vague avant que ces vies ne tombent à zéro.</w:t>
-      </w:r>
-    </w:p>
-    <w:p/>
-    <w:p/>
-    <w:p>
       <w:pPr>
         <w:pStyle w:val="Titre1"/>
       </w:pPr>
-      <w:bookmarkStart w:id="9" w:name="_Toc532179964"/>
-      <w:bookmarkStart w:id="10" w:name="_Toc165969648"/>
-      <w:bookmarkStart w:id="11" w:name="_Toc308526337"/>
-      <w:bookmarkEnd w:id="7"/>
-      <w:bookmarkEnd w:id="8"/>
+      <w:bookmarkStart w:id="18" w:name="_Toc532179964"/>
+      <w:bookmarkStart w:id="19" w:name="_Toc165969648"/>
+      <w:bookmarkStart w:id="20" w:name="_Toc240025013"/>
+      <w:bookmarkEnd w:id="11"/>
       <w:r>
         <w:t>Réalisation</w:t>
       </w:r>
-      <w:bookmarkEnd w:id="9"/>
-      <w:bookmarkEnd w:id="10"/>
-      <w:bookmarkEnd w:id="11"/>
+      <w:bookmarkEnd w:id="18"/>
+      <w:bookmarkEnd w:id="19"/>
+      <w:bookmarkEnd w:id="20"/>
     </w:p>
     <w:p>
       <w:pPr>
         <w:pStyle w:val="Titre2"/>
       </w:pPr>
-      <w:bookmarkStart w:id="12" w:name="_Toc532179965"/>
-      <w:bookmarkStart w:id="13" w:name="_Toc165969649"/>
-      <w:bookmarkStart w:id="14" w:name="_Toc308526338"/>
+      <w:bookmarkStart w:id="21" w:name="_Toc532179965"/>
+      <w:bookmarkStart w:id="22" w:name="_Toc165969649"/>
+      <w:bookmarkStart w:id="23" w:name="_Toc240025014"/>
       <w:r>
         <w:t>Dossier de Réalisation</w:t>
       </w:r>
-      <w:bookmarkEnd w:id="12"/>
-      <w:bookmarkEnd w:id="13"/>
-      <w:bookmarkEnd w:id="14"/>
+      <w:bookmarkEnd w:id="21"/>
+      <w:bookmarkEnd w:id="22"/>
+      <w:bookmarkEnd w:id="23"/>
     </w:p>
     <w:p>
       <w:pPr>
@@ -4592,15 +4175,15 @@
       <w:pPr>
         <w:pStyle w:val="Titre2"/>
       </w:pPr>
-      <w:bookmarkStart w:id="15" w:name="_Toc532179960"/>
-      <w:bookmarkStart w:id="16" w:name="_Toc165969644"/>
-      <w:bookmarkStart w:id="17" w:name="_Toc308526339"/>
+      <w:bookmarkStart w:id="24" w:name="_Toc532179960"/>
+      <w:bookmarkStart w:id="25" w:name="_Toc165969644"/>
+      <w:bookmarkStart w:id="26" w:name="_Toc240025015"/>
       <w:r>
         <w:t>Modifications</w:t>
       </w:r>
-      <w:bookmarkEnd w:id="15"/>
-      <w:bookmarkEnd w:id="16"/>
-      <w:bookmarkEnd w:id="17"/>
+      <w:bookmarkEnd w:id="24"/>
+      <w:bookmarkEnd w:id="25"/>
+      <w:bookmarkEnd w:id="26"/>
     </w:p>
     <w:p>
       <w:pPr>
@@ -4642,31 +4225,31 @@
       <w:pPr>
         <w:pStyle w:val="Titre1"/>
       </w:pPr>
-      <w:bookmarkStart w:id="18" w:name="_Toc532179966"/>
-      <w:bookmarkStart w:id="19" w:name="_Toc165969650"/>
-      <w:bookmarkStart w:id="20" w:name="_Toc308526340"/>
+      <w:bookmarkStart w:id="27" w:name="_Toc532179966"/>
+      <w:bookmarkStart w:id="28" w:name="_Toc165969650"/>
+      <w:bookmarkStart w:id="29" w:name="_Toc240025016"/>
       <w:r>
         <w:t>Tests</w:t>
       </w:r>
-      <w:bookmarkEnd w:id="18"/>
-      <w:bookmarkEnd w:id="19"/>
-      <w:bookmarkEnd w:id="20"/>
+      <w:bookmarkEnd w:id="27"/>
+      <w:bookmarkEnd w:id="28"/>
+      <w:bookmarkEnd w:id="29"/>
     </w:p>
     <w:p>
       <w:pPr>
         <w:pStyle w:val="Titre2"/>
       </w:pPr>
-      <w:bookmarkStart w:id="21" w:name="_Toc532179968"/>
-      <w:bookmarkStart w:id="22" w:name="_Toc165969652"/>
-      <w:bookmarkStart w:id="23" w:name="_Ref308525868"/>
-      <w:bookmarkStart w:id="24" w:name="_Toc308526341"/>
+      <w:bookmarkStart w:id="30" w:name="_Toc532179968"/>
+      <w:bookmarkStart w:id="31" w:name="_Toc165969652"/>
+      <w:bookmarkStart w:id="32" w:name="_Ref308525868"/>
+      <w:bookmarkStart w:id="33" w:name="_Toc240025017"/>
       <w:r>
         <w:t>Dossier des tests</w:t>
       </w:r>
-      <w:bookmarkEnd w:id="21"/>
-      <w:bookmarkEnd w:id="22"/>
-      <w:bookmarkEnd w:id="23"/>
-      <w:bookmarkEnd w:id="24"/>
+      <w:bookmarkEnd w:id="30"/>
+      <w:bookmarkEnd w:id="31"/>
+      <w:bookmarkEnd w:id="32"/>
+      <w:bookmarkEnd w:id="33"/>
     </w:p>
     <w:p>
       <w:pPr>
@@ -4757,28 +4340,28 @@
       <w:pPr>
         <w:pStyle w:val="Titre1"/>
       </w:pPr>
-      <w:bookmarkStart w:id="25" w:name="_Toc165969653"/>
-      <w:bookmarkStart w:id="26" w:name="_Toc308526342"/>
+      <w:bookmarkStart w:id="34" w:name="_Toc165969653"/>
+      <w:bookmarkStart w:id="35" w:name="_Toc240025018"/>
       <w:r>
         <w:t>Conclusion</w:t>
       </w:r>
-      <w:bookmarkEnd w:id="25"/>
-      <w:bookmarkEnd w:id="26"/>
+      <w:bookmarkEnd w:id="34"/>
+      <w:bookmarkEnd w:id="35"/>
     </w:p>
     <w:p>
       <w:pPr>
         <w:pStyle w:val="Titre2"/>
       </w:pPr>
-      <w:bookmarkStart w:id="27" w:name="_Toc165969654"/>
-      <w:bookmarkStart w:id="28" w:name="_Toc308526343"/>
+      <w:bookmarkStart w:id="36" w:name="_Toc165969654"/>
+      <w:bookmarkStart w:id="37" w:name="_Toc240025019"/>
       <w:r>
         <w:t xml:space="preserve">Bilan des </w:t>
       </w:r>
-      <w:bookmarkEnd w:id="27"/>
+      <w:bookmarkEnd w:id="36"/>
       <w:r>
         <w:t>fonctionnalités demandées</w:t>
       </w:r>
-      <w:bookmarkEnd w:id="28"/>
+      <w:bookmarkEnd w:id="37"/>
     </w:p>
     <w:p>
       <w:pPr>
@@ -4817,13 +4400,13 @@
       <w:pPr>
         <w:pStyle w:val="Titre2"/>
       </w:pPr>
-      <w:bookmarkStart w:id="29" w:name="_Toc165969655"/>
-      <w:bookmarkStart w:id="30" w:name="_Toc308526344"/>
+      <w:bookmarkStart w:id="38" w:name="_Toc165969655"/>
+      <w:bookmarkStart w:id="39" w:name="_Toc240025020"/>
       <w:r>
         <w:t>Bilan de la planification</w:t>
       </w:r>
-      <w:bookmarkEnd w:id="29"/>
-      <w:bookmarkEnd w:id="30"/>
+      <w:bookmarkEnd w:id="38"/>
+      <w:bookmarkEnd w:id="39"/>
     </w:p>
     <w:p>
       <w:pPr>
@@ -4849,20 +4432,28 @@
         <w:t xml:space="preserve"> projet.</w:t>
       </w:r>
       <w:r>
-        <w:t xml:space="preserve"> Indiquer les différence entre les planifications initiales et détaillées avec le journal de travail.</w:t>
+        <w:t xml:space="preserve"> Indiquer </w:t>
+      </w:r>
+      <w:proofErr w:type="gramStart"/>
+      <w:r>
+        <w:t>les différence</w:t>
+      </w:r>
+      <w:proofErr w:type="gramEnd"/>
+      <w:r>
+        <w:t xml:space="preserve"> entre les planifications initiales et détaillées avec le journal de travail.</w:t>
       </w:r>
     </w:p>
     <w:p>
       <w:pPr>
         <w:pStyle w:val="Titre2"/>
       </w:pPr>
-      <w:bookmarkStart w:id="31" w:name="_Toc165969656"/>
-      <w:bookmarkStart w:id="32" w:name="_Toc308526345"/>
+      <w:bookmarkStart w:id="40" w:name="_Toc165969656"/>
+      <w:bookmarkStart w:id="41" w:name="_Toc240025021"/>
       <w:r>
         <w:t>Bilan personnel</w:t>
       </w:r>
-      <w:bookmarkEnd w:id="31"/>
-      <w:bookmarkEnd w:id="32"/>
+      <w:bookmarkEnd w:id="40"/>
+      <w:bookmarkEnd w:id="41"/>
     </w:p>
     <w:p>
       <w:pPr>
@@ -4964,29 +4555,29 @@
       <w:pPr>
         <w:pStyle w:val="Titre1"/>
       </w:pPr>
-      <w:bookmarkStart w:id="33" w:name="_Toc532179971"/>
-      <w:bookmarkStart w:id="34" w:name="_Toc165969657"/>
-      <w:bookmarkStart w:id="35" w:name="_Toc308526346"/>
+      <w:bookmarkStart w:id="42" w:name="_Toc532179971"/>
+      <w:bookmarkStart w:id="43" w:name="_Toc165969657"/>
+      <w:bookmarkStart w:id="44" w:name="_Toc240025022"/>
       <w:r>
         <w:t>Divers</w:t>
       </w:r>
-      <w:bookmarkEnd w:id="33"/>
-      <w:bookmarkEnd w:id="34"/>
-      <w:bookmarkEnd w:id="35"/>
+      <w:bookmarkEnd w:id="42"/>
+      <w:bookmarkEnd w:id="43"/>
+      <w:bookmarkEnd w:id="44"/>
     </w:p>
     <w:p>
       <w:pPr>
         <w:pStyle w:val="Titre2"/>
       </w:pPr>
-      <w:bookmarkStart w:id="36" w:name="_Toc532179972"/>
-      <w:bookmarkStart w:id="37" w:name="_Toc165969658"/>
-      <w:bookmarkStart w:id="38" w:name="_Toc308526347"/>
+      <w:bookmarkStart w:id="45" w:name="_Toc532179972"/>
+      <w:bookmarkStart w:id="46" w:name="_Toc165969658"/>
+      <w:bookmarkStart w:id="47" w:name="_Toc240025023"/>
       <w:r>
         <w:t>Journal de travail</w:t>
       </w:r>
-      <w:bookmarkEnd w:id="36"/>
-      <w:bookmarkEnd w:id="37"/>
-      <w:bookmarkEnd w:id="38"/>
+      <w:bookmarkEnd w:id="45"/>
+      <w:bookmarkEnd w:id="46"/>
+      <w:bookmarkEnd w:id="47"/>
     </w:p>
     <w:p>
       <w:pPr>
@@ -5022,11 +4613,11 @@
       <w:pPr>
         <w:pStyle w:val="Titre2"/>
       </w:pPr>
-      <w:bookmarkStart w:id="39" w:name="_Toc308526348"/>
+      <w:bookmarkStart w:id="48" w:name="_Toc240025024"/>
       <w:r>
         <w:t>Bibliographie</w:t>
       </w:r>
-      <w:bookmarkEnd w:id="39"/>
+      <w:bookmarkEnd w:id="48"/>
     </w:p>
     <w:p>
       <w:pPr>
@@ -5053,11 +4644,11 @@
       <w:pPr>
         <w:pStyle w:val="Titre2"/>
       </w:pPr>
-      <w:bookmarkStart w:id="40" w:name="_Toc308526349"/>
+      <w:bookmarkStart w:id="49" w:name="_Toc240025025"/>
       <w:r>
         <w:t>Webographie</w:t>
       </w:r>
-      <w:bookmarkEnd w:id="40"/>
+      <w:bookmarkEnd w:id="49"/>
     </w:p>
     <w:p>
       <w:pPr>
@@ -5075,11 +4666,11 @@
       <w:pPr>
         <w:pStyle w:val="Titre1"/>
       </w:pPr>
-      <w:bookmarkStart w:id="41" w:name="_Toc308526350"/>
+      <w:bookmarkStart w:id="50" w:name="_Toc240025026"/>
       <w:r>
         <w:t>Annexes</w:t>
       </w:r>
-      <w:bookmarkEnd w:id="41"/>
+      <w:bookmarkEnd w:id="50"/>
     </w:p>
     <w:p>
       <w:pPr>
@@ -5365,6 +4956,15 @@
             <w:instrText xml:space="preserve"> LASTSAVEDBY   \* MERGEFORMAT </w:instrText>
           </w:r>
           <w:r>
+            <w:fldChar w:fldCharType="separate"/>
+          </w:r>
+          <w:r>
+            <w:rPr>
+              <w:noProof/>
+            </w:rPr>
+            <w:t>Bixente Pouradier</w:t>
+          </w:r>
+          <w:r>
             <w:rPr>
               <w:rFonts w:cs="Arial"/>
               <w:noProof/>
@@ -5542,7 +5142,7 @@
               <w:noProof/>
               <w:szCs w:val="16"/>
             </w:rPr>
-            <w:t>04.09.2009 15:21</w:t>
+            <w:t>04.09.2026 16:18</w:t>
           </w:r>
           <w:r>
             <w:rPr>
@@ -5571,12 +5171,21 @@
               <w:szCs w:val="16"/>
             </w:rPr>
           </w:pPr>
+          <w:proofErr w:type="gramStart"/>
           <w:r>
             <w:rPr>
               <w:rFonts w:cs="Arial"/>
               <w:szCs w:val="16"/>
             </w:rPr>
-            <w:t xml:space="preserve">Version: </w:t>
+            <w:t>Version:</w:t>
+          </w:r>
+          <w:proofErr w:type="gramEnd"/>
+          <w:r>
+            <w:rPr>
+              <w:rFonts w:cs="Arial"/>
+              <w:szCs w:val="16"/>
+            </w:rPr>
+            <w:t xml:space="preserve"> </w:t>
           </w:r>
           <w:fldSimple w:instr=" REVNUM   \* MERGEFORMAT ">
             <w:r>
@@ -5585,7 +5194,7 @@
                 <w:noProof/>
                 <w:szCs w:val="16"/>
               </w:rPr>
-              <w:t>1</w:t>
+              <w:t>4</w:t>
             </w:r>
           </w:fldSimple>
           <w:r>
@@ -5622,7 +5231,7 @@
               <w:noProof/>
               <w:szCs w:val="16"/>
             </w:rPr>
-            <w:t>00.00.0000 00:00</w:t>
+            <w:t>04.09.2026 16:21</w:t>
           </w:r>
           <w:r>
             <w:rPr>
@@ -5655,7 +5264,13 @@
                 <w:noProof/>
                 <w:szCs w:val="16"/>
               </w:rPr>
-              <w:t>Document2</w:t>
+              <w:t>I320-RapportProjet</w:t>
+            </w:r>
+            <w:r>
+              <w:rPr>
+                <w:noProof/>
+              </w:rPr>
+              <w:t>.docx</w:t>
             </w:r>
           </w:fldSimple>
         </w:p>
@@ -5834,7 +5449,7 @@
         <v:path o:extrusionok="f" gradientshapeok="t" o:connecttype="rect"/>
         <o:lock v:ext="edit" aspectratio="t"/>
       </v:shapetype>
-      <v:shape id="_x0000_i1025" type="#_x0000_t75" style="width:12pt;height:12pt" o:bullet="t">
+      <v:shape id="_x0000_i1025" type="#_x0000_t75" style="width:12.1pt;height:12.1pt" o:bullet="t">
         <v:imagedata r:id="rId1" o:title="BD10263_"/>
       </v:shape>
     </w:pict>
@@ -10142,7 +9757,6 @@
     <w:next w:val="Normal"/>
     <w:autoRedefine/>
     <w:uiPriority w:val="39"/>
-    <w:semiHidden/>
     <w:rsid w:val="00656974"/>
     <w:pPr>
       <w:spacing w:before="120" w:after="120"/>
@@ -10159,7 +9773,6 @@
     <w:next w:val="Normal"/>
     <w:autoRedefine/>
     <w:uiPriority w:val="39"/>
-    <w:semiHidden/>
     <w:rsid w:val="007F30AE"/>
     <w:pPr>
       <w:ind w:left="200"/>
@@ -10765,6 +10378,17 @@
 </file>
 
 <file path=customXml/item1.xml><?xml version="1.0" encoding="utf-8"?>
+<p:properties xmlns:p="http://schemas.microsoft.com/office/2006/metadata/properties" xmlns:xsi="http://www.w3.org/2001/XMLSchema-instance" xmlns:pc="http://schemas.microsoft.com/office/infopath/2007/PartnerControls">
+  <documentManagement>
+    <lcf76f155ced4ddcb4097134ff3c332f xmlns="a1b10758-7132-46a4-a2fe-7a2cf46f51f4">
+      <Terms xmlns="http://schemas.microsoft.com/office/infopath/2007/PartnerControls"/>
+    </lcf76f155ced4ddcb4097134ff3c332f>
+    <TaxCatchAll xmlns="f7d9f5a6-831d-4621-8c77-cbcaf993e406" xsi:nil="true"/>
+  </documentManagement>
+</p:properties>
+</file>
+
+<file path=customXml/item2.xml><?xml version="1.0" encoding="utf-8"?>
 <ct:contentTypeSchema xmlns:ct="http://schemas.microsoft.com/office/2006/metadata/contentType" xmlns:ma="http://schemas.microsoft.com/office/2006/metadata/properties/metaAttributes" ct:_="" ma:_="" ma:contentTypeName="Document" ma:contentTypeID="0x0101005A5B8F5EAAC22C48A11F5D9A60E6F21D" ma:contentTypeVersion="16" ma:contentTypeDescription="Crée un document." ma:contentTypeScope="" ma:versionID="f2b963976306cc54294b7f4545a3c6c4">
   <xsd:schema xmlns:xsd="http://www.w3.org/2001/XMLSchema" xmlns:xs="http://www.w3.org/2001/XMLSchema" xmlns:p="http://schemas.microsoft.com/office/2006/metadata/properties" xmlns:ns2="a1b10758-7132-46a4-a2fe-7a2cf46f51f4" xmlns:ns3="f7d9f5a6-831d-4621-8c77-cbcaf993e406" targetNamespace="http://schemas.microsoft.com/office/2006/metadata/properties" ma:root="true" ma:fieldsID="e5e135fa2fc1295e1586ddcd9c1a8904" ns2:_="" ns3:_="">
     <xsd:import namespace="a1b10758-7132-46a4-a2fe-7a2cf46f51f4"/>
@@ -11007,22 +10631,7 @@
 </ct:contentTypeSchema>
 </file>
 
-<file path=customXml/item2.xml><?xml version="1.0" encoding="utf-8"?>
-<p:properties xmlns:p="http://schemas.microsoft.com/office/2006/metadata/properties" xmlns:xsi="http://www.w3.org/2001/XMLSchema-instance" xmlns:pc="http://schemas.microsoft.com/office/infopath/2007/PartnerControls">
-  <documentManagement>
-    <lcf76f155ced4ddcb4097134ff3c332f xmlns="a1b10758-7132-46a4-a2fe-7a2cf46f51f4">
-      <Terms xmlns="http://schemas.microsoft.com/office/infopath/2007/PartnerControls"/>
-    </lcf76f155ced4ddcb4097134ff3c332f>
-    <TaxCatchAll xmlns="f7d9f5a6-831d-4621-8c77-cbcaf993e406" xsi:nil="true"/>
-  </documentManagement>
-</p:properties>
-</file>
-
 <file path=customXml/item3.xml><?xml version="1.0" encoding="utf-8"?>
-<b:Sources xmlns:b="http://schemas.openxmlformats.org/officeDocument/2006/bibliography" xmlns="http://schemas.openxmlformats.org/officeDocument/2006/bibliography" SelectedStyle="\APA.XSL" StyleName="APA"/>
-</file>
-
-<file path=customXml/item4.xml><?xml version="1.0" encoding="utf-8"?>
 <?mso-contentType ?>
 <FormTemplates xmlns="http://schemas.microsoft.com/sharepoint/v3/contenttype/forms">
   <Display>DocumentLibraryForm</Display>
@@ -11031,7 +10640,22 @@
 </FormTemplates>
 </file>
 
+<file path=customXml/item4.xml><?xml version="1.0" encoding="utf-8"?>
+<b:Sources xmlns:b="http://schemas.openxmlformats.org/officeDocument/2006/bibliography" xmlns="http://schemas.openxmlformats.org/officeDocument/2006/bibliography" SelectedStyle="\APA.XSL" StyleName="APA"/>
+</file>
+
 <file path=customXml/itemProps1.xml><?xml version="1.0" encoding="utf-8"?>
+<ds:datastoreItem xmlns:ds="http://schemas.openxmlformats.org/officeDocument/2006/customXml" ds:itemID="{2319CDB8-A2CD-412D-8359-13E6B4DF1FF4}">
+  <ds:schemaRefs>
+    <ds:schemaRef ds:uri="http://schemas.microsoft.com/office/2006/metadata/properties"/>
+    <ds:schemaRef ds:uri="http://schemas.microsoft.com/office/infopath/2007/PartnerControls"/>
+    <ds:schemaRef ds:uri="a1b10758-7132-46a4-a2fe-7a2cf46f51f4"/>
+    <ds:schemaRef ds:uri="f7d9f5a6-831d-4621-8c77-cbcaf993e406"/>
+  </ds:schemaRefs>
+</ds:datastoreItem>
+</file>
+
+<file path=customXml/itemProps2.xml><?xml version="1.0" encoding="utf-8"?>
 <ds:datastoreItem xmlns:ds="http://schemas.openxmlformats.org/officeDocument/2006/customXml" ds:itemID="{41546E4A-837A-4BEF-A4B8-FFD4EAB4E855}">
   <ds:schemaRefs>
     <ds:schemaRef ds:uri="http://schemas.microsoft.com/office/2006/metadata/contentType"/>
@@ -11050,29 +10674,18 @@
 </ds:datastoreItem>
 </file>
 
-<file path=customXml/itemProps2.xml><?xml version="1.0" encoding="utf-8"?>
-<ds:datastoreItem xmlns:ds="http://schemas.openxmlformats.org/officeDocument/2006/customXml" ds:itemID="{2319CDB8-A2CD-412D-8359-13E6B4DF1FF4}">
+<file path=customXml/itemProps3.xml><?xml version="1.0" encoding="utf-8"?>
+<ds:datastoreItem xmlns:ds="http://schemas.openxmlformats.org/officeDocument/2006/customXml" ds:itemID="{6C3F7A66-EDE3-46FD-83EB-3C265E5D2669}">
   <ds:schemaRefs>
-    <ds:schemaRef ds:uri="http://schemas.microsoft.com/office/2006/metadata/properties"/>
-    <ds:schemaRef ds:uri="http://schemas.microsoft.com/office/infopath/2007/PartnerControls"/>
-    <ds:schemaRef ds:uri="a1b10758-7132-46a4-a2fe-7a2cf46f51f4"/>
-    <ds:schemaRef ds:uri="f7d9f5a6-831d-4621-8c77-cbcaf993e406"/>
+    <ds:schemaRef ds:uri="http://schemas.microsoft.com/sharepoint/v3/contenttype/forms"/>
   </ds:schemaRefs>
 </ds:datastoreItem>
 </file>
 
-<file path=customXml/itemProps3.xml><?xml version="1.0" encoding="utf-8"?>
+<file path=customXml/itemProps4.xml><?xml version="1.0" encoding="utf-8"?>
 <ds:datastoreItem xmlns:ds="http://schemas.openxmlformats.org/officeDocument/2006/customXml" ds:itemID="{C8C35155-3E6A-4058-B6E4-303717845E3B}">
   <ds:schemaRefs>
     <ds:schemaRef ds:uri="http://schemas.openxmlformats.org/officeDocument/2006/bibliography"/>
   </ds:schemaRefs>
 </ds:datastoreItem>
-</file>
-
-<file path=customXml/itemProps4.xml><?xml version="1.0" encoding="utf-8"?>
-<ds:datastoreItem xmlns:ds="http://schemas.openxmlformats.org/officeDocument/2006/customXml" ds:itemID="{6C3F7A66-EDE3-46FD-83EB-3C265E5D2669}">
-  <ds:schemaRefs>
-    <ds:schemaRef ds:uri="http://schemas.microsoft.com/sharepoint/v3/contenttype/forms"/>
-  </ds:schemaRefs>
-</ds:datastoreItem>
 </file>
</xml_diff>